<commit_message>
docs: update full cloud architecture report with clean municipal dashboard view
</commit_message>
<xml_diff>
--- a/RoadSense_Cloud_Architecture_Report.docx
+++ b/RoadSense_Cloud_Architecture_Report.docx
@@ -3535,7 +3535,7 @@
       <w:r>
         <w:drawing>
           <wp:inline xmlns:a="http://schemas.openxmlformats.org/drawingml/2006/main" xmlns:pic="http://schemas.openxmlformats.org/drawingml/2006/picture">
-            <wp:extent cx="5943600" cy="18031724"/>
+            <wp:extent cx="5943600" cy="3343275"/>
             <wp:docPr id="3" name="Picture 3"/>
             <wp:cNvGraphicFramePr>
               <a:graphicFrameLocks noChangeAspect="1"/>
@@ -3556,7 +3556,7 @@
                   <pic:spPr>
                     <a:xfrm>
                       <a:off x="0" y="0"/>
-                      <a:ext cx="5943600" cy="18031724"/>
+                      <a:ext cx="5943600" cy="3343275"/>
                     </a:xfrm>
                     <a:prstGeom prst="rect"/>
                   </pic:spPr>

</xml_diff>

<commit_message>
feat(report & cloud): add aws evidence placeholders, full source listings, fix cloudwatch dashboard and refine dynamic computer vision detection
</commit_message>
<xml_diff>
--- a/RoadSense_Cloud_Architecture_Report.docx
+++ b/RoadSense_Cloud_Architecture_Report.docx
@@ -725,7 +725,7 @@
                 <w:color w:val="1E293B"/>
                 <w:sz w:val="18"/>
               </w:rPr>
-              <w:t>roadsense-prod-hazard-queue (Decoupled Buffering &amp; Throttling)</w:t>
+              <w:t>roadsense-prod-hazard-processing-queue (Decoupled Buffering &amp; Throttling)</w:t>
             </w:r>
           </w:p>
         </w:tc>
@@ -888,6 +888,114 @@
                 <w:sz w:val="18"/>
               </w:rPr>
               <w:t>RoadSenseHazardWorker (Python 3.11 Runtime, Event Source Mapping)</w:t>
+            </w:r>
+          </w:p>
+        </w:tc>
+      </w:tr>
+      <w:tr>
+        <w:tc>
+          <w:tcPr>
+            <w:tcW w:type="dxa" w:w="3600"/>
+            <w:shd w:fill="F8FAFC"/>
+            <w:tcMar>
+              <w:top w:w="100" w:type="dxa"/>
+              <w:bottom w:w="100" w:type="dxa"/>
+              <w:left w:w="140" w:type="dxa"/>
+              <w:right w:w="140" w:type="dxa"/>
+            </w:tcMar>
+          </w:tcPr>
+          <w:p>
+            <w:pPr>
+              <w:spacing w:before="0" w:after="0"/>
+              <w:jc w:val="left"/>
+            </w:pPr>
+            <w:r>
+              <w:rPr>
+                <w:rFonts w:ascii="Calibri" w:hAnsi="Calibri"/>
+                <w:color w:val="1E293B"/>
+                <w:sz w:val="18"/>
+              </w:rPr>
+              <w:t>AWS SSM Parameter Store</w:t>
+            </w:r>
+          </w:p>
+        </w:tc>
+        <w:tc>
+          <w:tcPr>
+            <w:tcW w:type="dxa" w:w="5760"/>
+            <w:shd w:fill="F8FAFC"/>
+            <w:tcMar>
+              <w:top w:w="100" w:type="dxa"/>
+              <w:bottom w:w="100" w:type="dxa"/>
+              <w:left w:w="140" w:type="dxa"/>
+              <w:right w:w="140" w:type="dxa"/>
+            </w:tcMar>
+          </w:tcPr>
+          <w:p>
+            <w:pPr>
+              <w:spacing w:before="0" w:after="0"/>
+              <w:jc w:val="left"/>
+            </w:pPr>
+            <w:r>
+              <w:rPr>
+                <w:rFonts w:ascii="Calibri" w:hAnsi="Calibri"/>
+                <w:color w:val="1E293B"/>
+                <w:sz w:val="18"/>
+              </w:rPr>
+              <w:t>/roadsense/prod/* (Secure Configuration &amp; Secrets Management)</w:t>
+            </w:r>
+          </w:p>
+        </w:tc>
+      </w:tr>
+      <w:tr>
+        <w:tc>
+          <w:tcPr>
+            <w:tcW w:type="dxa" w:w="3600"/>
+            <w:shd w:fill="FFFFFF"/>
+            <w:tcMar>
+              <w:top w:w="100" w:type="dxa"/>
+              <w:bottom w:w="100" w:type="dxa"/>
+              <w:left w:w="140" w:type="dxa"/>
+              <w:right w:w="140" w:type="dxa"/>
+            </w:tcMar>
+          </w:tcPr>
+          <w:p>
+            <w:pPr>
+              <w:spacing w:before="0" w:after="0"/>
+              <w:jc w:val="left"/>
+            </w:pPr>
+            <w:r>
+              <w:rPr>
+                <w:rFonts w:ascii="Calibri" w:hAnsi="Calibri"/>
+                <w:color w:val="1E293B"/>
+                <w:sz w:val="18"/>
+              </w:rPr>
+              <w:t>AWS CloudWatch Dashboard</w:t>
+            </w:r>
+          </w:p>
+        </w:tc>
+        <w:tc>
+          <w:tcPr>
+            <w:tcW w:type="dxa" w:w="5760"/>
+            <w:shd w:fill="FFFFFF"/>
+            <w:tcMar>
+              <w:top w:w="100" w:type="dxa"/>
+              <w:bottom w:w="100" w:type="dxa"/>
+              <w:left w:w="140" w:type="dxa"/>
+              <w:right w:w="140" w:type="dxa"/>
+            </w:tcMar>
+          </w:tcPr>
+          <w:p>
+            <w:pPr>
+              <w:spacing w:before="0" w:after="0"/>
+              <w:jc w:val="left"/>
+            </w:pPr>
+            <w:r>
+              <w:rPr>
+                <w:rFonts w:ascii="Calibri" w:hAnsi="Calibri"/>
+                <w:color w:val="1E293B"/>
+                <w:sz w:val="18"/>
+              </w:rPr>
+              <w:t>RoadSense-Production-Dashboard (EC2, SQS, SNS, Metrics)</w:t>
             </w:r>
           </w:p>
         </w:tc>
@@ -1229,7 +1337,7 @@
           <w:color w:val="334155"/>
           <w:sz w:val="20"/>
         </w:rPr>
-        <w:t>The device executes an optimized YOLOv8 deep learning model locally or submits a lightweight multipart payload to the cloud model runner. Normalized bounding boxes [ymin, xmin, ymax, xmax], defect classifications (Pothole, Damaged Road, Waterlogging, Broken Streetlight), and confidence ratings are generated.</w:t>
+        <w:t>The device executes an optimized YOLOv8 deep learning model locally or submits a lightweight multipart payload to the cloud model runner. Normalized bounding boxes [ymin, xmin, ymax, xmax], defect classifications (Pothole, Damaged Road, Waterlogging, Broken Streetlight), and confidence ratings are generated dynamically based on visual chromaticity, dark cavity depressions, and texture gradients.</w:t>
       </w:r>
     </w:p>
     <w:p>
@@ -1252,7 +1360,7 @@
           <w:color w:val="334155"/>
           <w:sz w:val="20"/>
         </w:rPr>
-        <w:t>The Flask ingestion layer on EC2 receives the report. To prevent client latency bottlenecks, the server performs asynchronous decoupling: it immediately dispatches the hazard event into Amazon SQS (roadsense-prod-hazard-queue) and returns an HTTP 202 Accepted response with a tracking identifier within 45 milliseconds.</w:t>
+        <w:t>The Flask ingestion layer on EC2 receives the report. To prevent client latency bottlenecks, the server performs asynchronous decoupling: it immediately dispatches the hazard event into Amazon SQS (roadsense-prod-hazard-processing-queue) and returns an HTTP 202 Accepted response with a tracking identifier within 45 milliseconds.</w:t>
       </w:r>
     </w:p>
     <w:p>
@@ -1389,7 +1497,6 @@
         <w:rPr>
           <w:rFonts w:ascii="Calibri" w:hAnsi="Calibri"/>
           <w:i/>
-          <w:color w:val="64748B"/>
           <w:sz w:val="17"/>
         </w:rPr>
         <w:t>Figure 2.1: RoadSense End-to-End Data Flow Sequence and Decoupled Serverless Lifecycle.</w:t>
@@ -1473,7 +1580,6 @@
         <w:rPr>
           <w:rFonts w:ascii="Calibri" w:hAnsi="Calibri"/>
           <w:i/>
-          <w:color w:val="64748B"/>
           <w:sz w:val="17"/>
         </w:rPr>
         <w:t>Figure 3.1: RoadSense Cloud Infrastructure Topology across AWS us-east-1.</w:t>
@@ -1770,7 +1876,7 @@
           <w:color w:val="334155"/>
           <w:sz w:val="20"/>
         </w:rPr>
-        <w:t>roadsense-prod-hazard-queue (ARN: arn:aws:sqs:us-east-1:464817648755:roadsense-prod-hazard-queue).</w:t>
+        <w:t>roadsense-prod-hazard-processing-queue (ARN: arn:aws:sqs:us-east-1:464817648755:roadsense-prod-hazard-processing-queue).</w:t>
       </w:r>
     </w:p>
     <w:p>
@@ -2062,6 +2168,45 @@
           <w:sz w:val="20"/>
         </w:rPr>
         <w:t>Managed PostgreSQL 16 engine configured with PostGIS spatial extensions. Handles transactional ACID operations, spatial geospatial indexing (ST_DWithin), and automated daily snapshots with point-in-time recovery.</w:t>
+      </w:r>
+    </w:p>
+    <w:p>
+      <w:pPr>
+        <w:pStyle w:val="Heading2"/>
+        <w:keepNext/>
+        <w:spacing w:before="240" w:after="80"/>
+      </w:pPr>
+      <w:r>
+        <w:rPr>
+          <w:rFonts w:ascii="Calibri" w:hAnsi="Calibri"/>
+          <w:b/>
+          <w:color w:val="6D28D9"/>
+          <w:sz w:val="27"/>
+        </w:rPr>
+        <w:t>3.7 AWS Systems Manager (SSM) Parameter Store &amp; Zero-Hardcoding Security</w:t>
+      </w:r>
+    </w:p>
+    <w:p>
+      <w:pPr>
+        <w:pStyle w:val="ListBullet"/>
+        <w:spacing w:before="0" w:after="60" w:line="276" w:lineRule="auto"/>
+      </w:pPr>
+      <w:r>
+        <w:rPr>
+          <w:rFonts w:ascii="Calibri" w:hAnsi="Calibri"/>
+          <w:b/>
+          <w:color w:val="0F172A"/>
+          <w:sz w:val="20"/>
+        </w:rPr>
+        <w:t xml:space="preserve">Secrets Governance: </w:t>
+      </w:r>
+      <w:r>
+        <w:rPr>
+          <w:rFonts w:ascii="Calibri" w:hAnsi="Calibri"/>
+          <w:color w:val="334155"/>
+          <w:sz w:val="20"/>
+        </w:rPr>
+        <w:t>Path: /roadsense/prod/*. All application secrets (database credentials, API keys, JWT secret keys, S3 bucket names, SQS URLs) are centralized in AWS SSM Parameter Store with SecureString KMS encryption.</w:t>
       </w:r>
     </w:p>
     <w:p>
@@ -3037,35 +3182,6 @@
       </w:r>
     </w:p>
     <w:p>
-      <w:pPr>
-        <w:pStyle w:val="Heading2"/>
-        <w:keepNext/>
-        <w:spacing w:before="240" w:after="80"/>
-      </w:pPr>
-      <w:r>
-        <w:rPr>
-          <w:rFonts w:ascii="Calibri" w:hAnsi="Calibri"/>
-          <w:b/>
-          <w:color w:val="6D28D9"/>
-          <w:sz w:val="27"/>
-        </w:rPr>
-        <w:t>5.4 Real-Time AWS Cloud Telemetry Card</w:t>
-      </w:r>
-    </w:p>
-    <w:p>
-      <w:pPr>
-        <w:spacing w:before="0" w:after="120" w:line="276" w:lineRule="auto"/>
-      </w:pPr>
-      <w:r>
-        <w:rPr>
-          <w:rFonts w:ascii="Calibri" w:hAnsi="Calibri"/>
-          <w:color w:val="334155"/>
-          <w:sz w:val="21"/>
-        </w:rPr>
-        <w:t>The admin portal features an executive telemetry bar providing real-time visibility into AWS infrastructure: Amazon SQS queue depth and in-flight messages, Dead-Letter Queue health, AWS Lambda execution triggers, S3 storage encryption class, and Amazon SNS fan-out status.</w:t>
-      </w:r>
-    </w:p>
-    <w:p>
       <w:r>
         <w:br w:type="page"/>
       </w:r>
@@ -3096,7 +3212,7 @@
           <w:color w:val="334155"/>
           <w:sz w:val="21"/>
         </w:rPr>
-        <w:t>Below are annotated listings of the production cloud and serverless components engineered for the RoadSense platform:</w:t>
+        <w:t>Below are annotated complete source listings of the production cloud, serverless, and computer vision components engineered for the RoadSense platform:</w:t>
       </w:r>
     </w:p>
     <w:p>
@@ -3113,6 +3229,19 @@
           <w:sz w:val="27"/>
         </w:rPr>
         <w:t>6.1 AWS Lambda Serverless Worker (lib/backend/aws_lambda_worker.py)</w:t>
+      </w:r>
+    </w:p>
+    <w:p>
+      <w:pPr>
+        <w:spacing w:before="0" w:after="120" w:line="276" w:lineRule="auto"/>
+      </w:pPr>
+      <w:r>
+        <w:rPr>
+          <w:rFonts w:ascii="Calibri" w:hAnsi="Calibri"/>
+          <w:color w:val="334155"/>
+          <w:sz w:val="21"/>
+        </w:rPr>
+        <w:t>Executes asynchronously upon Amazon SQS triggers. Performs batch ingestion, automated municipal department triage, statutory SLA calculation, and partial batch failure reporting:</w:t>
       </w:r>
     </w:p>
     <w:p>
@@ -3166,75 +3295,222 @@
                 <w:color w:val="1E293B"/>
                 <w:sz w:val="17"/>
               </w:rPr>
-              <w:t>import json, boto3, os, datetime</w:t>
-              <w:br/>
-              <w:t>s3_client = boto3.client('s3', region_name='us-east-1')</w:t>
-              <w:br/>
-              <w:t>sns_client = boto3.client('sns', region_name='us-east-1')</w:t>
-              <w:br/>
+              <w:t>import json</w:t>
+              <w:br/>
+              <w:t>import logging</w:t>
+              <w:br/>
+              <w:t>import os</w:t>
+              <w:br/>
+              <w:t>import math</w:t>
+              <w:br/>
+              <w:t>from datetime import datetime, timedelta</w:t>
+              <w:br/>
+              <w:br/>
+              <w:t>logger = logging.getLogger()</w:t>
+              <w:br/>
+              <w:t>logger.setLevel(logging.INFO)</w:t>
+              <w:br/>
+              <w:br/>
+              <w:t># Municipal Department Routing Map based on Smart City Civic Standards</w:t>
               <w:br/>
               <w:t>DEPARTMENT_ROUTING = {</w:t>
               <w:br/>
-              <w:t xml:space="preserve">    'potholes': 'Roads &amp; Bridges',</w:t>
-              <w:br/>
-              <w:t xml:space="preserve">    'damaged road': 'Roads &amp; Bridges',</w:t>
-              <w:br/>
-              <w:t xml:space="preserve">    'cracks': 'Roads &amp; Bridges',</w:t>
-              <w:br/>
-              <w:t xml:space="preserve">    'waterlogging': 'Stormwater Drainage',</w:t>
-              <w:br/>
-              <w:t xml:space="preserve">    'broken streetlight': 'Electrical Bureau'</w:t>
+              <w:t xml:space="preserve">    "Potholes": {</w:t>
+              <w:br/>
+              <w:t xml:space="preserve">        "department": "Public Works: Roads &amp; Bridges Division",</w:t>
+              <w:br/>
+              <w:t xml:space="preserve">        "team_code": "PWR-RD-01",</w:t>
+              <w:br/>
+              <w:t xml:space="preserve">        "sla_hours": {"critical": 24, "medium": 48, "low": 72},</w:t>
+              <w:br/>
+              <w:t xml:space="preserve">        "equipment": "Cold-mix Asphalt Dispenser, Vibratory Roller"</w:t>
+              <w:br/>
+              <w:t xml:space="preserve">    },</w:t>
+              <w:br/>
+              <w:t xml:space="preserve">    "Damaged Road": {</w:t>
+              <w:br/>
+              <w:t xml:space="preserve">        "department": "Highways &amp; Surface Infrastructure Maintenance",</w:t>
+              <w:br/>
+              <w:t xml:space="preserve">        "team_code": "HSIM-SURF-02",</w:t>
+              <w:br/>
+              <w:t xml:space="preserve">        "sla_hours": {"critical": 36, "medium": 72, "low": 96},</w:t>
+              <w:br/>
+              <w:t xml:space="preserve">        "equipment": "Milling Machine, Asphalt Paver"</w:t>
+              <w:br/>
+              <w:t xml:space="preserve">    },</w:t>
+              <w:br/>
+              <w:t xml:space="preserve">    "Waterlogging": {</w:t>
+              <w:br/>
+              <w:t xml:space="preserve">        "department": "Stormwater Drainage &amp; Flood Mitigation Authority",</w:t>
+              <w:br/>
+              <w:t xml:space="preserve">        "team_code": "SDFM-DRN-03",</w:t>
+              <w:br/>
+              <w:t xml:space="preserve">        "sla_hours": {"critical": 12, "medium": 24, "low": 48},</w:t>
+              <w:br/>
+              <w:t xml:space="preserve">        "equipment": "High-capacity Dewatering Suction Pump, Jetting Unit"</w:t>
+              <w:br/>
+              <w:t xml:space="preserve">    },</w:t>
+              <w:br/>
+              <w:t xml:space="preserve">    "Broken Streetlight": {</w:t>
+              <w:br/>
+              <w:t xml:space="preserve">        "department": "Municipal Electrical Infrastructure &amp; Lighting Bureau",</w:t>
+              <w:br/>
+              <w:t xml:space="preserve">        "team_code": "MEIL-ELEC-04",</w:t>
+              <w:br/>
+              <w:t xml:space="preserve">        "sla_hours": {"critical": 24, "medium": 48, "low": 72},</w:t>
+              <w:br/>
+              <w:t xml:space="preserve">        "equipment": "Aerial Hydraulic Lift Truck, LED Luminaire Stock"</w:t>
+              <w:br/>
+              <w:t xml:space="preserve">    },</w:t>
+              <w:br/>
+              <w:t xml:space="preserve">    "Garbage": {</w:t>
+              <w:br/>
+              <w:t xml:space="preserve">        "department": "Solid Waste Management &amp; Urban Sanitation Board",</w:t>
+              <w:br/>
+              <w:t xml:space="preserve">        "team_code": "SWMS-SAN-05",</w:t>
+              <w:br/>
+              <w:t xml:space="preserve">        "sla_hours": {"critical": 18, "medium": 36, "low": 48},</w:t>
+              <w:br/>
+              <w:t xml:space="preserve">        "equipment": "Hydraulic Compactor Truck, Heavy Sanitation Crew"</w:t>
+              <w:br/>
+              <w:t xml:space="preserve">    }</w:t>
               <w:br/>
               <w:t>}</w:t>
               <w:br/>
               <w:br/>
+              <w:t>def haversine_distance_meters(lat1, lon1, lat2, lon2):</w:t>
+              <w:br/>
+              <w:t xml:space="preserve">    R = 6371000  # Earth radius in meters</w:t>
+              <w:br/>
+              <w:t xml:space="preserve">    phi1, phi2 = math.radians(lat1), math.radians(lat2)</w:t>
+              <w:br/>
+              <w:t xml:space="preserve">    delta_phi = math.radians(lat2 - lat1)</w:t>
+              <w:br/>
+              <w:t xml:space="preserve">    delta_lambda = math.radians(lon2 - lon1)</w:t>
+              <w:br/>
+              <w:t xml:space="preserve">    a = math.sin(delta_phi / 2.0)**2 + math.cos(phi1)*math.cos(phi2)*math.sin(delta_lambda / 2.0)**2</w:t>
+              <w:br/>
+              <w:t xml:space="preserve">    return R * 2.0 * math.atan2(math.sqrt(a), math.sqrt(1.0 - a))</w:t>
+              <w:br/>
+              <w:br/>
+              <w:t>def process_hazard_record(payload):</w:t>
+              <w:br/>
+              <w:t xml:space="preserve">    report_id = payload.get("report_id") or payload.get("id")</w:t>
+              <w:br/>
+              <w:t xml:space="preserve">    label = payload.get("label", "Potholes")</w:t>
+              <w:br/>
+              <w:t xml:space="preserve">    severity = (payload.get("severity") or "medium").lower()</w:t>
+              <w:br/>
+              <w:t xml:space="preserve">    location = payload.get("location", {})</w:t>
+              <w:br/>
+              <w:t xml:space="preserve">    lat = float(location.get("lat", 27.6194))</w:t>
+              <w:br/>
+              <w:t xml:space="preserve">    lng = float(location.get("lng", 85.5388))</w:t>
+              <w:br/>
+              <w:t xml:space="preserve">    image_url = payload.get("image_url", "")</w:t>
+              <w:br/>
+              <w:t xml:space="preserve">    reporter = payload.get("username", "citizen")</w:t>
+              <w:br/>
+              <w:t xml:space="preserve">    </w:t>
+              <w:br/>
+              <w:t xml:space="preserve">    dept_info = DEPARTMENT_ROUTING.get(label, DEPARTMENT_ROUTING["Potholes"])</w:t>
+              <w:br/>
+              <w:t xml:space="preserve">    sla_hours = dept_info["sla_hours"].get(severity, 48)</w:t>
+              <w:br/>
+              <w:t xml:space="preserve">    now = datetime.utcnow()</w:t>
+              <w:br/>
+              <w:t xml:space="preserve">    sla_target = now + timedelta(hours=sla_hours)</w:t>
+              <w:br/>
+              <w:t xml:space="preserve">    </w:t>
+              <w:br/>
+              <w:t xml:space="preserve">    dispatch_order = {</w:t>
+              <w:br/>
+              <w:t xml:space="preserve">        "work_order_id": f"WO-{label[:3].upper()}-{report_id}-{now.strftime('%Y%m%d%H%M')}",</w:t>
+              <w:br/>
+              <w:t xml:space="preserve">        "report_id": report_id,</w:t>
+              <w:br/>
+              <w:t xml:space="preserve">        "hazard_category": label,</w:t>
+              <w:br/>
+              <w:t xml:space="preserve">        "severity_level": severity.upper(),</w:t>
+              <w:br/>
+              <w:t xml:space="preserve">        "assigned_department": dept_info["department"],</w:t>
+              <w:br/>
+              <w:t xml:space="preserve">        "assigned_unit": dept_info["team_code"],</w:t>
+              <w:br/>
+              <w:t xml:space="preserve">        "required_equipment": dept_info["equipment"],</w:t>
+              <w:br/>
+              <w:t xml:space="preserve">        "sla_resolution_hours": sla_hours,</w:t>
+              <w:br/>
+              <w:t xml:space="preserve">        "sla_target_utc": sla_target.isoformat(),</w:t>
+              <w:br/>
+              <w:t xml:space="preserve">        "geo_coordinates": {"lat": lat, "lng": lng},</w:t>
+              <w:br/>
+              <w:t xml:space="preserve">        "evidence_image": image_url,</w:t>
+              <w:br/>
+              <w:t xml:space="preserve">        "reporter": reporter,</w:t>
+              <w:br/>
+              <w:t xml:space="preserve">        "processed_at": now.isoformat(),</w:t>
+              <w:br/>
+              <w:t xml:space="preserve">        "status": "DISPATCH_AUTHORIZED"</w:t>
+              <w:br/>
+              <w:t xml:space="preserve">    }</w:t>
+              <w:br/>
+              <w:t xml:space="preserve">    logger.info(f"[DISPATCH GENERATED] {dispatch_order['work_order_id']} assigned to {dept_info['department']}")</w:t>
+              <w:br/>
+              <w:t xml:space="preserve">    return dispatch_order</w:t>
+              <w:br/>
+              <w:br/>
               <w:t>def lambda_handler(event, context):</w:t>
               <w:br/>
-              <w:t xml:space="preserve">    batch_item_failures = []</w:t>
-              <w:br/>
-              <w:t xml:space="preserve">    for record in event.get('Records', []):</w:t>
-              <w:br/>
-              <w:t xml:space="preserve">        msg_id = record.get('messageId')</w:t>
+              <w:t xml:space="preserve">    records = event.get("Records", [])</w:t>
+              <w:br/>
+              <w:t xml:space="preserve">    logger.info(f"RoadSense SQS Worker invoked with {len(records)} message record(s).")</w:t>
+              <w:br/>
+              <w:t xml:space="preserve">    processed_orders = []</w:t>
+              <w:br/>
+              <w:t xml:space="preserve">    failed_message_ids = []</w:t>
+              <w:br/>
+              <w:t xml:space="preserve">    </w:t>
+              <w:br/>
+              <w:t xml:space="preserve">    for record in records:</w:t>
+              <w:br/>
+              <w:t xml:space="preserve">        message_id = record.get("messageId", "unknown")</w:t>
               <w:br/>
               <w:t xml:space="preserve">        try:</w:t>
               <w:br/>
-              <w:t xml:space="preserve">            body = json.loads(record.get('body', '{}'))</w:t>
-              <w:br/>
-              <w:t xml:space="preserve">            label = body.get('label', 'potholes').lower()</w:t>
-              <w:br/>
-              <w:t xml:space="preserve">            severity = body.get('severity', 'medium').lower()</w:t>
+              <w:t xml:space="preserve">            body_str = record.get("body", "{}")</w:t>
+              <w:br/>
+              <w:t xml:space="preserve">            body = json.loads(body_str)</w:t>
+              <w:br/>
+              <w:t xml:space="preserve">            if "Message" in body and isinstance(body["Message"], str):</w:t>
+              <w:br/>
+              <w:t xml:space="preserve">                try: body = json.loads(body["Message"])</w:t>
+              <w:br/>
+              <w:t xml:space="preserve">                except Exception: pass</w:t>
+              <w:br/>
+              <w:t xml:space="preserve">            order = process_hazard_record(body)</w:t>
+              <w:br/>
+              <w:t xml:space="preserve">            processed_orders.append(order)</w:t>
+              <w:br/>
+              <w:t xml:space="preserve">        except Exception as err:</w:t>
+              <w:br/>
+              <w:t xml:space="preserve">            logger.error(f"Failed processing SQS message {message_id}: {err}")</w:t>
+              <w:br/>
+              <w:t xml:space="preserve">            failed_message_ids.append({"itemIdentifier": message_id})</w:t>
               <w:br/>
               <w:t xml:space="preserve">            </w:t>
               <w:br/>
-              <w:t xml:space="preserve">            # Autonomous municipal department triage</w:t>
-              <w:br/>
-              <w:t xml:space="preserve">            dept = DEPARTMENT_ROUTING.get(label, 'Roads &amp; Bridges')</w:t>
-              <w:br/>
-              <w:t xml:space="preserve">            sla_hours = 24 if severity == 'critical' else 48 if severity == 'medium' else 72</w:t>
-              <w:br/>
-              <w:t xml:space="preserve">            </w:t>
-              <w:br/>
-              <w:t xml:space="preserve">            # Fan-out emergency alert via Amazon SNS</w:t>
-              <w:br/>
-              <w:t xml:space="preserve">            if severity == 'critical':</w:t>
-              <w:br/>
-              <w:t xml:space="preserve">                sns_client.publish(</w:t>
-              <w:br/>
-              <w:t xml:space="preserve">                    TopicArn='arn:aws:sns:us-east-1:464817648755:roadsense-prod-critical-alerts',</w:t>
-              <w:br/>
-              <w:t xml:space="preserve">                    Subject=f"EMERGENCY CIVIC HAZARD: {label.upper()}",</w:t>
-              <w:br/>
-              <w:t xml:space="preserve">                    Message=f"Critical hazard detected at Lat: {body.get('latitude')}, Lng: {body.get('longitude')}. SLA: {sla_hours}h."</w:t>
-              <w:br/>
-              <w:t xml:space="preserve">                )</w:t>
-              <w:br/>
-              <w:t xml:space="preserve">        except Exception as e:</w:t>
-              <w:br/>
-              <w:t xml:space="preserve">            batch_item_failures.append({"itemIdentifier": msg_id})</w:t>
-              <w:br/>
-              <w:t xml:space="preserve">            </w:t>
-              <w:br/>
-              <w:t xml:space="preserve">    return {"batchItemFailures": batch_item_failures}</w:t>
+              <w:t xml:space="preserve">    return {</w:t>
+              <w:br/>
+              <w:t xml:space="preserve">        "statusCode": 200,</w:t>
+              <w:br/>
+              <w:t xml:space="preserve">        "batchItemFailures": failed_message_ids,</w:t>
+              <w:br/>
+              <w:t xml:space="preserve">        "processedCount": len(processed_orders),</w:t>
+              <w:br/>
+              <w:t xml:space="preserve">        "orders": processed_orders</w:t>
+              <w:br/>
+              <w:t xml:space="preserve">    }</w:t>
             </w:r>
           </w:p>
         </w:tc>
@@ -3254,7 +3530,689 @@
           <w:color w:val="6D28D9"/>
           <w:sz w:val="27"/>
         </w:rPr>
-        <w:t>6.2 Amazon SQS Resource-Based Access Policy (lib/backend/sqs_access_policy.json)</w:t>
+        <w:t>6.2 AWS Cloud Services Core Module (lib/backend/aws_service.py)</w:t>
+      </w:r>
+    </w:p>
+    <w:p>
+      <w:pPr>
+        <w:spacing w:before="0" w:after="120" w:line="276" w:lineRule="auto"/>
+      </w:pPr>
+      <w:r>
+        <w:rPr>
+          <w:rFonts w:ascii="Calibri" w:hAnsi="Calibri"/>
+          <w:color w:val="334155"/>
+          <w:sz w:val="21"/>
+        </w:rPr>
+        <w:t>Encapsulates Amazon S3 AES-256 upload, Amazon SQS asynchronous queuing, Amazon SNS emergency alert publishing, and AWS SSM Parameter Store dynamic secret retrieval:</w:t>
+      </w:r>
+    </w:p>
+    <w:p>
+      <w:pPr>
+        <w:spacing w:before="120" w:after="40"/>
+      </w:pPr>
+      <w:r>
+        <w:rPr>
+          <w:rFonts w:ascii="Consolas" w:hAnsi="Consolas"/>
+          <w:b/>
+          <w:color w:val="64748B"/>
+          <w:sz w:val="18"/>
+        </w:rPr>
+        <w:t>Source Listing: lib/backend/aws_service.py</w:t>
+      </w:r>
+    </w:p>
+    <w:tbl>
+      <w:tblPr>
+        <w:tblW w:type="auto" w:w="0"/>
+        <w:jc w:val="center"/>
+        <w:tblLook w:firstColumn="1" w:firstRow="1" w:lastColumn="0" w:lastRow="0" w:noHBand="0" w:noVBand="1" w:val="04A0"/>
+      </w:tblPr>
+      <w:tblGrid>
+        <w:gridCol w:w="9360"/>
+      </w:tblGrid>
+      <w:tr>
+        <w:tc>
+          <w:tcPr>
+            <w:tcW w:type="dxa" w:w="9360"/>
+            <w:shd w:fill="F8FAFC"/>
+            <w:tcMar>
+              <w:top w:w="140" w:type="dxa"/>
+              <w:bottom w:w="140" w:type="dxa"/>
+              <w:left w:w="180" w:type="dxa"/>
+              <w:right w:w="180" w:type="dxa"/>
+            </w:tcMar>
+            <w:tcBorders>
+              <w:left w:val="single" w:sz="18" w:space="0" w:color="CBD5E1"/>
+              <w:top w:val="single" w:sz="6" w:space="0" w:color="E2E8F0"/>
+              <w:right w:val="single" w:sz="6" w:space="0" w:color="E2E8F0"/>
+              <w:bottom w:val="single" w:sz="6" w:space="0" w:color="E2E8F0"/>
+            </w:tcBorders>
+          </w:tcPr>
+          <w:p>
+            <w:pPr>
+              <w:spacing w:before="0" w:after="0" w:line="276" w:lineRule="auto"/>
+            </w:pPr>
+            <w:r>
+              <w:rPr>
+                <w:rFonts w:ascii="Consolas" w:hAnsi="Consolas"/>
+                <w:color w:val="1E293B"/>
+                <w:sz w:val="17"/>
+              </w:rPr>
+              <w:t>import os, json, logging, uuid</w:t>
+              <w:br/>
+              <w:t>from datetime import datetime</w:t>
+              <w:br/>
+              <w:t>from io import BytesIO</w:t>
+              <w:br/>
+              <w:br/>
+              <w:t>logger = logging.getLogger("roadsense.aws")</w:t>
+              <w:br/>
+              <w:t>_s3_client = _sns_client = _sqs_client = _ssm_client = None</w:t>
+              <w:br/>
+              <w:br/>
+              <w:t>def get_aws_region():</w:t>
+              <w:br/>
+              <w:t xml:space="preserve">    return os.getenv("AWS_REGION", "us-east-1")</w:t>
+              <w:br/>
+              <w:br/>
+              <w:t>def get_s3_client():</w:t>
+              <w:br/>
+              <w:t xml:space="preserve">    global _s3_client</w:t>
+              <w:br/>
+              <w:t xml:space="preserve">    if _s3_client is None:</w:t>
+              <w:br/>
+              <w:t xml:space="preserve">        import boto3</w:t>
+              <w:br/>
+              <w:t xml:space="preserve">        _s3_client = boto3.client("s3", region_name=get_aws_region())</w:t>
+              <w:br/>
+              <w:t xml:space="preserve">    return _s3_client</w:t>
+              <w:br/>
+              <w:br/>
+              <w:t>def get_sns_client():</w:t>
+              <w:br/>
+              <w:t xml:space="preserve">    global _sns_client</w:t>
+              <w:br/>
+              <w:t xml:space="preserve">    if _sns_client is None:</w:t>
+              <w:br/>
+              <w:t xml:space="preserve">        import boto3</w:t>
+              <w:br/>
+              <w:t xml:space="preserve">        _sns_client = boto3.client("sns", region_name=get_aws_region())</w:t>
+              <w:br/>
+              <w:t xml:space="preserve">    return _sns_client</w:t>
+              <w:br/>
+              <w:br/>
+              <w:t>def get_sqs_client():</w:t>
+              <w:br/>
+              <w:t xml:space="preserve">    global _sqs_client</w:t>
+              <w:br/>
+              <w:t xml:space="preserve">    if _sqs_client is None:</w:t>
+              <w:br/>
+              <w:t xml:space="preserve">        import boto3</w:t>
+              <w:br/>
+              <w:t xml:space="preserve">        _sqs_client = boto3.client("sqs", region_name=get_aws_region())</w:t>
+              <w:br/>
+              <w:t xml:space="preserve">    return _sqs_client</w:t>
+              <w:br/>
+              <w:br/>
+              <w:t>def get_ssm_client():</w:t>
+              <w:br/>
+              <w:t xml:space="preserve">    global _ssm_client</w:t>
+              <w:br/>
+              <w:t xml:space="preserve">    if _ssm_client is None:</w:t>
+              <w:br/>
+              <w:t xml:space="preserve">        import boto3</w:t>
+              <w:br/>
+              <w:t xml:space="preserve">        _ssm_client = boto3.client("ssm", region_name=get_aws_region())</w:t>
+              <w:br/>
+              <w:t xml:space="preserve">    return _ssm_client</w:t>
+              <w:br/>
+              <w:br/>
+              <w:t>def load_config_from_ssm(app):</w:t>
+              <w:br/>
+              <w:t xml:space="preserve">    env = os.getenv("FLASK_ENV", "development").lower()</w:t>
+              <w:br/>
+              <w:t xml:space="preserve">    if os.getenv("RUNNING_IN_AWS", "false").lower() != "true" and env != "production":</w:t>
+              <w:br/>
+              <w:t xml:space="preserve">        return</w:t>
+              <w:br/>
+              <w:t xml:space="preserve">    ssm = get_ssm_client()</w:t>
+              <w:br/>
+              <w:t xml:space="preserve">    if not ssm: return</w:t>
+              <w:br/>
+              <w:t xml:space="preserve">    param_names = [</w:t>
+              <w:br/>
+              <w:t xml:space="preserve">        "/roadsense/db_host", "/roadsense/db_name", "/roadsense/db_user",</w:t>
+              <w:br/>
+              <w:t xml:space="preserve">        "/roadsense/db_password", "/roadsense/secret_key", "/roadsense/s3_bucket",</w:t>
+              <w:br/>
+              <w:t xml:space="preserve">        "/roadsense/sns_topic_arn", "/roadsense/sqs_queue_url"</w:t>
+              <w:br/>
+              <w:t xml:space="preserve">    ]</w:t>
+              <w:br/>
+              <w:t xml:space="preserve">    try:</w:t>
+              <w:br/>
+              <w:t xml:space="preserve">        response = ssm.get_parameters(Names=param_names, WithDecryption=True)</w:t>
+              <w:br/>
+              <w:t xml:space="preserve">        params = {p["Name"].split("/")[-1]: p["Value"] for p in response.get("Parameters", [])}</w:t>
+              <w:br/>
+              <w:t xml:space="preserve">        if "db_host" in params:</w:t>
+              <w:br/>
+              <w:t xml:space="preserve">            app.config["SQLALCHEMY_DATABASE_URI"] = (</w:t>
+              <w:br/>
+              <w:t xml:space="preserve">                f"postgresql://{params['db_user']}:{params['db_password']}@{params['db_host']}:5432/{params.get('db_name', 'roadsensedb')}"</w:t>
+              <w:br/>
+              <w:t xml:space="preserve">            )</w:t>
+              <w:br/>
+              <w:t xml:space="preserve">        if "s3_bucket" in params: os.environ["S3_BUCKET"] = params["s3_bucket"]</w:t>
+              <w:br/>
+              <w:t xml:space="preserve">        if "sns_topic_arn" in params: os.environ["SNS_TOPIC_ARN"] = params["sns_topic_arn"]</w:t>
+              <w:br/>
+              <w:t xml:space="preserve">        if "sqs_queue_url" in params: os.environ["SQS_QUEUE_URL"] = params["sqs_queue_url"]</w:t>
+              <w:br/>
+              <w:t xml:space="preserve">        logger.info("Successfully loaded AWS configuration from SSM Parameter Store.")</w:t>
+              <w:br/>
+              <w:t xml:space="preserve">    except Exception as e:</w:t>
+              <w:br/>
+              <w:t xml:space="preserve">        logger.error(f"Error loading parameters from AWS SSM: {e}")</w:t>
+              <w:br/>
+              <w:br/>
+              <w:t>def upload_image_to_s3(image_bytes, filename_prefix="hazards", content_type="image/jpeg"):</w:t>
+              <w:br/>
+              <w:t xml:space="preserve">    bucket_name = os.getenv("S3_BUCKET")</w:t>
+              <w:br/>
+              <w:t xml:space="preserve">    region = get_aws_region()</w:t>
+              <w:br/>
+              <w:t xml:space="preserve">    unique_filename = f"{filename_prefix}/{uuid.uuid4().hex}_{datetime.utcnow().strftime('%Y%m%d_%H%M%S')}.jpg"</w:t>
+              <w:br/>
+              <w:t xml:space="preserve">    s3 = get_s3_client()</w:t>
+              <w:br/>
+              <w:t xml:space="preserve">    if s3 and bucket_name:</w:t>
+              <w:br/>
+              <w:t xml:space="preserve">        try:</w:t>
+              <w:br/>
+              <w:t xml:space="preserve">            s3.put_object(</w:t>
+              <w:br/>
+              <w:t xml:space="preserve">                Bucket=bucket_name,</w:t>
+              <w:br/>
+              <w:t xml:space="preserve">                Key=unique_filename,</w:t>
+              <w:br/>
+              <w:t xml:space="preserve">                Body=image_bytes,</w:t>
+              <w:br/>
+              <w:t xml:space="preserve">                ContentType=content_type,</w:t>
+              <w:br/>
+              <w:t xml:space="preserve">                ServerSideEncryption="AES256"</w:t>
+              <w:br/>
+              <w:t xml:space="preserve">            )</w:t>
+              <w:br/>
+              <w:t xml:space="preserve">            return f"https://{bucket_name}.s3.{region}.amazonaws.com/{unique_filename}"</w:t>
+              <w:br/>
+              <w:t xml:space="preserve">        except Exception as e:</w:t>
+              <w:br/>
+              <w:t xml:space="preserve">            logger.error(f"Failed to upload to S3: {e}")</w:t>
+              <w:br/>
+              <w:t xml:space="preserve">    # Local fallback</w:t>
+              <w:br/>
+              <w:t xml:space="preserve">    upload_dir = os.path.join(os.path.dirname(__file__), "uploaded_images")</w:t>
+              <w:br/>
+              <w:t xml:space="preserve">    os.makedirs(upload_dir, exist_ok=True)</w:t>
+              <w:br/>
+              <w:t xml:space="preserve">    local_path = os.path.join(upload_dir, os.path.basename(unique_filename))</w:t>
+              <w:br/>
+              <w:t xml:space="preserve">    with open(local_path, "wb") as f: f.write(image_bytes)</w:t>
+              <w:br/>
+              <w:t xml:space="preserve">    return f"/uploaded_images/{os.path.basename(unique_filename)}"</w:t>
+              <w:br/>
+              <w:br/>
+              <w:t>def publish_critical_alert(report_id, label, severity, location, reporter, image_url=None):</w:t>
+              <w:br/>
+              <w:t xml:space="preserve">    topic_arn = os.getenv("SNS_TOPIC_ARN")</w:t>
+              <w:br/>
+              <w:t xml:space="preserve">    if not topic_arn: return False</w:t>
+              <w:br/>
+              <w:t xml:space="preserve">    sns = get_sns_client()</w:t>
+              <w:br/>
+              <w:t xml:space="preserve">    if not sns: return False</w:t>
+              <w:br/>
+              <w:t xml:space="preserve">    try:</w:t>
+              <w:br/>
+              <w:t xml:space="preserve">        msg = (</w:t>
+              <w:br/>
+              <w:t xml:space="preserve">            f"⚠️ ROADSENSE CRITICAL ROAD HAZARD ALERT ⚠️\n"</w:t>
+              <w:br/>
+              <w:t xml:space="preserve">            f"Report ID: #{report_id} | Category: {label}\n"</w:t>
+              <w:br/>
+              <w:t xml:space="preserve">            f"Location: Lat {location.get('lat')}, Lng {location.get('lng')}\n"</w:t>
+              <w:br/>
+              <w:t xml:space="preserve">            f"Reporter: {reporter}\nPhoto: {image_url or 'N/A'}"</w:t>
+              <w:br/>
+              <w:t xml:space="preserve">        )</w:t>
+              <w:br/>
+              <w:t xml:space="preserve">        sns.publish(TopicArn=topic_arn, Subject=f"[RoadSense Alert] {severity.upper()} {label} Reported", Message=msg)</w:t>
+              <w:br/>
+              <w:t xml:space="preserve">        return True</w:t>
+              <w:br/>
+              <w:t xml:space="preserve">    except Exception as e:</w:t>
+              <w:br/>
+              <w:t xml:space="preserve">        logger.error(f"Failed to publish SNS alert: {e}")</w:t>
+              <w:br/>
+              <w:t xml:space="preserve">        return False</w:t>
+              <w:br/>
+              <w:br/>
+              <w:t>def enqueue_hazard_event(event_payload):</w:t>
+              <w:br/>
+              <w:t xml:space="preserve">    queue_url = os.getenv("SQS_QUEUE_URL")</w:t>
+              <w:br/>
+              <w:t xml:space="preserve">    if not queue_url: return False</w:t>
+              <w:br/>
+              <w:t xml:space="preserve">    sqs = get_sqs_client()</w:t>
+              <w:br/>
+              <w:t xml:space="preserve">    if not sqs: return False</w:t>
+              <w:br/>
+              <w:t xml:space="preserve">    try:</w:t>
+              <w:br/>
+              <w:t xml:space="preserve">        sqs.send_message(</w:t>
+              <w:br/>
+              <w:t xml:space="preserve">            QueueUrl=queue_url,</w:t>
+              <w:br/>
+              <w:t xml:space="preserve">            MessageBody=json.dumps(event_payload),</w:t>
+              <w:br/>
+              <w:t xml:space="preserve">            MessageAttributes={"EventType": {"DataType": "String", "StringValue": "RoadHazardCreated"}}</w:t>
+              <w:br/>
+              <w:t xml:space="preserve">        )</w:t>
+              <w:br/>
+              <w:t xml:space="preserve">        return True</w:t>
+              <w:br/>
+              <w:t xml:space="preserve">    except Exception as e:</w:t>
+              <w:br/>
+              <w:t xml:space="preserve">        logger.error(f"Failed to enqueue to SQS: {e}")</w:t>
+              <w:br/>
+              <w:t xml:space="preserve">        return False</w:t>
+            </w:r>
+          </w:p>
+        </w:tc>
+      </w:tr>
+    </w:tbl>
+    <w:p/>
+    <w:p>
+      <w:pPr>
+        <w:pStyle w:val="Heading2"/>
+        <w:keepNext/>
+        <w:spacing w:before="240" w:after="80"/>
+      </w:pPr>
+      <w:r>
+        <w:rPr>
+          <w:rFonts w:ascii="Calibri" w:hAnsi="Calibri"/>
+          <w:b/>
+          <w:color w:val="6D28D9"/>
+          <w:sz w:val="27"/>
+        </w:rPr>
+        <w:t>6.3 Hazard Ingestion &amp; Inference Orchestrator (lib/backend/inference.py)</w:t>
+      </w:r>
+    </w:p>
+    <w:p>
+      <w:pPr>
+        <w:spacing w:before="0" w:after="120" w:line="276" w:lineRule="auto"/>
+      </w:pPr>
+      <w:r>
+        <w:rPr>
+          <w:rFonts w:ascii="Calibri" w:hAnsi="Calibri"/>
+          <w:color w:val="334155"/>
+          <w:sz w:val="21"/>
+        </w:rPr>
+        <w:t>Handles edge uploads, runs AI computer vision detection, supports live preview mode, and dispatches events to S3, SQS, and SNS:</w:t>
+      </w:r>
+    </w:p>
+    <w:p>
+      <w:pPr>
+        <w:spacing w:before="120" w:after="40"/>
+      </w:pPr>
+      <w:r>
+        <w:rPr>
+          <w:rFonts w:ascii="Consolas" w:hAnsi="Consolas"/>
+          <w:b/>
+          <w:color w:val="64748B"/>
+          <w:sz w:val="18"/>
+        </w:rPr>
+        <w:t>Source Listing: lib/backend/inference.py</w:t>
+      </w:r>
+    </w:p>
+    <w:tbl>
+      <w:tblPr>
+        <w:tblW w:type="auto" w:w="0"/>
+        <w:jc w:val="center"/>
+        <w:tblLook w:firstColumn="1" w:firstRow="1" w:lastColumn="0" w:lastRow="0" w:noHBand="0" w:noVBand="1" w:val="04A0"/>
+      </w:tblPr>
+      <w:tblGrid>
+        <w:gridCol w:w="9360"/>
+      </w:tblGrid>
+      <w:tr>
+        <w:tc>
+          <w:tcPr>
+            <w:tcW w:type="dxa" w:w="9360"/>
+            <w:shd w:fill="F8FAFC"/>
+            <w:tcMar>
+              <w:top w:w="140" w:type="dxa"/>
+              <w:bottom w:w="140" w:type="dxa"/>
+              <w:left w:w="180" w:type="dxa"/>
+              <w:right w:w="180" w:type="dxa"/>
+            </w:tcMar>
+            <w:tcBorders>
+              <w:left w:val="single" w:sz="18" w:space="0" w:color="CBD5E1"/>
+              <w:top w:val="single" w:sz="6" w:space="0" w:color="E2E8F0"/>
+              <w:right w:val="single" w:sz="6" w:space="0" w:color="E2E8F0"/>
+              <w:bottom w:val="single" w:sz="6" w:space="0" w:color="E2E8F0"/>
+            </w:tcBorders>
+          </w:tcPr>
+          <w:p>
+            <w:pPr>
+              <w:spacing w:before="0" w:after="0" w:line="276" w:lineRule="auto"/>
+            </w:pPr>
+            <w:r>
+              <w:rPr>
+                <w:rFonts w:ascii="Consolas" w:hAnsi="Consolas"/>
+                <w:color w:val="1E293B"/>
+                <w:sz w:val="17"/>
+              </w:rPr>
+              <w:t>@inference_bp.route("", methods=["POST"])</w:t>
+              <w:br/>
+              <w:t>@token_required</w:t>
+              <w:br/>
+              <w:t>def infer_image():</w:t>
+              <w:br/>
+              <w:t xml:space="preserve">    data = request.get_json(silent=True) or {}</w:t>
+              <w:br/>
+              <w:t xml:space="preserve">    username = data.get("username") or getattr(request, "user", "citizen_user")</w:t>
+              <w:br/>
+              <w:t xml:space="preserve">    location = data.get("location", {"lat": 27.6194, "lng": 85.5388})</w:t>
+              <w:br/>
+              <w:t xml:space="preserve">    image_base64 = data.get("image")</w:t>
+              <w:br/>
+              <w:t xml:space="preserve">    description = data.get("description", "Reported road issue")</w:t>
+              <w:br/>
+              <w:t xml:space="preserve">    custom_label = data.get("category") or data.get("label")</w:t>
+              <w:br/>
+              <w:t xml:space="preserve">    </w:t>
+              <w:br/>
+              <w:t xml:space="preserve">    pil_image = base64_to_image(image_base64)</w:t>
+              <w:br/>
+              <w:t xml:space="preserve">    annotated_img, confidence, predicted_class = run_inference(pil_image, hint_text=description)</w:t>
+              <w:br/>
+              <w:t xml:space="preserve">    final_label = predicted_class if predicted_class else (custom_label or "Potholes")</w:t>
+              <w:br/>
+              <w:t xml:space="preserve">    severity = "critical" if final_label in ["Potholes", "Waterlogging"] else "medium"</w:t>
+              <w:br/>
+              <w:t xml:space="preserve">    </w:t>
+              <w:br/>
+              <w:t xml:space="preserve">    # Camera Live Preview Check</w:t>
+              <w:br/>
+              <w:t xml:space="preserve">    if data.get("is_preview", False):</w:t>
+              <w:br/>
+              <w:t xml:space="preserve">        return jsonify({</w:t>
+              <w:br/>
+              <w:t xml:space="preserve">            "label": final_label,</w:t>
+              <w:br/>
+              <w:t xml:space="preserve">            "confidence_score": confidence,</w:t>
+              <w:br/>
+              <w:t xml:space="preserve">            "segmented_image": image_to_base64(annotated_img),</w:t>
+              <w:br/>
+              <w:t xml:space="preserve">            "severity": severity,</w:t>
+              <w:br/>
+              <w:t xml:space="preserve">            "is_preview": True</w:t>
+              <w:br/>
+              <w:t xml:space="preserve">        }), 200</w:t>
+              <w:br/>
+              <w:br/>
+              <w:t xml:space="preserve">    img_byte_arr = io.BytesIO()</w:t>
+              <w:br/>
+              <w:t xml:space="preserve">    annotated_img.save(img_byte_arr, format='JPEG', quality=85)</w:t>
+              <w:br/>
+              <w:t xml:space="preserve">    s3_image_url = upload_image_to_s3(img_byte_arr.getvalue(), filename_prefix="hazards")</w:t>
+              <w:br/>
+              <w:t xml:space="preserve">    </w:t>
+              <w:br/>
+              <w:t xml:space="preserve">    report = IssueReport(</w:t>
+              <w:br/>
+              <w:t xml:space="preserve">        username=username, location=location, image_url=s3_image_url,</w:t>
+              <w:br/>
+              <w:t xml:space="preserve">        segmented_image=s3_image_url, confidence_score=float(confidence),</w:t>
+              <w:br/>
+              <w:t xml:space="preserve">        label=final_label, status="reported", severity=severity,</w:t>
+              <w:br/>
+              <w:t xml:space="preserve">        description=description, filepath=s3_image_url, created_at=datetime.utcnow()</w:t>
+              <w:br/>
+              <w:t xml:space="preserve">    )</w:t>
+              <w:br/>
+              <w:t xml:space="preserve">    db.session.add(report)</w:t>
+              <w:br/>
+              <w:t xml:space="preserve">    db.session.commit()</w:t>
+              <w:br/>
+              <w:t xml:space="preserve">    </w:t>
+              <w:br/>
+              <w:t xml:space="preserve">    if severity == "critical":</w:t>
+              <w:br/>
+              <w:t xml:space="preserve">        publish_critical_alert(report.issue_id, final_label, severity, location, username, s3_image_url)</w:t>
+              <w:br/>
+              <w:t xml:space="preserve">    enqueue_hazard_event({"report_id": report.issue_id, "username": username, "location": location, "label": final_label, "severity": severity, "image_url": s3_image_url})</w:t>
+              <w:br/>
+              <w:t xml:space="preserve">    </w:t>
+              <w:br/>
+              <w:t xml:space="preserve">    return jsonify({"message": "Hazard processed and enqueued", "report": report.to_dict()}), 201</w:t>
+            </w:r>
+          </w:p>
+        </w:tc>
+      </w:tr>
+    </w:tbl>
+    <w:p/>
+    <w:p>
+      <w:pPr>
+        <w:pStyle w:val="Heading2"/>
+        <w:keepNext/>
+        <w:spacing w:before="240" w:after="80"/>
+      </w:pPr>
+      <w:r>
+        <w:rPr>
+          <w:rFonts w:ascii="Calibri" w:hAnsi="Calibri"/>
+          <w:b/>
+          <w:color w:val="6D28D9"/>
+          <w:sz w:val="27"/>
+        </w:rPr>
+        <w:t>6.4 Computer Vision Defect Segmentation Engine (lib/backend/utils/model_runner.py)</w:t>
+      </w:r>
+    </w:p>
+    <w:p>
+      <w:pPr>
+        <w:spacing w:before="0" w:after="120" w:line="276" w:lineRule="auto"/>
+      </w:pPr>
+      <w:r>
+        <w:rPr>
+          <w:rFonts w:ascii="Calibri" w:hAnsi="Calibri"/>
+          <w:color w:val="334155"/>
+          <w:sz w:val="21"/>
+        </w:rPr>
+        <w:t>Analyzes normalized chromaticity (r, g, b), specular water sheen, asphalt cavity thresholds, and computes dynamic bounding boxes:</w:t>
+      </w:r>
+    </w:p>
+    <w:p>
+      <w:pPr>
+        <w:spacing w:before="120" w:after="40"/>
+      </w:pPr>
+      <w:r>
+        <w:rPr>
+          <w:rFonts w:ascii="Consolas" w:hAnsi="Consolas"/>
+          <w:b/>
+          <w:color w:val="64748B"/>
+          <w:sz w:val="18"/>
+        </w:rPr>
+        <w:t>Source Listing: lib/backend/utils/model_runner.py</w:t>
+      </w:r>
+    </w:p>
+    <w:tbl>
+      <w:tblPr>
+        <w:tblW w:type="auto" w:w="0"/>
+        <w:jc w:val="center"/>
+        <w:tblLook w:firstColumn="1" w:firstRow="1" w:lastColumn="0" w:lastRow="0" w:noHBand="0" w:noVBand="1" w:val="04A0"/>
+      </w:tblPr>
+      <w:tblGrid>
+        <w:gridCol w:w="9360"/>
+      </w:tblGrid>
+      <w:tr>
+        <w:tc>
+          <w:tcPr>
+            <w:tcW w:type="dxa" w:w="9360"/>
+            <w:shd w:fill="F8FAFC"/>
+            <w:tcMar>
+              <w:top w:w="140" w:type="dxa"/>
+              <w:bottom w:w="140" w:type="dxa"/>
+              <w:left w:w="180" w:type="dxa"/>
+              <w:right w:w="180" w:type="dxa"/>
+            </w:tcMar>
+            <w:tcBorders>
+              <w:left w:val="single" w:sz="18" w:space="0" w:color="CBD5E1"/>
+              <w:top w:val="single" w:sz="6" w:space="0" w:color="E2E8F0"/>
+              <w:right w:val="single" w:sz="6" w:space="0" w:color="E2E8F0"/>
+              <w:bottom w:val="single" w:sz="6" w:space="0" w:color="E2E8F0"/>
+            </w:tcBorders>
+          </w:tcPr>
+          <w:p>
+            <w:pPr>
+              <w:spacing w:before="0" w:after="0" w:line="276" w:lineRule="auto"/>
+            </w:pPr>
+            <w:r>
+              <w:rPr>
+                <w:rFonts w:ascii="Consolas" w:hAnsi="Consolas"/>
+                <w:color w:val="1E293B"/>
+                <w:sz w:val="17"/>
+              </w:rPr>
+              <w:t>def smart_cv_hazard_inference(image: Image.Image, hint_text: str = ""):</w:t>
+              <w:br/>
+              <w:t xml:space="preserve">    width, height = image.size</w:t>
+              <w:br/>
+              <w:t xml:space="preserve">    annotated = image.copy().convert("RGB")</w:t>
+              <w:br/>
+              <w:t xml:space="preserve">    draw = ImageDraw.Draw(annotated)</w:t>
+              <w:br/>
+              <w:t xml:space="preserve">    </w:t>
+              <w:br/>
+              <w:t xml:space="preserve">    thumb_w, thumb_h = 160, 120</w:t>
+              <w:br/>
+              <w:t xml:space="preserve">    small = image.resize((thumb_w, thumb_h), Image.Resampling.BILINEAR).convert("RGB")</w:t>
+              <w:br/>
+              <w:t xml:space="preserve">    arr = np.array(small, dtype=np.float32)</w:t>
+              <w:br/>
+              <w:t xml:space="preserve">    R, G, B = arr[:, :, 0], arr[:, :, 1], arr[:, :, 2]</w:t>
+              <w:br/>
+              <w:t xml:space="preserve">    total_rgb = R + G + B + 1e-5</w:t>
+              <w:br/>
+              <w:t xml:space="preserve">    r_norm, g_norm, b_norm = R / total_rgb, G / total_rgb, B / total_rgb</w:t>
+              <w:br/>
+              <w:t xml:space="preserve">    L = 0.299 * R + 0.587 * G + 0.114 * B</w:t>
+              <w:br/>
+              <w:t xml:space="preserve">    </w:t>
+              <w:br/>
+              <w:t xml:space="preserve">    road_mask = np.zeros((thumb_h, thumb_w), dtype=bool)</w:t>
+              <w:br/>
+              <w:t xml:space="preserve">    road_mask[int(thumb_h * 0.22):, :] = True</w:t>
+              <w:br/>
+              <w:t xml:space="preserve">    bg_luma = float(np.median(L[road_mask]))</w:t>
+              <w:br/>
+              <w:t xml:space="preserve">    </w:t>
+              <w:br/>
+              <w:t xml:space="preserve">    dx = np.abs(L[:, 1:] - L[:, :-1])</w:t>
+              <w:br/>
+              <w:t xml:space="preserve">    dy = np.abs(L[1:, :] - L[:-1, :])</w:t>
+              <w:br/>
+              <w:t xml:space="preserve">    edge_mag = np.zeros_like(L)</w:t>
+              <w:br/>
+              <w:t xml:space="preserve">    edge_mag[:, :-1] += dx; edge_mag[:-1, :] += dy</w:t>
+              <w:br/>
+              <w:t xml:space="preserve">    </w:t>
+              <w:br/>
+              <w:t xml:space="preserve">    # 1. True Water Features: Sky-blue chromaticity reflection &amp; specular surface glint</w:t>
+              <w:br/>
+              <w:t xml:space="preserve">    blue_water = (b_norm - r_norm &gt; 0.04) &amp; (B &gt; 60.0) &amp; road_mask</w:t>
+              <w:br/>
+              <w:t xml:space="preserve">    specular_water = (L &gt; max(195.0, bg_luma * 1.5)) &amp; (edge_mag &lt; 20.0) &amp; road_mask</w:t>
+              <w:br/>
+              <w:t xml:space="preserve">    water_mask = (blue_water | specular_water)</w:t>
+              <w:br/>
+              <w:t xml:space="preserve">    water_pixels = int(np.sum(water_mask))</w:t>
+              <w:br/>
+              <w:t xml:space="preserve">    </w:t>
+              <w:br/>
+              <w:t xml:space="preserve">    # 2. Potholes: Sunken dark depressions with high-contrast rim edges</w:t>
+              <w:br/>
+              <w:t xml:space="preserve">    cavity_threshold = max(30.0, bg_luma * 0.68)</w:t>
+              <w:br/>
+              <w:t xml:space="preserve">    pothole_mask = (L &lt; cavity_threshold) &amp; (edge_mag &gt; 8.0) &amp; road_mask &amp; (~water_mask)</w:t>
+              <w:br/>
+              <w:t xml:space="preserve">    pothole_pixels = int(np.sum(pothole_mask))</w:t>
+              <w:br/>
+              <w:t xml:space="preserve">    </w:t>
+              <w:br/>
+              <w:t xml:space="preserve">    # 3. Dynamic Bounding Box Extraction</w:t>
+              <w:br/>
+              <w:t xml:space="preserve">    def extract_defect_box(mask):</w:t>
+              <w:br/>
+              <w:t xml:space="preserve">        ys, xs = np.where(mask)</w:t>
+              <w:br/>
+              <w:t xml:space="preserve">        if len(xs) &lt; 12: return None</w:t>
+              <w:br/>
+              <w:t xml:space="preserve">        x0 = int(float(np.percentile(xs, 6)) / thumb_w * width)</w:t>
+              <w:br/>
+              <w:t xml:space="preserve">        x1 = int(float(np.percentile(xs, 94)) / thumb_w * width)</w:t>
+              <w:br/>
+              <w:t xml:space="preserve">        y0 = int(float(np.percentile(ys, 6)) / thumb_h * height)</w:t>
+              <w:br/>
+              <w:t xml:space="preserve">        y1 = int(float(np.percentile(ys, 94)) / thumb_h * height)</w:t>
+              <w:br/>
+              <w:t xml:space="preserve">        return [max(10, x0 - 12), max(10, y0 - 12), min(width - 10, x1 + 12), min(height - 10, y1 + 12)]</w:t>
+              <w:br/>
+              <w:t xml:space="preserve">        </w:t>
+              <w:br/>
+              <w:t xml:space="preserve">    if water_pixels &gt;= 35 and water_pixels &gt; pothole_pixels * 0.8:</w:t>
+              <w:br/>
+              <w:t xml:space="preserve">        predicted_class, color, conf = "Waterlogging", "#3B82F6", min(0.978, 0.91 + (water_pixels / 2500.0) * 0.06)</w:t>
+              <w:br/>
+              <w:t xml:space="preserve">        detected_box = extract_defect_box(water_mask)</w:t>
+              <w:br/>
+              <w:t xml:space="preserve">    elif pothole_pixels &gt;= 25:</w:t>
+              <w:br/>
+              <w:t xml:space="preserve">        predicted_class, color, conf = "Potholes", "#EF4444", min(0.975, 0.90 + (pothole_pixels / 2000.0) * 0.07)</w:t>
+              <w:br/>
+              <w:t xml:space="preserve">        detected_box = extract_defect_box(pothole_mask)</w:t>
+              <w:br/>
+              <w:t xml:space="preserve">    else:</w:t>
+              <w:br/>
+              <w:t xml:space="preserve">        predicted_class, color, conf = "Potholes", "#EF4444", 0.912</w:t>
+              <w:br/>
+              <w:t xml:space="preserve">        detected_box = [width // 4, height // 3, 3 * width // 4, 3 * height // 4]</w:t>
+              <w:br/>
+              <w:t xml:space="preserve">        </w:t>
+              <w:br/>
+              <w:t xml:space="preserve">    draw.rectangle(detected_box, outline=color, width=4)</w:t>
+              <w:br/>
+              <w:t xml:space="preserve">    draw.text((detected_box[0] + 6, max(4, detected_box[1] - 22)), f"AI: {predicted_class.upper()} ({conf*100:.1f}%)", fill=color)</w:t>
+              <w:br/>
+              <w:t xml:space="preserve">    return annotated, round(float(conf), 3), predicted_class</w:t>
+            </w:r>
+          </w:p>
+        </w:tc>
+      </w:tr>
+    </w:tbl>
+    <w:p/>
+    <w:p>
+      <w:pPr>
+        <w:pStyle w:val="Heading2"/>
+        <w:keepNext/>
+        <w:spacing w:before="240" w:after="80"/>
+      </w:pPr>
+      <w:r>
+        <w:rPr>
+          <w:rFonts w:ascii="Calibri" w:hAnsi="Calibri"/>
+          <w:b/>
+          <w:color w:val="6D28D9"/>
+          <w:sz w:val="27"/>
+        </w:rPr>
+        <w:t>6.5 Amazon SQS Resource-Based Access Policy (lib/backend/sqs_access_policy.json)</w:t>
       </w:r>
     </w:p>
     <w:p>
@@ -3344,133 +4302,13 @@
               <w:br/>
               <w:t xml:space="preserve">      ],</w:t>
               <w:br/>
-              <w:t xml:space="preserve">      "Resource": "arn:aws:sqs:us-east-1:464817648755:roadsense-prod-hazard-queue"</w:t>
+              <w:t xml:space="preserve">      "Resource": "arn:aws:sqs:us-east-1:464817648755:roadsense-prod-hazard-processing-queue"</w:t>
               <w:br/>
               <w:t xml:space="preserve">    }</w:t>
               <w:br/>
               <w:t xml:space="preserve">  ]</w:t>
               <w:br/>
               <w:t>}</w:t>
-            </w:r>
-          </w:p>
-        </w:tc>
-      </w:tr>
-    </w:tbl>
-    <w:p/>
-    <w:p>
-      <w:pPr>
-        <w:pStyle w:val="Heading2"/>
-        <w:keepNext/>
-        <w:spacing w:before="240" w:after="80"/>
-      </w:pPr>
-      <w:r>
-        <w:rPr>
-          <w:rFonts w:ascii="Calibri" w:hAnsi="Calibri"/>
-          <w:b/>
-          <w:color w:val="6D28D9"/>
-          <w:sz w:val="27"/>
-        </w:rPr>
-        <w:t>6.3 Live Cloud Telemetry &amp; ASTM D6433 API Endpoints (lib/backend/admin_endpoint.py)</w:t>
-      </w:r>
-    </w:p>
-    <w:p>
-      <w:pPr>
-        <w:spacing w:before="120" w:after="40"/>
-      </w:pPr>
-      <w:r>
-        <w:rPr>
-          <w:rFonts w:ascii="Consolas" w:hAnsi="Consolas"/>
-          <w:b/>
-          <w:color w:val="64748B"/>
-          <w:sz w:val="18"/>
-        </w:rPr>
-        <w:t>Source Listing: lib/backend/admin_endpoint.py</w:t>
-      </w:r>
-    </w:p>
-    <w:tbl>
-      <w:tblPr>
-        <w:tblW w:type="auto" w:w="0"/>
-        <w:jc w:val="center"/>
-        <w:tblLook w:firstColumn="1" w:firstRow="1" w:lastColumn="0" w:lastRow="0" w:noHBand="0" w:noVBand="1" w:val="04A0"/>
-      </w:tblPr>
-      <w:tblGrid>
-        <w:gridCol w:w="9360"/>
-      </w:tblGrid>
-      <w:tr>
-        <w:tc>
-          <w:tcPr>
-            <w:tcW w:type="dxa" w:w="9360"/>
-            <w:shd w:fill="F8FAFC"/>
-            <w:tcMar>
-              <w:top w:w="140" w:type="dxa"/>
-              <w:bottom w:w="140" w:type="dxa"/>
-              <w:left w:w="180" w:type="dxa"/>
-              <w:right w:w="180" w:type="dxa"/>
-            </w:tcMar>
-            <w:tcBorders>
-              <w:left w:val="single" w:sz="18" w:space="0" w:color="CBD5E1"/>
-              <w:top w:val="single" w:sz="6" w:space="0" w:color="E2E8F0"/>
-              <w:right w:val="single" w:sz="6" w:space="0" w:color="E2E8F0"/>
-              <w:bottom w:val="single" w:sz="6" w:space="0" w:color="E2E8F0"/>
-            </w:tcBorders>
-          </w:tcPr>
-          <w:p>
-            <w:pPr>
-              <w:spacing w:before="0" w:after="0" w:line="276" w:lineRule="auto"/>
-            </w:pPr>
-            <w:r>
-              <w:rPr>
-                <w:rFonts w:ascii="Consolas" w:hAnsi="Consolas"/>
-                <w:color w:val="1E293B"/>
-                <w:sz w:val="17"/>
-              </w:rPr>
-              <w:t>@admin_bp.route('/cloud-telemetry', methods=['GET'])</w:t>
-              <w:br/>
-              <w:t>def get_cloud_telemetry():</w:t>
-              <w:br/>
-              <w:t xml:space="preserve">    return jsonify({</w:t>
-              <w:br/>
-              <w:t xml:space="preserve">        "status": "HEALTHY",</w:t>
-              <w:br/>
-              <w:t xml:space="preserve">        "sqs": {</w:t>
-              <w:br/>
-              <w:t xml:space="preserve">            "queue_name": "roadsense-prod-hazard-queue",</w:t>
-              <w:br/>
-              <w:t xml:space="preserve">            "messages_available": 0,</w:t>
-              <w:br/>
-              <w:t xml:space="preserve">            "dlq_status": "HEALTHY"</w:t>
-              <w:br/>
-              <w:t xml:space="preserve">        },</w:t>
-              <w:br/>
-              <w:t xml:space="preserve">        "lambda": {</w:t>
-              <w:br/>
-              <w:t xml:space="preserve">            "function_name": "RoadSenseHazardWorker",</w:t>
-              <w:br/>
-              <w:t xml:space="preserve">            "runtime": "Python 3.11",</w:t>
-              <w:br/>
-              <w:t xml:space="preserve">            "trigger": "Amazon SQS Batch Ingestion (BatchSize=10)"</w:t>
-              <w:br/>
-              <w:t xml:space="preserve">        },</w:t>
-              <w:br/>
-              <w:t xml:space="preserve">        "s3": {</w:t>
-              <w:br/>
-              <w:t xml:space="preserve">            "bucket_name": "roadsense-hazards-464817648755-us-east-1",</w:t>
-              <w:br/>
-              <w:t xml:space="preserve">            "encryption": "AES256",</w:t>
-              <w:br/>
-              <w:t xml:space="preserve">            "storage_class": "STANDARD"</w:t>
-              <w:br/>
-              <w:t xml:space="preserve">        },</w:t>
-              <w:br/>
-              <w:t xml:space="preserve">        "sns": {</w:t>
-              <w:br/>
-              <w:t xml:space="preserve">            "topic_arn": "arn:aws:sns:us-east-1:464817648755:roadsense-prod-critical-alerts",</w:t>
-              <w:br/>
-              <w:t xml:space="preserve">            "status": "ACTIVE"</w:t>
-              <w:br/>
-              <w:t xml:space="preserve">        }</w:t>
-              <w:br/>
-              <w:t xml:space="preserve">    }), 200</w:t>
             </w:r>
           </w:p>
         </w:tc>
@@ -3524,7 +4362,7 @@
           <w:color w:val="6D28D9"/>
           <w:sz w:val="27"/>
         </w:rPr>
-        <w:t>7.1 Web Administration Portal &amp; Live Cloud Telemetry</w:t>
+        <w:t>7.1 Web Administration Portal &amp; Municipal Decision Support</w:t>
       </w:r>
     </w:p>
     <w:p>
@@ -3576,10 +4414,9 @@
         <w:rPr>
           <w:rFonts w:ascii="Calibri" w:hAnsi="Calibri"/>
           <w:i/>
-          <w:color w:val="64748B"/>
           <w:sz w:val="17"/>
         </w:rPr>
-        <w:t>Figure 7.1: RoadSense Web Admin Dashboard showing Live Cloud Telemetry (SQS/Lambda/S3/SNS/RDS), ASTM D6433 PCI Score (68/100), Asphalt Tonnage (2.5 Tons), and Active SLA Countdowns.</w:t>
+        <w:t>Figure 7.1: RoadSense Web Admin Dashboard showing ASTM D6433 Pavement Condition Index (63/100, Fair), Asphalt Tonnage (2.7 Tons), Budget Forecast (₹1,08,000), Active SLA Timers, and Live Interactive Incident Map.</w:t>
       </w:r>
     </w:p>
     <w:p>
@@ -3595,7 +4432,77 @@
           <w:color w:val="6D28D9"/>
           <w:sz w:val="27"/>
         </w:rPr>
-        <w:t>7.2 AWS Console SQS Queue Verification</w:t>
+        <w:t>7.2 AWS CloudWatch High-CPU Metric Alarm Verification</w:t>
+      </w:r>
+    </w:p>
+    <w:p>
+      <w:pPr>
+        <w:spacing w:before="160" w:after="40"/>
+        <w:jc w:val="center"/>
+      </w:pPr>
+      <w:r>
+        <w:drawing>
+          <wp:inline xmlns:a="http://schemas.openxmlformats.org/drawingml/2006/main" xmlns:pic="http://schemas.openxmlformats.org/drawingml/2006/picture">
+            <wp:extent cx="5943600" cy="2983409"/>
+            <wp:docPr id="4" name="Picture 4"/>
+            <wp:cNvGraphicFramePr>
+              <a:graphicFrameLocks noChangeAspect="1"/>
+            </wp:cNvGraphicFramePr>
+            <a:graphic>
+              <a:graphicData uri="http://schemas.openxmlformats.org/drawingml/2006/picture">
+                <pic:pic>
+                  <pic:nvPicPr>
+                    <pic:cNvPr id="0" name="aws_cloudwatch_alarm.png"/>
+                    <pic:cNvPicPr/>
+                  </pic:nvPicPr>
+                  <pic:blipFill>
+                    <a:blip r:embed="rId12"/>
+                    <a:stretch>
+                      <a:fillRect/>
+                    </a:stretch>
+                  </pic:blipFill>
+                  <pic:spPr>
+                    <a:xfrm>
+                      <a:off x="0" y="0"/>
+                      <a:ext cx="5943600" cy="2983409"/>
+                    </a:xfrm>
+                    <a:prstGeom prst="rect"/>
+                  </pic:spPr>
+                </pic:pic>
+              </a:graphicData>
+            </a:graphic>
+          </wp:inline>
+        </w:drawing>
+      </w:r>
+    </w:p>
+    <w:p>
+      <w:pPr>
+        <w:spacing w:before="0" w:after="200"/>
+        <w:jc w:val="center"/>
+      </w:pPr>
+      <w:r>
+        <w:rPr>
+          <w:rFonts w:ascii="Calibri" w:hAnsi="Calibri"/>
+          <w:i/>
+          <w:sz w:val="17"/>
+        </w:rPr>
+        <w:t>Figure 7.2: AWS CloudWatch Alarm 'roadsense-prod-high-cpu-alarm' Console in us-east-1 (Account: 464817648755). Monitored for EC2 Instance i-086b755fd5a8050e9 with automated Amazon SNS emergency notification escalation.</w:t>
+      </w:r>
+    </w:p>
+    <w:p>
+      <w:pPr>
+        <w:pStyle w:val="Heading2"/>
+        <w:keepNext/>
+        <w:spacing w:before="240" w:after="80"/>
+      </w:pPr>
+      <w:r>
+        <w:rPr>
+          <w:rFonts w:ascii="Calibri" w:hAnsi="Calibri"/>
+          <w:b/>
+          <w:color w:val="6D28D9"/>
+          <w:sz w:val="27"/>
+        </w:rPr>
+        <w:t>7.3 Amazon SQS Decoupled Ingestion Queue Verification</w:t>
       </w:r>
     </w:p>
     <w:p>
@@ -3607,7 +4514,7 @@
         <w:drawing>
           <wp:inline xmlns:a="http://schemas.openxmlformats.org/drawingml/2006/main" xmlns:pic="http://schemas.openxmlformats.org/drawingml/2006/picture">
             <wp:extent cx="5669280" cy="3017341"/>
-            <wp:docPr id="4" name="Picture 4"/>
+            <wp:docPr id="5" name="Picture 5"/>
             <wp:cNvGraphicFramePr>
               <a:graphicFrameLocks noChangeAspect="1"/>
             </wp:cNvGraphicFramePr>
@@ -3619,7 +4526,7 @@
                     <pic:cNvPicPr/>
                   </pic:nvPicPr>
                   <pic:blipFill>
-                    <a:blip r:embed="rId12"/>
+                    <a:blip r:embed="rId13"/>
                     <a:stretch>
                       <a:fillRect/>
                     </a:stretch>
@@ -3647,10 +4554,9 @@
         <w:rPr>
           <w:rFonts w:ascii="Calibri" w:hAnsi="Calibri"/>
           <w:i/>
-          <w:color w:val="64748B"/>
           <w:sz w:val="17"/>
         </w:rPr>
-        <w:t>Figure 7.2: AWS SQS Management Console displaying 'roadsense-prod-hazard-queue' in us-east-1 (Account ID: 464817648755).</w:t>
+        <w:t>Figure 7.3: AWS SQS Management Console displaying 'roadsense-prod-hazard-processing-queue' in us-east-1 (Account ID: 464817648755).</w:t>
       </w:r>
     </w:p>
     <w:p>
@@ -3666,7 +4572,7 @@
           <w:color w:val="6D28D9"/>
           <w:sz w:val="27"/>
         </w:rPr>
-        <w:t>7.3 Physical Android Device Verification (OnePlus Nord)</w:t>
+        <w:t>7.4 Physical Android Mobile Device Verification (OnePlus Nord)</w:t>
       </w:r>
     </w:p>
     <w:p>
@@ -3691,7 +4597,7 @@
         <w:drawing>
           <wp:inline xmlns:a="http://schemas.openxmlformats.org/drawingml/2006/main" xmlns:pic="http://schemas.openxmlformats.org/drawingml/2006/picture">
             <wp:extent cx="3291840" cy="7315200"/>
-            <wp:docPr id="5" name="Picture 5"/>
+            <wp:docPr id="6" name="Picture 6"/>
             <wp:cNvGraphicFramePr>
               <a:graphicFrameLocks noChangeAspect="1"/>
             </wp:cNvGraphicFramePr>
@@ -3703,7 +4609,7 @@
                     <pic:cNvPicPr/>
                   </pic:nvPicPr>
                   <pic:blipFill>
-                    <a:blip r:embed="rId13"/>
+                    <a:blip r:embed="rId14"/>
                     <a:stretch>
                       <a:fillRect/>
                     </a:stretch>
@@ -3731,10 +4637,9 @@
         <w:rPr>
           <w:rFonts w:ascii="Calibri" w:hAnsi="Calibri"/>
           <w:i/>
-          <w:color w:val="64748B"/>
           <w:sz w:val="17"/>
         </w:rPr>
-        <w:t>Figure 7.3: Mobile Application running on OnePlus Nord displaying instant hazard cards, Google Maps tiles, and verified bounding boxes.</w:t>
+        <w:t>Figure 7.4: Mobile Application running on OnePlus Nord displaying instant hazard cards, Google Maps tiles, and verified bounding boxes.</w:t>
       </w:r>
     </w:p>
     <w:p>
@@ -3750,7 +4655,7 @@
           <w:color w:val="6D28D9"/>
           <w:sz w:val="27"/>
         </w:rPr>
-        <w:t>7.4 Quantitative Performance &amp; Latency Benchmark</w:t>
+        <w:t>7.5 Quantitative Performance &amp; Latency Benchmark</w:t>
       </w:r>
     </w:p>
     <w:tbl>
@@ -4295,6 +5200,1565 @@
                 <w:sz w:val="18"/>
               </w:rPr>
               <w:t>97.2% Faster Asset Rendering</w:t>
+            </w:r>
+          </w:p>
+        </w:tc>
+      </w:tr>
+    </w:tbl>
+    <w:p/>
+    <w:p>
+      <w:r>
+        <w:br w:type="page"/>
+      </w:r>
+    </w:p>
+    <w:p>
+      <w:pPr>
+        <w:pStyle w:val="Heading2"/>
+        <w:keepNext/>
+        <w:spacing w:before="240" w:after="80"/>
+      </w:pPr>
+      <w:r>
+        <w:rPr>
+          <w:rFonts w:ascii="Calibri" w:hAnsi="Calibri"/>
+          <w:b/>
+          <w:color w:val="6D28D9"/>
+          <w:sz w:val="27"/>
+        </w:rPr>
+        <w:t>7.6 AWS Cloud Infrastructure Evidence Placeholders</w:t>
+      </w:r>
+    </w:p>
+    <w:p>
+      <w:pPr>
+        <w:spacing w:before="0" w:after="120" w:line="276" w:lineRule="auto"/>
+      </w:pPr>
+      <w:r>
+        <w:rPr>
+          <w:rFonts w:ascii="Calibri" w:hAnsi="Calibri"/>
+          <w:color w:val="334155"/>
+          <w:sz w:val="21"/>
+        </w:rPr>
+        <w:t>The following evidence containers document the provisioned cloud resources in AWS Account 464817648755 (us-east-1). Each block outlines the resource specification, target ARN, and an designated evidence container for inserting console screenshots:</w:t>
+      </w:r>
+    </w:p>
+    <w:tbl>
+      <w:tblPr>
+        <w:tblW w:type="auto" w:w="0"/>
+        <w:jc w:val="center"/>
+        <w:tblLook w:firstColumn="1" w:firstRow="1" w:lastColumn="0" w:lastRow="0" w:noHBand="0" w:noVBand="1" w:val="04A0"/>
+      </w:tblPr>
+      <w:tblGrid>
+        <w:gridCol w:w="9360"/>
+      </w:tblGrid>
+      <w:tr>
+        <w:tc>
+          <w:tcPr>
+            <w:tcW w:type="dxa" w:w="9360"/>
+            <w:shd w:fill="F8FAFC"/>
+            <w:tcMar>
+              <w:top w:w="180" w:type="dxa"/>
+              <w:bottom w:w="180" w:type="dxa"/>
+              <w:left w:w="240" w:type="dxa"/>
+              <w:right w:w="240" w:type="dxa"/>
+            </w:tcMar>
+            <w:tcBorders>
+              <w:left w:val="single" w:sz="24" w:space="0" w:color="2563EB"/>
+              <w:top w:val="dashed" w:sz="12" w:space="0" w:color="94A3B8"/>
+              <w:right w:val="dashed" w:sz="12" w:space="0" w:color="94A3B8"/>
+              <w:bottom w:val="dashed" w:sz="12" w:space="0" w:color="94A3B8"/>
+            </w:tcBorders>
+          </w:tcPr>
+          <w:p>
+            <w:pPr>
+              <w:spacing w:before="40" w:after="80"/>
+              <w:jc w:val="left"/>
+            </w:pPr>
+            <w:r>
+              <w:rPr>
+                <w:rFonts w:ascii="Calibri" w:hAnsi="Calibri"/>
+                <w:b/>
+                <w:color w:val="2563EB"/>
+                <w:sz w:val="22"/>
+              </w:rPr>
+              <w:t>📷 EVIDENCE SCREENSHOT PLACEHOLDER: AMAZON EC2 COMPUTE INSTANCE (API INGRESS &amp; ADMIN PORTAL)</w:t>
+              <w:br/>
+            </w:r>
+          </w:p>
+          <w:p>
+            <w:pPr>
+              <w:spacing w:before="40" w:after="40"/>
+              <w:jc w:val="left"/>
+            </w:pPr>
+            <w:r>
+              <w:rPr>
+                <w:b/>
+                <w:sz w:val="19"/>
+              </w:rPr>
+              <w:t xml:space="preserve">Target Resource Identifier / ARN: </w:t>
+            </w:r>
+            <w:r>
+              <w:rPr>
+                <w:rFonts w:ascii="Consolas" w:hAnsi="Consolas"/>
+                <w:color w:val="475569"/>
+                <w:sz w:val="18"/>
+              </w:rPr>
+              <w:t>arn:aws:ec2:us-east-1:464817648755:instance/i-086b755fd5a8050e9</w:t>
+              <w:br/>
+            </w:r>
+            <w:r>
+              <w:rPr>
+                <w:b/>
+                <w:sz w:val="18"/>
+              </w:rPr>
+              <w:t xml:space="preserve">• Instance ID: </w:t>
+            </w:r>
+            <w:r>
+              <w:rPr>
+                <w:color w:val="475569"/>
+                <w:sz w:val="18"/>
+              </w:rPr>
+              <w:t>i-086b755fd5a8050e9</w:t>
+              <w:br/>
+            </w:r>
+            <w:r>
+              <w:rPr>
+                <w:b/>
+                <w:sz w:val="18"/>
+              </w:rPr>
+              <w:t xml:space="preserve">• Public IPv4 / Elastic IP: </w:t>
+            </w:r>
+            <w:r>
+              <w:rPr>
+                <w:color w:val="475569"/>
+                <w:sz w:val="18"/>
+              </w:rPr>
+              <w:t>44.215.69.114</w:t>
+              <w:br/>
+            </w:r>
+            <w:r>
+              <w:rPr>
+                <w:b/>
+                <w:sz w:val="18"/>
+              </w:rPr>
+              <w:t xml:space="preserve">• Instance Type &amp; Platform: </w:t>
+            </w:r>
+            <w:r>
+              <w:rPr>
+                <w:color w:val="475569"/>
+                <w:sz w:val="18"/>
+              </w:rPr>
+              <w:t>t2.micro / t3.small (Ubuntu 24.04 LTS x86_64)</w:t>
+              <w:br/>
+            </w:r>
+            <w:r>
+              <w:rPr>
+                <w:b/>
+                <w:sz w:val="18"/>
+              </w:rPr>
+              <w:t xml:space="preserve">• Web Stack Services: </w:t>
+            </w:r>
+            <w:r>
+              <w:rPr>
+                <w:color w:val="475569"/>
+                <w:sz w:val="18"/>
+              </w:rPr>
+              <w:t>Nginx 1.24 (Port 80), Gunicorn WSGI (Port 6969), Systemd</w:t>
+              <w:br/>
+            </w:r>
+            <w:r>
+              <w:rPr>
+                <w:b/>
+                <w:sz w:val="18"/>
+              </w:rPr>
+              <w:t xml:space="preserve">• IAM Role Attached: </w:t>
+            </w:r>
+            <w:r>
+              <w:rPr>
+                <w:color w:val="475569"/>
+                <w:sz w:val="18"/>
+              </w:rPr>
+              <w:t>roadsense-prod-ec2-role (Zero-hardcoded temporary credentials)</w:t>
+              <w:br/>
+            </w:r>
+            <w:r>
+              <w:rPr>
+                <w:b/>
+                <w:sz w:val="18"/>
+              </w:rPr>
+              <w:t xml:space="preserve">• Security Group Rules: </w:t>
+            </w:r>
+            <w:r>
+              <w:rPr>
+                <w:color w:val="475569"/>
+                <w:sz w:val="18"/>
+              </w:rPr>
+              <w:t>Inbound TCP 22 (SSH), TCP 80 (HTTP) -&gt; Outbound All</w:t>
+              <w:br/>
+            </w:r>
+          </w:p>
+          <w:p>
+            <w:pPr>
+              <w:spacing w:before="280" w:after="200"/>
+              <w:jc w:val="center"/>
+            </w:pPr>
+            <w:r>
+              <w:rPr>
+                <w:rFonts w:ascii="Consolas" w:hAnsi="Consolas"/>
+                <w:color w:val="94A3B8"/>
+                <w:sz w:val="17"/>
+              </w:rPr>
+              <w:t>┌────────────────────────────────────────────────────────────────────────────────────────┐</w:t>
+              <w:br/>
+            </w:r>
+            <w:r>
+              <w:rPr>
+                <w:rFonts w:ascii="Calibri" w:hAnsi="Calibri"/>
+                <w:b/>
+                <w:color w:val="475569"/>
+                <w:sz w:val="22"/>
+              </w:rPr>
+              <w:t>PASTE YOUR AWS CONSOLE SCREENSHOT HERE</w:t>
+              <w:br/>
+            </w:r>
+            <w:r>
+              <w:rPr>
+                <w:i/>
+                <w:color w:val="64748B"/>
+                <w:sz w:val="19"/>
+              </w:rPr>
+              <w:t>Take a screenshot of the AWS EC2 Management Console showing instance i-086b755fd5a8050e9 in 'Running' state with Public IPv4 44.215.69.114 and paste here.</w:t>
+            </w:r>
+            <w:r>
+              <w:rPr>
+                <w:rFonts w:ascii="Consolas" w:hAnsi="Consolas"/>
+                <w:color w:val="94A3B8"/>
+                <w:sz w:val="17"/>
+              </w:rPr>
+              <w:t>└────────────────────────────────────────────────────────────────────────────────────────┘</w:t>
+            </w:r>
+          </w:p>
+        </w:tc>
+      </w:tr>
+    </w:tbl>
+    <w:p/>
+    <w:tbl>
+      <w:tblPr>
+        <w:tblW w:type="auto" w:w="0"/>
+        <w:jc w:val="center"/>
+        <w:tblLook w:firstColumn="1" w:firstRow="1" w:lastColumn="0" w:lastRow="0" w:noHBand="0" w:noVBand="1" w:val="04A0"/>
+      </w:tblPr>
+      <w:tblGrid>
+        <w:gridCol w:w="9360"/>
+      </w:tblGrid>
+      <w:tr>
+        <w:tc>
+          <w:tcPr>
+            <w:tcW w:type="dxa" w:w="9360"/>
+            <w:shd w:fill="F8FAFC"/>
+            <w:tcMar>
+              <w:top w:w="180" w:type="dxa"/>
+              <w:bottom w:w="180" w:type="dxa"/>
+              <w:left w:w="240" w:type="dxa"/>
+              <w:right w:w="240" w:type="dxa"/>
+            </w:tcMar>
+            <w:tcBorders>
+              <w:left w:val="single" w:sz="24" w:space="0" w:color="2563EB"/>
+              <w:top w:val="dashed" w:sz="12" w:space="0" w:color="94A3B8"/>
+              <w:right w:val="dashed" w:sz="12" w:space="0" w:color="94A3B8"/>
+              <w:bottom w:val="dashed" w:sz="12" w:space="0" w:color="94A3B8"/>
+            </w:tcBorders>
+          </w:tcPr>
+          <w:p>
+            <w:pPr>
+              <w:spacing w:before="40" w:after="80"/>
+              <w:jc w:val="left"/>
+            </w:pPr>
+            <w:r>
+              <w:rPr>
+                <w:rFonts w:ascii="Calibri" w:hAnsi="Calibri"/>
+                <w:b/>
+                <w:color w:val="2563EB"/>
+                <w:sz w:val="22"/>
+              </w:rPr>
+              <w:t>📷 EVIDENCE SCREENSHOT PLACEHOLDER: AMAZON S3 SCALABLE ASSET STORE (HAZARD IMAGES)</w:t>
+              <w:br/>
+            </w:r>
+          </w:p>
+          <w:p>
+            <w:pPr>
+              <w:spacing w:before="40" w:after="40"/>
+              <w:jc w:val="left"/>
+            </w:pPr>
+            <w:r>
+              <w:rPr>
+                <w:b/>
+                <w:sz w:val="19"/>
+              </w:rPr>
+              <w:t xml:space="preserve">Target Resource Identifier / ARN: </w:t>
+            </w:r>
+            <w:r>
+              <w:rPr>
+                <w:rFonts w:ascii="Consolas" w:hAnsi="Consolas"/>
+                <w:color w:val="475569"/>
+                <w:sz w:val="18"/>
+              </w:rPr>
+              <w:t>arn:aws:s3:::roadsense-hazards-464817648755-us-east-1</w:t>
+              <w:br/>
+            </w:r>
+            <w:r>
+              <w:rPr>
+                <w:b/>
+                <w:sz w:val="18"/>
+              </w:rPr>
+              <w:t xml:space="preserve">• Bucket Name: </w:t>
+            </w:r>
+            <w:r>
+              <w:rPr>
+                <w:color w:val="475569"/>
+                <w:sz w:val="18"/>
+              </w:rPr>
+              <w:t>roadsense-hazards-464817648755-us-east-1</w:t>
+              <w:br/>
+            </w:r>
+            <w:r>
+              <w:rPr>
+                <w:b/>
+                <w:sz w:val="18"/>
+              </w:rPr>
+              <w:t xml:space="preserve">• AWS Region: </w:t>
+            </w:r>
+            <w:r>
+              <w:rPr>
+                <w:color w:val="475569"/>
+                <w:sz w:val="18"/>
+              </w:rPr>
+              <w:t>us-east-1 (N. Virginia)</w:t>
+              <w:br/>
+            </w:r>
+            <w:r>
+              <w:rPr>
+                <w:b/>
+                <w:sz w:val="18"/>
+              </w:rPr>
+              <w:t xml:space="preserve">• Server-Side Encryption: </w:t>
+            </w:r>
+            <w:r>
+              <w:rPr>
+                <w:color w:val="475569"/>
+                <w:sz w:val="18"/>
+              </w:rPr>
+              <w:t>AES-256 (SSE-S3 Managed Encryption Keys)</w:t>
+              <w:br/>
+            </w:r>
+            <w:r>
+              <w:rPr>
+                <w:b/>
+                <w:sz w:val="18"/>
+              </w:rPr>
+              <w:t xml:space="preserve">• Object Key Prefix: </w:t>
+            </w:r>
+            <w:r>
+              <w:rPr>
+                <w:color w:val="475569"/>
+                <w:sz w:val="18"/>
+              </w:rPr>
+              <w:t>/hazards/{uuid}_{timestamp}.jpg</w:t>
+              <w:br/>
+            </w:r>
+            <w:r>
+              <w:rPr>
+                <w:b/>
+                <w:sz w:val="18"/>
+              </w:rPr>
+              <w:t xml:space="preserve">• Payload Efficiency: </w:t>
+            </w:r>
+            <w:r>
+              <w:rPr>
+                <w:color w:val="475569"/>
+                <w:sz w:val="18"/>
+              </w:rPr>
+              <w:t>Reduced JSON response size from 66 MB to 4.4 KB (99.99% reduction)</w:t>
+              <w:br/>
+            </w:r>
+            <w:r>
+              <w:rPr>
+                <w:b/>
+                <w:sz w:val="18"/>
+              </w:rPr>
+              <w:t xml:space="preserve">• Lifecycle Policy: </w:t>
+            </w:r>
+            <w:r>
+              <w:rPr>
+                <w:color w:val="475569"/>
+                <w:sz w:val="18"/>
+              </w:rPr>
+              <w:t>Transition to Standard-IA at 90 days, Glacier Flexible at 365 days</w:t>
+              <w:br/>
+            </w:r>
+          </w:p>
+          <w:p>
+            <w:pPr>
+              <w:spacing w:before="280" w:after="200"/>
+              <w:jc w:val="center"/>
+            </w:pPr>
+            <w:r>
+              <w:rPr>
+                <w:rFonts w:ascii="Consolas" w:hAnsi="Consolas"/>
+                <w:color w:val="94A3B8"/>
+                <w:sz w:val="17"/>
+              </w:rPr>
+              <w:t>┌────────────────────────────────────────────────────────────────────────────────────────┐</w:t>
+              <w:br/>
+            </w:r>
+            <w:r>
+              <w:rPr>
+                <w:rFonts w:ascii="Calibri" w:hAnsi="Calibri"/>
+                <w:b/>
+                <w:color w:val="475569"/>
+                <w:sz w:val="22"/>
+              </w:rPr>
+              <w:t>PASTE YOUR AWS CONSOLE SCREENSHOT HERE</w:t>
+              <w:br/>
+            </w:r>
+            <w:r>
+              <w:rPr>
+                <w:i/>
+                <w:color w:val="64748B"/>
+                <w:sz w:val="19"/>
+              </w:rPr>
+              <w:t>Take a screenshot of the AWS S3 Console showing bucket 'roadsense-hazards-464817648755-us-east-1' and its objects and paste here.</w:t>
+            </w:r>
+            <w:r>
+              <w:rPr>
+                <w:rFonts w:ascii="Consolas" w:hAnsi="Consolas"/>
+                <w:color w:val="94A3B8"/>
+                <w:sz w:val="17"/>
+              </w:rPr>
+              <w:t>└────────────────────────────────────────────────────────────────────────────────────────┘</w:t>
+            </w:r>
+          </w:p>
+        </w:tc>
+      </w:tr>
+    </w:tbl>
+    <w:p/>
+    <w:tbl>
+      <w:tblPr>
+        <w:tblW w:type="auto" w:w="0"/>
+        <w:jc w:val="center"/>
+        <w:tblLook w:firstColumn="1" w:firstRow="1" w:lastColumn="0" w:lastRow="0" w:noHBand="0" w:noVBand="1" w:val="04A0"/>
+      </w:tblPr>
+      <w:tblGrid>
+        <w:gridCol w:w="9360"/>
+      </w:tblGrid>
+      <w:tr>
+        <w:tc>
+          <w:tcPr>
+            <w:tcW w:type="dxa" w:w="9360"/>
+            <w:shd w:fill="F8FAFC"/>
+            <w:tcMar>
+              <w:top w:w="180" w:type="dxa"/>
+              <w:bottom w:w="180" w:type="dxa"/>
+              <w:left w:w="240" w:type="dxa"/>
+              <w:right w:w="240" w:type="dxa"/>
+            </w:tcMar>
+            <w:tcBorders>
+              <w:left w:val="single" w:sz="24" w:space="0" w:color="2563EB"/>
+              <w:top w:val="dashed" w:sz="12" w:space="0" w:color="94A3B8"/>
+              <w:right w:val="dashed" w:sz="12" w:space="0" w:color="94A3B8"/>
+              <w:bottom w:val="dashed" w:sz="12" w:space="0" w:color="94A3B8"/>
+            </w:tcBorders>
+          </w:tcPr>
+          <w:p>
+            <w:pPr>
+              <w:spacing w:before="40" w:after="80"/>
+              <w:jc w:val="left"/>
+            </w:pPr>
+            <w:r>
+              <w:rPr>
+                <w:rFonts w:ascii="Calibri" w:hAnsi="Calibri"/>
+                <w:b/>
+                <w:color w:val="2563EB"/>
+                <w:sz w:val="22"/>
+              </w:rPr>
+              <w:t>📷 EVIDENCE SCREENSHOT PLACEHOLDER: AMAZON SQS ASYNCHRONOUS INGESTION QUEUE</w:t>
+              <w:br/>
+            </w:r>
+          </w:p>
+          <w:p>
+            <w:pPr>
+              <w:spacing w:before="40" w:after="40"/>
+              <w:jc w:val="left"/>
+            </w:pPr>
+            <w:r>
+              <w:rPr>
+                <w:b/>
+                <w:sz w:val="19"/>
+              </w:rPr>
+              <w:t xml:space="preserve">Target Resource Identifier / ARN: </w:t>
+            </w:r>
+            <w:r>
+              <w:rPr>
+                <w:rFonts w:ascii="Consolas" w:hAnsi="Consolas"/>
+                <w:color w:val="475569"/>
+                <w:sz w:val="18"/>
+              </w:rPr>
+              <w:t>arn:aws:sqs:us-east-1:464817648755:roadsense-prod-hazard-processing-queue</w:t>
+              <w:br/>
+            </w:r>
+            <w:r>
+              <w:rPr>
+                <w:b/>
+                <w:sz w:val="18"/>
+              </w:rPr>
+              <w:t xml:space="preserve">• Queue Name: </w:t>
+            </w:r>
+            <w:r>
+              <w:rPr>
+                <w:color w:val="475569"/>
+                <w:sz w:val="18"/>
+              </w:rPr>
+              <w:t>roadsense-prod-hazard-processing-queue</w:t>
+              <w:br/>
+            </w:r>
+            <w:r>
+              <w:rPr>
+                <w:b/>
+                <w:sz w:val="18"/>
+              </w:rPr>
+              <w:t xml:space="preserve">• Queue URL: </w:t>
+            </w:r>
+            <w:r>
+              <w:rPr>
+                <w:color w:val="475569"/>
+                <w:sz w:val="18"/>
+              </w:rPr>
+              <w:t>https://sqs.us-east-1.amazonaws.com/464817648755/roadsense-prod-hazard-processing-queue</w:t>
+              <w:br/>
+            </w:r>
+            <w:r>
+              <w:rPr>
+                <w:b/>
+                <w:sz w:val="18"/>
+              </w:rPr>
+              <w:t xml:space="preserve">• Queue Architecture: </w:t>
+            </w:r>
+            <w:r>
+              <w:rPr>
+                <w:color w:val="475569"/>
+                <w:sz w:val="18"/>
+              </w:rPr>
+              <w:t>Standard Queue (Unbounded TPS, High Throughput)</w:t>
+              <w:br/>
+            </w:r>
+            <w:r>
+              <w:rPr>
+                <w:b/>
+                <w:sz w:val="18"/>
+              </w:rPr>
+              <w:t xml:space="preserve">• Dead-Letter Queue (DLQ): </w:t>
+            </w:r>
+            <w:r>
+              <w:rPr>
+                <w:color w:val="475569"/>
+                <w:sz w:val="18"/>
+              </w:rPr>
+              <w:t>roadsense-prod-hazard-dlq (MaxReceiveCount = 3)</w:t>
+              <w:br/>
+            </w:r>
+            <w:r>
+              <w:rPr>
+                <w:b/>
+                <w:sz w:val="18"/>
+              </w:rPr>
+              <w:t xml:space="preserve">• Visibility Timeout: </w:t>
+            </w:r>
+            <w:r>
+              <w:rPr>
+                <w:color w:val="475569"/>
+                <w:sz w:val="18"/>
+              </w:rPr>
+              <w:t>60 Seconds (Permits Lambda execution without race conditions)</w:t>
+              <w:br/>
+            </w:r>
+            <w:r>
+              <w:rPr>
+                <w:b/>
+                <w:sz w:val="18"/>
+              </w:rPr>
+              <w:t xml:space="preserve">• Message Retention Period: </w:t>
+            </w:r>
+            <w:r>
+              <w:rPr>
+                <w:color w:val="475569"/>
+                <w:sz w:val="18"/>
+              </w:rPr>
+              <w:t>4 Days (345,600 Seconds)</w:t>
+              <w:br/>
+            </w:r>
+          </w:p>
+          <w:p>
+            <w:pPr>
+              <w:spacing w:before="280" w:after="200"/>
+              <w:jc w:val="center"/>
+            </w:pPr>
+            <w:r>
+              <w:rPr>
+                <w:rFonts w:ascii="Consolas" w:hAnsi="Consolas"/>
+                <w:color w:val="94A3B8"/>
+                <w:sz w:val="17"/>
+              </w:rPr>
+              <w:t>┌────────────────────────────────────────────────────────────────────────────────────────┐</w:t>
+              <w:br/>
+            </w:r>
+            <w:r>
+              <w:rPr>
+                <w:rFonts w:ascii="Calibri" w:hAnsi="Calibri"/>
+                <w:b/>
+                <w:color w:val="475569"/>
+                <w:sz w:val="22"/>
+              </w:rPr>
+              <w:t>PASTE YOUR AWS CONSOLE SCREENSHOT HERE</w:t>
+              <w:br/>
+            </w:r>
+            <w:r>
+              <w:rPr>
+                <w:i/>
+                <w:color w:val="64748B"/>
+                <w:sz w:val="19"/>
+              </w:rPr>
+              <w:t>Take a screenshot of the Amazon SQS Console displaying 'roadsense-prod-hazard-processing-queue' details and paste here.</w:t>
+            </w:r>
+            <w:r>
+              <w:rPr>
+                <w:rFonts w:ascii="Consolas" w:hAnsi="Consolas"/>
+                <w:color w:val="94A3B8"/>
+                <w:sz w:val="17"/>
+              </w:rPr>
+              <w:t>└────────────────────────────────────────────────────────────────────────────────────────┘</w:t>
+            </w:r>
+          </w:p>
+        </w:tc>
+      </w:tr>
+    </w:tbl>
+    <w:p/>
+    <w:tbl>
+      <w:tblPr>
+        <w:tblW w:type="auto" w:w="0"/>
+        <w:jc w:val="center"/>
+        <w:tblLook w:firstColumn="1" w:firstRow="1" w:lastColumn="0" w:lastRow="0" w:noHBand="0" w:noVBand="1" w:val="04A0"/>
+      </w:tblPr>
+      <w:tblGrid>
+        <w:gridCol w:w="9360"/>
+      </w:tblGrid>
+      <w:tr>
+        <w:tc>
+          <w:tcPr>
+            <w:tcW w:type="dxa" w:w="9360"/>
+            <w:shd w:fill="F8FAFC"/>
+            <w:tcMar>
+              <w:top w:w="180" w:type="dxa"/>
+              <w:bottom w:w="180" w:type="dxa"/>
+              <w:left w:w="240" w:type="dxa"/>
+              <w:right w:w="240" w:type="dxa"/>
+            </w:tcMar>
+            <w:tcBorders>
+              <w:left w:val="single" w:sz="24" w:space="0" w:color="2563EB"/>
+              <w:top w:val="dashed" w:sz="12" w:space="0" w:color="94A3B8"/>
+              <w:right w:val="dashed" w:sz="12" w:space="0" w:color="94A3B8"/>
+              <w:bottom w:val="dashed" w:sz="12" w:space="0" w:color="94A3B8"/>
+            </w:tcBorders>
+          </w:tcPr>
+          <w:p>
+            <w:pPr>
+              <w:spacing w:before="40" w:after="80"/>
+              <w:jc w:val="left"/>
+            </w:pPr>
+            <w:r>
+              <w:rPr>
+                <w:rFonts w:ascii="Calibri" w:hAnsi="Calibri"/>
+                <w:b/>
+                <w:color w:val="2563EB"/>
+                <w:sz w:val="22"/>
+              </w:rPr>
+              <w:t>📷 EVIDENCE SCREENSHOT PLACEHOLDER: AMAZON SNS EMERGENCY NOTIFICATION TOPIC</w:t>
+              <w:br/>
+            </w:r>
+          </w:p>
+          <w:p>
+            <w:pPr>
+              <w:spacing w:before="40" w:after="40"/>
+              <w:jc w:val="left"/>
+            </w:pPr>
+            <w:r>
+              <w:rPr>
+                <w:b/>
+                <w:sz w:val="19"/>
+              </w:rPr>
+              <w:t xml:space="preserve">Target Resource Identifier / ARN: </w:t>
+            </w:r>
+            <w:r>
+              <w:rPr>
+                <w:rFonts w:ascii="Consolas" w:hAnsi="Consolas"/>
+                <w:color w:val="475569"/>
+                <w:sz w:val="18"/>
+              </w:rPr>
+              <w:t>arn:aws:sns:us-east-1:464817648755:roadsense-prod-critical-alerts</w:t>
+              <w:br/>
+            </w:r>
+            <w:r>
+              <w:rPr>
+                <w:b/>
+                <w:sz w:val="18"/>
+              </w:rPr>
+              <w:t xml:space="preserve">• Topic Name: </w:t>
+            </w:r>
+            <w:r>
+              <w:rPr>
+                <w:color w:val="475569"/>
+                <w:sz w:val="18"/>
+              </w:rPr>
+              <w:t>roadsense-prod-critical-alerts</w:t>
+              <w:br/>
+            </w:r>
+            <w:r>
+              <w:rPr>
+                <w:b/>
+                <w:sz w:val="18"/>
+              </w:rPr>
+              <w:t xml:space="preserve">• Display Name: </w:t>
+            </w:r>
+            <w:r>
+              <w:rPr>
+                <w:color w:val="475569"/>
+                <w:sz w:val="18"/>
+              </w:rPr>
+              <w:t>RoadSense Civic Critical Alert System</w:t>
+              <w:br/>
+            </w:r>
+            <w:r>
+              <w:rPr>
+                <w:b/>
+                <w:sz w:val="18"/>
+              </w:rPr>
+              <w:t xml:space="preserve">• Protocol Subscriptions: </w:t>
+            </w:r>
+            <w:r>
+              <w:rPr>
+                <w:color w:val="475569"/>
+                <w:sz w:val="18"/>
+              </w:rPr>
+              <w:t>SMS (Emergency Road Squads), Email (Zone Commissioners)</w:t>
+              <w:br/>
+            </w:r>
+            <w:r>
+              <w:rPr>
+                <w:b/>
+                <w:sz w:val="18"/>
+              </w:rPr>
+              <w:t xml:space="preserve">• Trigger Condition: </w:t>
+            </w:r>
+            <w:r>
+              <w:rPr>
+                <w:color w:val="475569"/>
+                <w:sz w:val="18"/>
+              </w:rPr>
+              <w:t>Severity = 'CRITICAL' (Deep Potholes, Road Flooding)</w:t>
+              <w:br/>
+            </w:r>
+            <w:r>
+              <w:rPr>
+                <w:b/>
+                <w:sz w:val="18"/>
+              </w:rPr>
+              <w:t xml:space="preserve">• Delivery Status Logging: </w:t>
+            </w:r>
+            <w:r>
+              <w:rPr>
+                <w:color w:val="475569"/>
+                <w:sz w:val="18"/>
+              </w:rPr>
+              <w:t>Enabled with Amazon CloudWatch Logs integration</w:t>
+              <w:br/>
+            </w:r>
+          </w:p>
+          <w:p>
+            <w:pPr>
+              <w:spacing w:before="280" w:after="200"/>
+              <w:jc w:val="center"/>
+            </w:pPr>
+            <w:r>
+              <w:rPr>
+                <w:rFonts w:ascii="Consolas" w:hAnsi="Consolas"/>
+                <w:color w:val="94A3B8"/>
+                <w:sz w:val="17"/>
+              </w:rPr>
+              <w:t>┌────────────────────────────────────────────────────────────────────────────────────────┐</w:t>
+              <w:br/>
+            </w:r>
+            <w:r>
+              <w:rPr>
+                <w:rFonts w:ascii="Calibri" w:hAnsi="Calibri"/>
+                <w:b/>
+                <w:color w:val="475569"/>
+                <w:sz w:val="22"/>
+              </w:rPr>
+              <w:t>PASTE YOUR AWS CONSOLE SCREENSHOT HERE</w:t>
+              <w:br/>
+            </w:r>
+            <w:r>
+              <w:rPr>
+                <w:i/>
+                <w:color w:val="64748B"/>
+                <w:sz w:val="19"/>
+              </w:rPr>
+              <w:t>Take a screenshot of the Amazon SNS Console showing topic 'roadsense-prod-critical-alerts' and confirmed subscriptions and paste here.</w:t>
+            </w:r>
+            <w:r>
+              <w:rPr>
+                <w:rFonts w:ascii="Consolas" w:hAnsi="Consolas"/>
+                <w:color w:val="94A3B8"/>
+                <w:sz w:val="17"/>
+              </w:rPr>
+              <w:t>└────────────────────────────────────────────────────────────────────────────────────────┘</w:t>
+            </w:r>
+          </w:p>
+        </w:tc>
+      </w:tr>
+    </w:tbl>
+    <w:p/>
+    <w:tbl>
+      <w:tblPr>
+        <w:tblW w:type="auto" w:w="0"/>
+        <w:jc w:val="center"/>
+        <w:tblLook w:firstColumn="1" w:firstRow="1" w:lastColumn="0" w:lastRow="0" w:noHBand="0" w:noVBand="1" w:val="04A0"/>
+      </w:tblPr>
+      <w:tblGrid>
+        <w:gridCol w:w="9360"/>
+      </w:tblGrid>
+      <w:tr>
+        <w:tc>
+          <w:tcPr>
+            <w:tcW w:type="dxa" w:w="9360"/>
+            <w:shd w:fill="F8FAFC"/>
+            <w:tcMar>
+              <w:top w:w="180" w:type="dxa"/>
+              <w:bottom w:w="180" w:type="dxa"/>
+              <w:left w:w="240" w:type="dxa"/>
+              <w:right w:w="240" w:type="dxa"/>
+            </w:tcMar>
+            <w:tcBorders>
+              <w:left w:val="single" w:sz="24" w:space="0" w:color="2563EB"/>
+              <w:top w:val="dashed" w:sz="12" w:space="0" w:color="94A3B8"/>
+              <w:right w:val="dashed" w:sz="12" w:space="0" w:color="94A3B8"/>
+              <w:bottom w:val="dashed" w:sz="12" w:space="0" w:color="94A3B8"/>
+            </w:tcBorders>
+          </w:tcPr>
+          <w:p>
+            <w:pPr>
+              <w:spacing w:before="40" w:after="80"/>
+              <w:jc w:val="left"/>
+            </w:pPr>
+            <w:r>
+              <w:rPr>
+                <w:rFonts w:ascii="Calibri" w:hAnsi="Calibri"/>
+                <w:b/>
+                <w:color w:val="2563EB"/>
+                <w:sz w:val="22"/>
+              </w:rPr>
+              <w:t>📷 EVIDENCE SCREENSHOT PLACEHOLDER: AWS LAMBDA SERVERLESS HAZARD TRIAGE WORKER</w:t>
+              <w:br/>
+            </w:r>
+          </w:p>
+          <w:p>
+            <w:pPr>
+              <w:spacing w:before="40" w:after="40"/>
+              <w:jc w:val="left"/>
+            </w:pPr>
+            <w:r>
+              <w:rPr>
+                <w:b/>
+                <w:sz w:val="19"/>
+              </w:rPr>
+              <w:t xml:space="preserve">Target Resource Identifier / ARN: </w:t>
+            </w:r>
+            <w:r>
+              <w:rPr>
+                <w:rFonts w:ascii="Consolas" w:hAnsi="Consolas"/>
+                <w:color w:val="475569"/>
+                <w:sz w:val="18"/>
+              </w:rPr>
+              <w:t>arn:aws:lambda:us-east-1:464817648755:function:RoadSenseHazardWorker</w:t>
+              <w:br/>
+            </w:r>
+            <w:r>
+              <w:rPr>
+                <w:b/>
+                <w:sz w:val="18"/>
+              </w:rPr>
+              <w:t xml:space="preserve">• Function Name: </w:t>
+            </w:r>
+            <w:r>
+              <w:rPr>
+                <w:color w:val="475569"/>
+                <w:sz w:val="18"/>
+              </w:rPr>
+              <w:t>RoadSenseHazardWorker</w:t>
+              <w:br/>
+            </w:r>
+            <w:r>
+              <w:rPr>
+                <w:b/>
+                <w:sz w:val="18"/>
+              </w:rPr>
+              <w:t xml:space="preserve">• Runtime: </w:t>
+            </w:r>
+            <w:r>
+              <w:rPr>
+                <w:color w:val="475569"/>
+                <w:sz w:val="18"/>
+              </w:rPr>
+              <w:t>Python 3.11 / Boto3 SDK</w:t>
+              <w:br/>
+            </w:r>
+            <w:r>
+              <w:rPr>
+                <w:b/>
+                <w:sz w:val="18"/>
+              </w:rPr>
+              <w:t xml:space="preserve">• Handler: </w:t>
+            </w:r>
+            <w:r>
+              <w:rPr>
+                <w:color w:val="475569"/>
+                <w:sz w:val="18"/>
+              </w:rPr>
+              <w:t>aws_lambda_worker.lambda_handler</w:t>
+              <w:br/>
+            </w:r>
+            <w:r>
+              <w:rPr>
+                <w:b/>
+                <w:sz w:val="18"/>
+              </w:rPr>
+              <w:t xml:space="preserve">• Trigger Event Source: </w:t>
+            </w:r>
+            <w:r>
+              <w:rPr>
+                <w:color w:val="475569"/>
+                <w:sz w:val="18"/>
+              </w:rPr>
+              <w:t>Amazon SQS (BatchSize = 10, BatchingWindow = 5s)</w:t>
+              <w:br/>
+            </w:r>
+            <w:r>
+              <w:rPr>
+                <w:b/>
+                <w:sz w:val="18"/>
+              </w:rPr>
+              <w:t xml:space="preserve">• Partial Failure Handling: </w:t>
+            </w:r>
+            <w:r>
+              <w:rPr>
+                <w:color w:val="475569"/>
+                <w:sz w:val="18"/>
+              </w:rPr>
+              <w:t>ReportBatchItemFailures protocol enabled</w:t>
+              <w:br/>
+            </w:r>
+            <w:r>
+              <w:rPr>
+                <w:b/>
+                <w:sz w:val="18"/>
+              </w:rPr>
+              <w:t xml:space="preserve">• Execution Role: </w:t>
+            </w:r>
+            <w:r>
+              <w:rPr>
+                <w:color w:val="475569"/>
+                <w:sz w:val="18"/>
+              </w:rPr>
+              <w:t>arn:aws:iam::464817648755:role/RoadSenseLambdaWorkerRole</w:t>
+              <w:br/>
+            </w:r>
+          </w:p>
+          <w:p>
+            <w:pPr>
+              <w:spacing w:before="280" w:after="200"/>
+              <w:jc w:val="center"/>
+            </w:pPr>
+            <w:r>
+              <w:rPr>
+                <w:rFonts w:ascii="Consolas" w:hAnsi="Consolas"/>
+                <w:color w:val="94A3B8"/>
+                <w:sz w:val="17"/>
+              </w:rPr>
+              <w:t>┌────────────────────────────────────────────────────────────────────────────────────────┐</w:t>
+              <w:br/>
+            </w:r>
+            <w:r>
+              <w:rPr>
+                <w:rFonts w:ascii="Calibri" w:hAnsi="Calibri"/>
+                <w:b/>
+                <w:color w:val="475569"/>
+                <w:sz w:val="22"/>
+              </w:rPr>
+              <w:t>PASTE YOUR AWS CONSOLE SCREENSHOT HERE</w:t>
+              <w:br/>
+            </w:r>
+            <w:r>
+              <w:rPr>
+                <w:i/>
+                <w:color w:val="64748B"/>
+                <w:sz w:val="19"/>
+              </w:rPr>
+              <w:t>Take a screenshot of the AWS Lambda Console showing function 'RoadSenseHazardWorker' and its SQS trigger and paste here.</w:t>
+            </w:r>
+            <w:r>
+              <w:rPr>
+                <w:rFonts w:ascii="Consolas" w:hAnsi="Consolas"/>
+                <w:color w:val="94A3B8"/>
+                <w:sz w:val="17"/>
+              </w:rPr>
+              <w:t>└────────────────────────────────────────────────────────────────────────────────────────┘</w:t>
+            </w:r>
+          </w:p>
+        </w:tc>
+      </w:tr>
+    </w:tbl>
+    <w:p/>
+    <w:tbl>
+      <w:tblPr>
+        <w:tblW w:type="auto" w:w="0"/>
+        <w:jc w:val="center"/>
+        <w:tblLook w:firstColumn="1" w:firstRow="1" w:lastColumn="0" w:lastRow="0" w:noHBand="0" w:noVBand="1" w:val="04A0"/>
+      </w:tblPr>
+      <w:tblGrid>
+        <w:gridCol w:w="9360"/>
+      </w:tblGrid>
+      <w:tr>
+        <w:tc>
+          <w:tcPr>
+            <w:tcW w:type="dxa" w:w="9360"/>
+            <w:shd w:fill="F8FAFC"/>
+            <w:tcMar>
+              <w:top w:w="180" w:type="dxa"/>
+              <w:bottom w:w="180" w:type="dxa"/>
+              <w:left w:w="240" w:type="dxa"/>
+              <w:right w:w="240" w:type="dxa"/>
+            </w:tcMar>
+            <w:tcBorders>
+              <w:left w:val="single" w:sz="24" w:space="0" w:color="2563EB"/>
+              <w:top w:val="dashed" w:sz="12" w:space="0" w:color="94A3B8"/>
+              <w:right w:val="dashed" w:sz="12" w:space="0" w:color="94A3B8"/>
+              <w:bottom w:val="dashed" w:sz="12" w:space="0" w:color="94A3B8"/>
+            </w:tcBorders>
+          </w:tcPr>
+          <w:p>
+            <w:pPr>
+              <w:spacing w:before="40" w:after="80"/>
+              <w:jc w:val="left"/>
+            </w:pPr>
+            <w:r>
+              <w:rPr>
+                <w:rFonts w:ascii="Calibri" w:hAnsi="Calibri"/>
+                <w:b/>
+                <w:color w:val="2563EB"/>
+                <w:sz w:val="22"/>
+              </w:rPr>
+              <w:t>📷 EVIDENCE SCREENSHOT PLACEHOLDER: AWS SYSTEMS MANAGER (SSM) PARAMETER STORE</w:t>
+              <w:br/>
+            </w:r>
+          </w:p>
+          <w:p>
+            <w:pPr>
+              <w:spacing w:before="40" w:after="40"/>
+              <w:jc w:val="left"/>
+            </w:pPr>
+            <w:r>
+              <w:rPr>
+                <w:b/>
+                <w:sz w:val="19"/>
+              </w:rPr>
+              <w:t xml:space="preserve">Target Resource Identifier / ARN: </w:t>
+            </w:r>
+            <w:r>
+              <w:rPr>
+                <w:rFonts w:ascii="Consolas" w:hAnsi="Consolas"/>
+                <w:color w:val="475569"/>
+                <w:sz w:val="18"/>
+              </w:rPr>
+              <w:t>arn:aws:ssm:us-east-1:464817648755:parameter/roadsense/prod/*</w:t>
+              <w:br/>
+            </w:r>
+            <w:r>
+              <w:rPr>
+                <w:b/>
+                <w:sz w:val="18"/>
+              </w:rPr>
+              <w:t xml:space="preserve">• Parameter Scope: </w:t>
+            </w:r>
+            <w:r>
+              <w:rPr>
+                <w:color w:val="475569"/>
+                <w:sz w:val="18"/>
+              </w:rPr>
+              <w:t>/roadsense/prod/*</w:t>
+              <w:br/>
+            </w:r>
+            <w:r>
+              <w:rPr>
+                <w:b/>
+                <w:sz w:val="18"/>
+              </w:rPr>
+              <w:t xml:space="preserve">• Managed Parameters: </w:t>
+            </w:r>
+            <w:r>
+              <w:rPr>
+                <w:color w:val="475569"/>
+                <w:sz w:val="18"/>
+              </w:rPr>
+              <w:t>/roadsense/db_host, /roadsense/db_user, /roadsense/db_password, /roadsense/s3_bucket, /roadsense/sns_topic_arn, /roadsense/sqs_queue_url</w:t>
+              <w:br/>
+            </w:r>
+            <w:r>
+              <w:rPr>
+                <w:b/>
+                <w:sz w:val="18"/>
+              </w:rPr>
+              <w:t xml:space="preserve">• Security Level: </w:t>
+            </w:r>
+            <w:r>
+              <w:rPr>
+                <w:color w:val="475569"/>
+                <w:sz w:val="18"/>
+              </w:rPr>
+              <w:t>SecureString with AWS KMS (alias/aws/ssm)</w:t>
+              <w:br/>
+            </w:r>
+            <w:r>
+              <w:rPr>
+                <w:b/>
+                <w:sz w:val="18"/>
+              </w:rPr>
+              <w:t xml:space="preserve">• Architecture Benefit: </w:t>
+            </w:r>
+            <w:r>
+              <w:rPr>
+                <w:color w:val="475569"/>
+                <w:sz w:val="18"/>
+              </w:rPr>
+              <w:t>Zero plain-text credentials stored in source code or environment files</w:t>
+              <w:br/>
+            </w:r>
+          </w:p>
+          <w:p>
+            <w:pPr>
+              <w:spacing w:before="280" w:after="200"/>
+              <w:jc w:val="center"/>
+            </w:pPr>
+            <w:r>
+              <w:rPr>
+                <w:rFonts w:ascii="Consolas" w:hAnsi="Consolas"/>
+                <w:color w:val="94A3B8"/>
+                <w:sz w:val="17"/>
+              </w:rPr>
+              <w:t>┌────────────────────────────────────────────────────────────────────────────────────────┐</w:t>
+              <w:br/>
+            </w:r>
+            <w:r>
+              <w:rPr>
+                <w:rFonts w:ascii="Calibri" w:hAnsi="Calibri"/>
+                <w:b/>
+                <w:color w:val="475569"/>
+                <w:sz w:val="22"/>
+              </w:rPr>
+              <w:t>PASTE YOUR AWS CONSOLE SCREENSHOT HERE</w:t>
+              <w:br/>
+            </w:r>
+            <w:r>
+              <w:rPr>
+                <w:i/>
+                <w:color w:val="64748B"/>
+                <w:sz w:val="19"/>
+              </w:rPr>
+              <w:t>Take a screenshot of the AWS Systems Manager Parameter Store console showing the /roadsense/* parameters and paste here.</w:t>
+            </w:r>
+            <w:r>
+              <w:rPr>
+                <w:rFonts w:ascii="Consolas" w:hAnsi="Consolas"/>
+                <w:color w:val="94A3B8"/>
+                <w:sz w:val="17"/>
+              </w:rPr>
+              <w:t>└────────────────────────────────────────────────────────────────────────────────────────┘</w:t>
+            </w:r>
+          </w:p>
+        </w:tc>
+      </w:tr>
+    </w:tbl>
+    <w:p/>
+    <w:tbl>
+      <w:tblPr>
+        <w:tblW w:type="auto" w:w="0"/>
+        <w:jc w:val="center"/>
+        <w:tblLook w:firstColumn="1" w:firstRow="1" w:lastColumn="0" w:lastRow="0" w:noHBand="0" w:noVBand="1" w:val="04A0"/>
+      </w:tblPr>
+      <w:tblGrid>
+        <w:gridCol w:w="9360"/>
+      </w:tblGrid>
+      <w:tr>
+        <w:tc>
+          <w:tcPr>
+            <w:tcW w:type="dxa" w:w="9360"/>
+            <w:shd w:fill="F8FAFC"/>
+            <w:tcMar>
+              <w:top w:w="180" w:type="dxa"/>
+              <w:bottom w:w="180" w:type="dxa"/>
+              <w:left w:w="240" w:type="dxa"/>
+              <w:right w:w="240" w:type="dxa"/>
+            </w:tcMar>
+            <w:tcBorders>
+              <w:left w:val="single" w:sz="24" w:space="0" w:color="2563EB"/>
+              <w:top w:val="dashed" w:sz="12" w:space="0" w:color="94A3B8"/>
+              <w:right w:val="dashed" w:sz="12" w:space="0" w:color="94A3B8"/>
+              <w:bottom w:val="dashed" w:sz="12" w:space="0" w:color="94A3B8"/>
+            </w:tcBorders>
+          </w:tcPr>
+          <w:p>
+            <w:pPr>
+              <w:spacing w:before="40" w:after="80"/>
+              <w:jc w:val="left"/>
+            </w:pPr>
+            <w:r>
+              <w:rPr>
+                <w:rFonts w:ascii="Calibri" w:hAnsi="Calibri"/>
+                <w:b/>
+                <w:color w:val="2563EB"/>
+                <w:sz w:val="22"/>
+              </w:rPr>
+              <w:t>📷 EVIDENCE SCREENSHOT PLACEHOLDER: AMAZON RDS MANAGED RELATIONAL DATABASE (POSTGRESQL 16)</w:t>
+              <w:br/>
+            </w:r>
+          </w:p>
+          <w:p>
+            <w:pPr>
+              <w:spacing w:before="40" w:after="40"/>
+              <w:jc w:val="left"/>
+            </w:pPr>
+            <w:r>
+              <w:rPr>
+                <w:b/>
+                <w:sz w:val="19"/>
+              </w:rPr>
+              <w:t xml:space="preserve">Target Resource Identifier / ARN: </w:t>
+            </w:r>
+            <w:r>
+              <w:rPr>
+                <w:rFonts w:ascii="Consolas" w:hAnsi="Consolas"/>
+                <w:color w:val="475569"/>
+                <w:sz w:val="18"/>
+              </w:rPr>
+              <w:t>arn:aws:rds:us-east-1:464817648755:db:roadsense-db</w:t>
+              <w:br/>
+            </w:r>
+            <w:r>
+              <w:rPr>
+                <w:b/>
+                <w:sz w:val="18"/>
+              </w:rPr>
+              <w:t xml:space="preserve">• DB Instance Identifier: </w:t>
+            </w:r>
+            <w:r>
+              <w:rPr>
+                <w:color w:val="475569"/>
+                <w:sz w:val="18"/>
+              </w:rPr>
+              <w:t>roadsense-db</w:t>
+              <w:br/>
+            </w:r>
+            <w:r>
+              <w:rPr>
+                <w:b/>
+                <w:sz w:val="18"/>
+              </w:rPr>
+              <w:t xml:space="preserve">• Database Engine: </w:t>
+            </w:r>
+            <w:r>
+              <w:rPr>
+                <w:color w:val="475569"/>
+                <w:sz w:val="18"/>
+              </w:rPr>
+              <w:t>PostgreSQL 16.3 with PostGIS Spatial Extensions</w:t>
+              <w:br/>
+            </w:r>
+            <w:r>
+              <w:rPr>
+                <w:b/>
+                <w:sz w:val="18"/>
+              </w:rPr>
+              <w:t xml:space="preserve">• Instance Class: </w:t>
+            </w:r>
+            <w:r>
+              <w:rPr>
+                <w:color w:val="475569"/>
+                <w:sz w:val="18"/>
+              </w:rPr>
+              <w:t>db.t3.micro (Multi-AZ Deployment)</w:t>
+              <w:br/>
+            </w:r>
+            <w:r>
+              <w:rPr>
+                <w:b/>
+                <w:sz w:val="18"/>
+              </w:rPr>
+              <w:t xml:space="preserve">• Storage Allocated: </w:t>
+            </w:r>
+            <w:r>
+              <w:rPr>
+                <w:color w:val="475569"/>
+                <w:sz w:val="18"/>
+              </w:rPr>
+              <w:t>20 GiB General Purpose SSD (gp3)</w:t>
+              <w:br/>
+            </w:r>
+            <w:r>
+              <w:rPr>
+                <w:b/>
+                <w:sz w:val="18"/>
+              </w:rPr>
+              <w:t xml:space="preserve">• Security Group: </w:t>
+            </w:r>
+            <w:r>
+              <w:rPr>
+                <w:color w:val="475569"/>
+                <w:sz w:val="18"/>
+              </w:rPr>
+              <w:t>Inbound TCP 5432 restricted to EC2 Security Group (roadsense-sg)</w:t>
+              <w:br/>
+            </w:r>
+            <w:r>
+              <w:rPr>
+                <w:b/>
+                <w:sz w:val="18"/>
+              </w:rPr>
+              <w:t xml:space="preserve">• Automated Backups: </w:t>
+            </w:r>
+            <w:r>
+              <w:rPr>
+                <w:color w:val="475569"/>
+                <w:sz w:val="18"/>
+              </w:rPr>
+              <w:t>7-day retention with Point-In-Time Recovery (PITR)</w:t>
+              <w:br/>
+            </w:r>
+          </w:p>
+          <w:p>
+            <w:pPr>
+              <w:spacing w:before="280" w:after="200"/>
+              <w:jc w:val="center"/>
+            </w:pPr>
+            <w:r>
+              <w:rPr>
+                <w:rFonts w:ascii="Consolas" w:hAnsi="Consolas"/>
+                <w:color w:val="94A3B8"/>
+                <w:sz w:val="17"/>
+              </w:rPr>
+              <w:t>┌────────────────────────────────────────────────────────────────────────────────────────┐</w:t>
+              <w:br/>
+            </w:r>
+            <w:r>
+              <w:rPr>
+                <w:rFonts w:ascii="Calibri" w:hAnsi="Calibri"/>
+                <w:b/>
+                <w:color w:val="475569"/>
+                <w:sz w:val="22"/>
+              </w:rPr>
+              <w:t>PASTE YOUR AWS CONSOLE SCREENSHOT HERE</w:t>
+              <w:br/>
+            </w:r>
+            <w:r>
+              <w:rPr>
+                <w:i/>
+                <w:color w:val="64748B"/>
+                <w:sz w:val="19"/>
+              </w:rPr>
+              <w:t>Take a screenshot of the Amazon RDS Console showing 'roadsense-db' in 'Available' state with connectivity details and paste here.</w:t>
+            </w:r>
+            <w:r>
+              <w:rPr>
+                <w:rFonts w:ascii="Consolas" w:hAnsi="Consolas"/>
+                <w:color w:val="94A3B8"/>
+                <w:sz w:val="17"/>
+              </w:rPr>
+              <w:t>└────────────────────────────────────────────────────────────────────────────────────────┘</w:t>
+            </w:r>
+          </w:p>
+        </w:tc>
+      </w:tr>
+    </w:tbl>
+    <w:p/>
+    <w:tbl>
+      <w:tblPr>
+        <w:tblW w:type="auto" w:w="0"/>
+        <w:jc w:val="center"/>
+        <w:tblLook w:firstColumn="1" w:firstRow="1" w:lastColumn="0" w:lastRow="0" w:noHBand="0" w:noVBand="1" w:val="04A0"/>
+      </w:tblPr>
+      <w:tblGrid>
+        <w:gridCol w:w="9360"/>
+      </w:tblGrid>
+      <w:tr>
+        <w:tc>
+          <w:tcPr>
+            <w:tcW w:type="dxa" w:w="9360"/>
+            <w:shd w:fill="F8FAFC"/>
+            <w:tcMar>
+              <w:top w:w="180" w:type="dxa"/>
+              <w:bottom w:w="180" w:type="dxa"/>
+              <w:left w:w="240" w:type="dxa"/>
+              <w:right w:w="240" w:type="dxa"/>
+            </w:tcMar>
+            <w:tcBorders>
+              <w:left w:val="single" w:sz="24" w:space="0" w:color="2563EB"/>
+              <w:top w:val="dashed" w:sz="12" w:space="0" w:color="94A3B8"/>
+              <w:right w:val="dashed" w:sz="12" w:space="0" w:color="94A3B8"/>
+              <w:bottom w:val="dashed" w:sz="12" w:space="0" w:color="94A3B8"/>
+            </w:tcBorders>
+          </w:tcPr>
+          <w:p>
+            <w:pPr>
+              <w:spacing w:before="40" w:after="80"/>
+              <w:jc w:val="left"/>
+            </w:pPr>
+            <w:r>
+              <w:rPr>
+                <w:rFonts w:ascii="Calibri" w:hAnsi="Calibri"/>
+                <w:b/>
+                <w:color w:val="2563EB"/>
+                <w:sz w:val="22"/>
+              </w:rPr>
+              <w:t>📷 EVIDENCE SCREENSHOT PLACEHOLDER: AWS CLOUDWATCH PRODUCTION OPERATIONS DASHBOARD</w:t>
+              <w:br/>
+            </w:r>
+          </w:p>
+          <w:p>
+            <w:pPr>
+              <w:spacing w:before="40" w:after="40"/>
+              <w:jc w:val="left"/>
+            </w:pPr>
+            <w:r>
+              <w:rPr>
+                <w:b/>
+                <w:sz w:val="19"/>
+              </w:rPr>
+              <w:t xml:space="preserve">Target Resource Identifier / ARN: </w:t>
+            </w:r>
+            <w:r>
+              <w:rPr>
+                <w:rFonts w:ascii="Consolas" w:hAnsi="Consolas"/>
+                <w:color w:val="475569"/>
+                <w:sz w:val="18"/>
+              </w:rPr>
+              <w:t>https://us-east-1.console.aws.amazon.com/cloudwatch/home?region=us-east-1#dashboards:name=RoadSense-Production-Dashboard</w:t>
+              <w:br/>
+            </w:r>
+            <w:r>
+              <w:rPr>
+                <w:b/>
+                <w:sz w:val="18"/>
+              </w:rPr>
+              <w:t xml:space="preserve">• Dashboard Name: </w:t>
+            </w:r>
+            <w:r>
+              <w:rPr>
+                <w:color w:val="475569"/>
+                <w:sz w:val="18"/>
+              </w:rPr>
+              <w:t>RoadSense-Production-Dashboard</w:t>
+              <w:br/>
+            </w:r>
+            <w:r>
+              <w:rPr>
+                <w:b/>
+                <w:sz w:val="18"/>
+              </w:rPr>
+              <w:t xml:space="preserve">• Monitored Widgets: </w:t>
+            </w:r>
+            <w:r>
+              <w:rPr>
+                <w:color w:val="475569"/>
+                <w:sz w:val="18"/>
+              </w:rPr>
+              <w:t>EC2 CPU Utilization (%), EC2 Network In/Out (Bytes), SQS Queue Depth &amp; Messages, SNS Critical Alerts Published</w:t>
+              <w:br/>
+            </w:r>
+            <w:r>
+              <w:rPr>
+                <w:b/>
+                <w:sz w:val="18"/>
+              </w:rPr>
+              <w:t xml:space="preserve">• Evaluation Period: </w:t>
+            </w:r>
+            <w:r>
+              <w:rPr>
+                <w:color w:val="475569"/>
+                <w:sz w:val="18"/>
+              </w:rPr>
+              <w:t>1-minute resolution (60 seconds)</w:t>
+              <w:br/>
+            </w:r>
+            <w:r>
+              <w:rPr>
+                <w:b/>
+                <w:sz w:val="18"/>
+              </w:rPr>
+              <w:t xml:space="preserve">• Alarm Integration: </w:t>
+            </w:r>
+            <w:r>
+              <w:rPr>
+                <w:color w:val="475569"/>
+                <w:sz w:val="18"/>
+              </w:rPr>
+              <w:t>roadsense-prod-high-cpu-alarm (Threshold: CPU &gt;= 75%)</w:t>
+              <w:br/>
+            </w:r>
+          </w:p>
+          <w:p>
+            <w:pPr>
+              <w:spacing w:before="280" w:after="200"/>
+              <w:jc w:val="center"/>
+            </w:pPr>
+            <w:r>
+              <w:rPr>
+                <w:rFonts w:ascii="Consolas" w:hAnsi="Consolas"/>
+                <w:color w:val="94A3B8"/>
+                <w:sz w:val="17"/>
+              </w:rPr>
+              <w:t>┌────────────────────────────────────────────────────────────────────────────────────────┐</w:t>
+              <w:br/>
+            </w:r>
+            <w:r>
+              <w:rPr>
+                <w:rFonts w:ascii="Calibri" w:hAnsi="Calibri"/>
+                <w:b/>
+                <w:color w:val="475569"/>
+                <w:sz w:val="22"/>
+              </w:rPr>
+              <w:t>PASTE YOUR AWS CONSOLE SCREENSHOT HERE</w:t>
+              <w:br/>
+            </w:r>
+            <w:r>
+              <w:rPr>
+                <w:i/>
+                <w:color w:val="64748B"/>
+                <w:sz w:val="19"/>
+              </w:rPr>
+              <w:t>Take a screenshot of the AWS CloudWatch Dashboard 'RoadSense-Production-Dashboard' showing metric charts and paste here.</w:t>
+            </w:r>
+            <w:r>
+              <w:rPr>
+                <w:rFonts w:ascii="Consolas" w:hAnsi="Consolas"/>
+                <w:color w:val="94A3B8"/>
+                <w:sz w:val="17"/>
+              </w:rPr>
+              <w:t>└────────────────────────────────────────────────────────────────────────────────────────┘</w:t>
             </w:r>
           </w:p>
         </w:tc>

</xml_diff>

<commit_message>
feat(ai): integrate Gemini Vision API hazard detection and enterprise 4K architecture diagrams
</commit_message>
<xml_diff>
--- a/RoadSense_Cloud_Architecture_Report.docx
+++ b/RoadSense_Cloud_Architecture_Report.docx
@@ -1456,7 +1456,7 @@
       <w:r>
         <w:drawing>
           <wp:inline xmlns:a="http://schemas.openxmlformats.org/drawingml/2006/main" xmlns:pic="http://schemas.openxmlformats.org/drawingml/2006/picture">
-            <wp:extent cx="5943600" cy="3083492"/>
+            <wp:extent cx="5943600" cy="3343275"/>
             <wp:docPr id="1" name="Picture 1"/>
             <wp:cNvGraphicFramePr>
               <a:graphicFrameLocks noChangeAspect="1"/>
@@ -1477,7 +1477,7 @@
                   <pic:spPr>
                     <a:xfrm>
                       <a:off x="0" y="0"/>
-                      <a:ext cx="5943600" cy="3083492"/>
+                      <a:ext cx="5943600" cy="3343275"/>
                     </a:xfrm>
                     <a:prstGeom prst="rect"/>
                   </pic:spPr>
@@ -1539,7 +1539,7 @@
       <w:r>
         <w:drawing>
           <wp:inline xmlns:a="http://schemas.openxmlformats.org/drawingml/2006/main" xmlns:pic="http://schemas.openxmlformats.org/drawingml/2006/picture">
-            <wp:extent cx="5943600" cy="3607279"/>
+            <wp:extent cx="5943600" cy="3343275"/>
             <wp:docPr id="2" name="Picture 2"/>
             <wp:cNvGraphicFramePr>
               <a:graphicFrameLocks noChangeAspect="1"/>
@@ -1560,7 +1560,7 @@
                   <pic:spPr>
                     <a:xfrm>
                       <a:off x="0" y="0"/>
-                      <a:ext cx="5943600" cy="3607279"/>
+                      <a:ext cx="5943600" cy="3343275"/>
                     </a:xfrm>
                     <a:prstGeom prst="rect"/>
                   </pic:spPr>
@@ -4373,7 +4373,7 @@
       <w:r>
         <w:drawing>
           <wp:inline xmlns:a="http://schemas.openxmlformats.org/drawingml/2006/main" xmlns:pic="http://schemas.openxmlformats.org/drawingml/2006/picture">
-            <wp:extent cx="5943600" cy="3343275"/>
+            <wp:extent cx="5943600" cy="3714750"/>
             <wp:docPr id="3" name="Picture 3"/>
             <wp:cNvGraphicFramePr>
               <a:graphicFrameLocks noChangeAspect="1"/>
@@ -4394,7 +4394,7 @@
                   <pic:spPr>
                     <a:xfrm>
                       <a:off x="0" y="0"/>
-                      <a:ext cx="5943600" cy="3343275"/>
+                      <a:ext cx="5943600" cy="3714750"/>
                     </a:xfrm>
                     <a:prstGeom prst="rect"/>
                   </pic:spPr>

</xml_diff>

<commit_message>
docs(report): update cloud architecture report with live Lambda worker, SQS trigger, and CloudFormation specs
</commit_message>
<xml_diff>
--- a/RoadSense_Cloud_Architecture_Report.docx
+++ b/RoadSense_Cloud_Architecture_Report.docx
@@ -725,7 +725,7 @@
                 <w:color w:val="1E293B"/>
                 <w:sz w:val="18"/>
               </w:rPr>
-              <w:t>roadsense-prod-hazard-processing-queue (Decoupled Buffering &amp; Throttling)</w:t>
+              <w:t>roadsense-prod-hazard-queue (Decoupled Buffering &amp; Throttling)</w:t>
             </w:r>
           </w:p>
         </w:tc>
@@ -887,7 +887,7 @@
                 <w:color w:val="1E293B"/>
                 <w:sz w:val="18"/>
               </w:rPr>
-              <w:t>RoadSenseHazardWorker (Python 3.11 Runtime, Event Source Mapping)</w:t>
+              <w:t>RoadSenseHazardWorker / roadsense-prod-hazard-worker (Python 3.11, SQS Trigger Mapping)</w:t>
             </w:r>
           </w:p>
         </w:tc>
@@ -915,6 +915,60 @@
                 <w:color w:val="1E293B"/>
                 <w:sz w:val="18"/>
               </w:rPr>
+              <w:t>Infrastructure as Code</w:t>
+            </w:r>
+          </w:p>
+        </w:tc>
+        <w:tc>
+          <w:tcPr>
+            <w:tcW w:type="dxa" w:w="5760"/>
+            <w:shd w:fill="F8FAFC"/>
+            <w:tcMar>
+              <w:top w:w="100" w:type="dxa"/>
+              <w:bottom w:w="100" w:type="dxa"/>
+              <w:left w:w="140" w:type="dxa"/>
+              <w:right w:w="140" w:type="dxa"/>
+            </w:tcMar>
+          </w:tcPr>
+          <w:p>
+            <w:pPr>
+              <w:spacing w:before="0" w:after="0"/>
+              <w:jc w:val="left"/>
+            </w:pPr>
+            <w:r>
+              <w:rPr>
+                <w:rFonts w:ascii="Calibri" w:hAnsi="Calibri"/>
+                <w:color w:val="1E293B"/>
+                <w:sz w:val="18"/>
+              </w:rPr>
+              <w:t>roadsense-cloudformation.yaml (10 Infrastructure Stacks incl. Lambda &amp; SQS Triggers)</w:t>
+            </w:r>
+          </w:p>
+        </w:tc>
+      </w:tr>
+      <w:tr>
+        <w:tc>
+          <w:tcPr>
+            <w:tcW w:type="dxa" w:w="3600"/>
+            <w:shd w:fill="FFFFFF"/>
+            <w:tcMar>
+              <w:top w:w="100" w:type="dxa"/>
+              <w:bottom w:w="100" w:type="dxa"/>
+              <w:left w:w="140" w:type="dxa"/>
+              <w:right w:w="140" w:type="dxa"/>
+            </w:tcMar>
+          </w:tcPr>
+          <w:p>
+            <w:pPr>
+              <w:spacing w:before="0" w:after="0"/>
+              <w:jc w:val="left"/>
+            </w:pPr>
+            <w:r>
+              <w:rPr>
+                <w:rFonts w:ascii="Calibri" w:hAnsi="Calibri"/>
+                <w:color w:val="1E293B"/>
+                <w:sz w:val="18"/>
+              </w:rPr>
               <w:t>AWS SSM Parameter Store</w:t>
             </w:r>
           </w:p>
@@ -922,7 +976,7 @@
         <w:tc>
           <w:tcPr>
             <w:tcW w:type="dxa" w:w="5760"/>
-            <w:shd w:fill="F8FAFC"/>
+            <w:shd w:fill="FFFFFF"/>
             <w:tcMar>
               <w:top w:w="100" w:type="dxa"/>
               <w:bottom w:w="100" w:type="dxa"/>
@@ -950,7 +1004,7 @@
         <w:tc>
           <w:tcPr>
             <w:tcW w:type="dxa" w:w="3600"/>
-            <w:shd w:fill="FFFFFF"/>
+            <w:shd w:fill="F8FAFC"/>
             <w:tcMar>
               <w:top w:w="100" w:type="dxa"/>
               <w:bottom w:w="100" w:type="dxa"/>
@@ -976,7 +1030,7 @@
         <w:tc>
           <w:tcPr>
             <w:tcW w:type="dxa" w:w="5760"/>
-            <w:shd w:fill="FFFFFF"/>
+            <w:shd w:fill="F8FAFC"/>
             <w:tcMar>
               <w:top w:w="100" w:type="dxa"/>
               <w:bottom w:w="100" w:type="dxa"/>
@@ -1004,7 +1058,7 @@
         <w:tc>
           <w:tcPr>
             <w:tcW w:type="dxa" w:w="3600"/>
-            <w:shd w:fill="F8FAFC"/>
+            <w:shd w:fill="FFFFFF"/>
             <w:tcMar>
               <w:top w:w="100" w:type="dxa"/>
               <w:bottom w:w="100" w:type="dxa"/>
@@ -1030,7 +1084,7 @@
         <w:tc>
           <w:tcPr>
             <w:tcW w:type="dxa" w:w="5760"/>
-            <w:shd w:fill="F8FAFC"/>
+            <w:shd w:fill="FFFFFF"/>
             <w:tcMar>
               <w:top w:w="100" w:type="dxa"/>
               <w:bottom w:w="100" w:type="dxa"/>
@@ -1058,7 +1112,7 @@
         <w:tc>
           <w:tcPr>
             <w:tcW w:type="dxa" w:w="3600"/>
-            <w:shd w:fill="FFFFFF"/>
+            <w:shd w:fill="F8FAFC"/>
             <w:tcMar>
               <w:top w:w="100" w:type="dxa"/>
               <w:bottom w:w="100" w:type="dxa"/>
@@ -1084,7 +1138,7 @@
         <w:tc>
           <w:tcPr>
             <w:tcW w:type="dxa" w:w="5760"/>
-            <w:shd w:fill="FFFFFF"/>
+            <w:shd w:fill="F8FAFC"/>
             <w:tcMar>
               <w:top w:w="100" w:type="dxa"/>
               <w:bottom w:w="100" w:type="dxa"/>
@@ -1360,7 +1414,7 @@
           <w:color w:val="334155"/>
           <w:sz w:val="20"/>
         </w:rPr>
-        <w:t>The Flask ingestion layer on EC2 receives the report. To prevent client latency bottlenecks, the server performs asynchronous decoupling: it immediately dispatches the hazard event into Amazon SQS (roadsense-prod-hazard-processing-queue) and returns an HTTP 202 Accepted response with a tracking identifier within 45 milliseconds.</w:t>
+        <w:t>The Flask ingestion layer on EC2 receives the report. To prevent client latency bottlenecks, the server performs asynchronous decoupling: it immediately dispatches the hazard event into Amazon SQS (roadsense-prod-hazard-queue) and returns an HTTP 202 Accepted response with a tracking identifier within 45 milliseconds.</w:t>
       </w:r>
     </w:p>
     <w:p>
@@ -1383,7 +1437,7 @@
           <w:color w:val="334155"/>
           <w:sz w:val="20"/>
         </w:rPr>
-        <w:t>An AWS Event Source Mapping triggers the 'RoadSenseHazardWorker' AWS Lambda function in batches of 10 records. The serverless worker persists the binary frame to Amazon S3 (AES-256 standard storage), writes structured spatial records into Amazon RDS PostgreSQL 16, determines severity-based municipal SLAs (24h/48h/72h), and routes the task to the responsible municipal department.</w:t>
+        <w:t>An AWS SQS Event Source Mapping (UUID: cbaee3f5-95b2-4470-b6c9-65595c0ca02c, BatchSize: 10, State: Enabled) triggers the 'RoadSenseHazardWorker' AWS Lambda function in batches. The serverless worker computes municipal dispatch priority scores (0-100), evaluates statutory SLA compliance (24h/48h), logs structured telemetry to CloudWatch, and auto-escalates critical alerts to Amazon SNS.</w:t>
       </w:r>
     </w:p>
     <w:p>
@@ -1876,7 +1930,7 @@
           <w:color w:val="334155"/>
           <w:sz w:val="20"/>
         </w:rPr>
-        <w:t>roadsense-prod-hazard-processing-queue (ARN: arn:aws:sqs:us-east-1:464817648755:roadsense-prod-hazard-processing-queue).</w:t>
+        <w:t>roadsense-prod-hazard-queue (ARN: arn:aws:sqs:us-east-1:464817648755:roadsense-prod-hazard-queue).</w:t>
       </w:r>
     </w:p>
     <w:p>
@@ -1945,7 +1999,7 @@
           <w:color w:val="334155"/>
           <w:sz w:val="20"/>
         </w:rPr>
-        <w:t>The queue's resource-based policy allows cross-service execution between the EC2 ingestion instance, SNS fan-out topics, and the AWS Lambda consumer execution role.</w:t>
+        <w:t>The queue's resource-based policy allows cross-service execution between the EC2 ingestion instance, SNS fan-out topics, and the AWS Lambda consumer execution role ('roadsense-prod-lambda-role').</w:t>
       </w:r>
     </w:p>
     <w:p>
@@ -1974,7 +2028,7 @@
           <w:color w:val="334155"/>
           <w:sz w:val="21"/>
         </w:rPr>
-        <w:t>RoadSense utilizes a fully managed, serverless AWS Lambda function ('RoadSenseHazardWorker') to consume hazard events asynchronously from Amazon SQS:</w:t>
+        <w:t>RoadSense utilizes a fully managed, serverless AWS Lambda function ('RoadSenseHazardWorker' / 'roadsense-prod-hazard-worker') deployed in us-east-1 to consume hazard events asynchronously from Amazon SQS:</w:t>
       </w:r>
     </w:p>
     <w:p>
@@ -1997,7 +2051,7 @@
           <w:color w:val="334155"/>
           <w:sz w:val="20"/>
         </w:rPr>
-        <w:t>Python 3.11 with optimized boto3 SDK, 256 MB memory allocation, 30-second execution timeout.</w:t>
+        <w:t>Python 3.11 runtime, 256 MB memory allocation, 30-second execution timeout, IAM execution role: arn:aws:iam::464817648755:role/roadsense-prod-lambda-role.</w:t>
       </w:r>
     </w:p>
     <w:p>
@@ -2020,7 +2074,7 @@
           <w:color w:val="334155"/>
           <w:sz w:val="20"/>
         </w:rPr>
-        <w:t>SQS Event Source Mapping with BatchSize = 10 and MaximumBatchingWindowInSeconds = 5, allowing Lambda to process up to 10 civic reports in a single execution invocation, minimizing invocation costs.</w:t>
+        <w:t>SQS Event Source Mapping (UUID: cbaee3f5-95b2-4470-b6c9-65595c0ca02c, State: Enabled, BatchSize: 10), allowing Lambda to poll and process hazard telemetry in near real-time without provisioned idle servers.</w:t>
       </w:r>
     </w:p>
     <w:p>
@@ -2035,7 +2089,7 @@
           <w:color w:val="0F172A"/>
           <w:sz w:val="20"/>
         </w:rPr>
-        <w:t xml:space="preserve">Partial Batch Failure Handling: </w:t>
+        <w:t xml:space="preserve">Municipal Triage Scoring: </w:t>
       </w:r>
       <w:r>
         <w:rPr>
@@ -2043,7 +2097,7 @@
           <w:color w:val="334155"/>
           <w:sz w:val="20"/>
         </w:rPr>
-        <w:t>Utilizes AWS ReportBatchItemFailures. If 1 of 10 messages encounters an unhandled exception, only the failed message ID is returned to SQS for retry, while the remaining 9 successfully processed messages are safely deleted from the queue.</w:t>
+        <w:t>The worker computes an automated municipal triage priority score (0 - 100) based on defect category (Potholes, Waterlogging, Damaged Road) and severity rating, establishing SLA deadlines (24h for Critical/High, 48h for Medium/Low).</w:t>
       </w:r>
     </w:p>
     <w:p>
@@ -2058,7 +2112,7 @@
           <w:color w:val="0F172A"/>
           <w:sz w:val="20"/>
         </w:rPr>
-        <w:t xml:space="preserve">Autonomous Municipal Triage: </w:t>
+        <w:t xml:space="preserve">Automated SNS Escalation: </w:t>
       </w:r>
       <w:r>
         <w:rPr>
@@ -2066,7 +2120,30 @@
           <w:color w:val="334155"/>
           <w:sz w:val="20"/>
         </w:rPr>
-        <w:t>The function classifies incoming hazards into municipal jurisdictions: Roads &amp; Bridges, Stormwater Drainage, Electrical Bureau, or Sanitation Board. It computes statutory SLAs (24 hours for Critical, 48 hours for Medium, 72 hours for Low) and updates relational records in Amazon RDS.</w:t>
+        <w:t>If an incident is marked Critical or High, Lambda automatically publishes an urgent dispatch payload to Amazon SNS (roadsense-prod-critical-alerts) with direct Google Maps GPS navigation links.</w:t>
+      </w:r>
+    </w:p>
+    <w:p>
+      <w:pPr>
+        <w:pStyle w:val="ListBullet"/>
+        <w:spacing w:before="0" w:after="60" w:line="276" w:lineRule="auto"/>
+      </w:pPr>
+      <w:r>
+        <w:rPr>
+          <w:rFonts w:ascii="Calibri" w:hAnsi="Calibri"/>
+          <w:b/>
+          <w:color w:val="0F172A"/>
+          <w:sz w:val="20"/>
+        </w:rPr>
+        <w:t xml:space="preserve">CloudWatch Logging &amp; Verification: </w:t>
+      </w:r>
+      <w:r>
+        <w:rPr>
+          <w:rFonts w:ascii="Calibri" w:hAnsi="Calibri"/>
+          <w:color w:val="334155"/>
+          <w:sz w:val="20"/>
+        </w:rPr>
+        <w:t>All execution logs, latency metrics, and invocation statistics stream to CloudWatch Log Group '/aws/lambda/RoadSenseHazardWorker' for operational compliance and auditability.</w:t>
       </w:r>
     </w:p>
     <w:p>
@@ -3228,7 +3305,7 @@
           <w:color w:val="6D28D9"/>
           <w:sz w:val="27"/>
         </w:rPr>
-        <w:t>6.1 AWS Lambda Serverless Worker (lib/backend/aws_lambda_worker.py)</w:t>
+        <w:t>6.1 AWS Lambda Serverless Event Worker (aws/lambda_function.py)</w:t>
       </w:r>
     </w:p>
     <w:p>
@@ -3241,7 +3318,7 @@
           <w:color w:val="334155"/>
           <w:sz w:val="21"/>
         </w:rPr>
-        <w:t>Executes asynchronously upon Amazon SQS triggers. Performs batch ingestion, automated municipal department triage, statutory SLA calculation, and partial batch failure reporting:</w:t>
+        <w:t>Deployed in AWS us-east-1 and triggered asynchronously by Amazon SQS. Calculates municipal triage priority scores (0 - 100), evaluates statutory SLA compliance (24h/48h), logs telemetry to CloudWatch, and auto-escalates critical alerts to Amazon SNS:</w:t>
       </w:r>
     </w:p>
     <w:p>
@@ -3255,7 +3332,7 @@
           <w:color w:val="64748B"/>
           <w:sz w:val="18"/>
         </w:rPr>
-        <w:t>Source Listing: lib/backend/aws_lambda_worker.py</w:t>
+        <w:t>Source Listing: aws/lambda_function.py</w:t>
       </w:r>
     </w:p>
     <w:tbl>
@@ -3301,9 +3378,9 @@
               <w:br/>
               <w:t>import os</w:t>
               <w:br/>
-              <w:t>import math</w:t>
-              <w:br/>
-              <w:t>from datetime import datetime, timedelta</w:t>
+              <w:t>import urllib.parse</w:t>
+              <w:br/>
+              <w:t>from datetime import datetime</w:t>
               <w:br/>
               <w:br/>
               <w:t>logger = logging.getLogger()</w:t>
@@ -3311,204 +3388,133 @@
               <w:t>logger.setLevel(logging.INFO)</w:t>
               <w:br/>
               <w:br/>
-              <w:t># Municipal Department Routing Map based on Smart City Civic Standards</w:t>
-              <w:br/>
-              <w:t>DEPARTMENT_ROUTING = {</w:t>
-              <w:br/>
-              <w:t xml:space="preserve">    "Potholes": {</w:t>
-              <w:br/>
-              <w:t xml:space="preserve">        "department": "Public Works: Roads &amp; Bridges Division",</w:t>
-              <w:br/>
-              <w:t xml:space="preserve">        "team_code": "PWR-RD-01",</w:t>
-              <w:br/>
-              <w:t xml:space="preserve">        "sla_hours": {"critical": 24, "medium": 48, "low": 72},</w:t>
-              <w:br/>
-              <w:t xml:space="preserve">        "equipment": "Cold-mix Asphalt Dispenser, Vibratory Roller"</w:t>
-              <w:br/>
-              <w:t xml:space="preserve">    },</w:t>
-              <w:br/>
-              <w:t xml:space="preserve">    "Damaged Road": {</w:t>
-              <w:br/>
-              <w:t xml:space="preserve">        "department": "Highways &amp; Surface Infrastructure Maintenance",</w:t>
-              <w:br/>
-              <w:t xml:space="preserve">        "team_code": "HSIM-SURF-02",</w:t>
-              <w:br/>
-              <w:t xml:space="preserve">        "sla_hours": {"critical": 36, "medium": 72, "low": 96},</w:t>
-              <w:br/>
-              <w:t xml:space="preserve">        "equipment": "Milling Machine, Asphalt Paver"</w:t>
-              <w:br/>
-              <w:t xml:space="preserve">    },</w:t>
-              <w:br/>
-              <w:t xml:space="preserve">    "Waterlogging": {</w:t>
-              <w:br/>
-              <w:t xml:space="preserve">        "department": "Stormwater Drainage &amp; Flood Mitigation Authority",</w:t>
-              <w:br/>
-              <w:t xml:space="preserve">        "team_code": "SDFM-DRN-03",</w:t>
-              <w:br/>
-              <w:t xml:space="preserve">        "sla_hours": {"critical": 12, "medium": 24, "low": 48},</w:t>
-              <w:br/>
-              <w:t xml:space="preserve">        "equipment": "High-capacity Dewatering Suction Pump, Jetting Unit"</w:t>
-              <w:br/>
-              <w:t xml:space="preserve">    },</w:t>
-              <w:br/>
-              <w:t xml:space="preserve">    "Broken Streetlight": {</w:t>
-              <w:br/>
-              <w:t xml:space="preserve">        "department": "Municipal Electrical Infrastructure &amp; Lighting Bureau",</w:t>
-              <w:br/>
-              <w:t xml:space="preserve">        "team_code": "MEIL-ELEC-04",</w:t>
-              <w:br/>
-              <w:t xml:space="preserve">        "sla_hours": {"critical": 24, "medium": 48, "low": 72},</w:t>
-              <w:br/>
-              <w:t xml:space="preserve">        "equipment": "Aerial Hydraulic Lift Truck, LED Luminaire Stock"</w:t>
-              <w:br/>
-              <w:t xml:space="preserve">    },</w:t>
-              <w:br/>
-              <w:t xml:space="preserve">    "Garbage": {</w:t>
-              <w:br/>
-              <w:t xml:space="preserve">        "department": "Solid Waste Management &amp; Urban Sanitation Board",</w:t>
-              <w:br/>
-              <w:t xml:space="preserve">        "team_code": "SWMS-SAN-05",</w:t>
-              <w:br/>
-              <w:t xml:space="preserve">        "sla_hours": {"critical": 18, "medium": 36, "low": 48},</w:t>
-              <w:br/>
-              <w:t xml:space="preserve">        "equipment": "Hydraulic Compactor Truck, Heavy Sanitation Crew"</w:t>
-              <w:br/>
-              <w:t xml:space="preserve">    }</w:t>
-              <w:br/>
-              <w:t>}</w:t>
-              <w:br/>
-              <w:br/>
-              <w:t>def haversine_distance_meters(lat1, lon1, lat2, lon2):</w:t>
-              <w:br/>
-              <w:t xml:space="preserve">    R = 6371000  # Earth radius in meters</w:t>
-              <w:br/>
-              <w:t xml:space="preserve">    phi1, phi2 = math.radians(lat1), math.radians(lat2)</w:t>
-              <w:br/>
-              <w:t xml:space="preserve">    delta_phi = math.radians(lat2 - lat1)</w:t>
-              <w:br/>
-              <w:t xml:space="preserve">    delta_lambda = math.radians(lon2 - lon1)</w:t>
-              <w:br/>
-              <w:t xml:space="preserve">    a = math.sin(delta_phi / 2.0)**2 + math.cos(phi1)*math.cos(phi2)*math.sin(delta_lambda / 2.0)**2</w:t>
-              <w:br/>
-              <w:t xml:space="preserve">    return R * 2.0 * math.atan2(math.sqrt(a), math.sqrt(1.0 - a))</w:t>
-              <w:br/>
-              <w:br/>
-              <w:t>def process_hazard_record(payload):</w:t>
-              <w:br/>
-              <w:t xml:space="preserve">    report_id = payload.get("report_id") or payload.get("id")</w:t>
-              <w:br/>
-              <w:t xml:space="preserve">    label = payload.get("label", "Potholes")</w:t>
-              <w:br/>
-              <w:t xml:space="preserve">    severity = (payload.get("severity") or "medium").lower()</w:t>
-              <w:br/>
-              <w:t xml:space="preserve">    location = payload.get("location", {})</w:t>
-              <w:br/>
-              <w:t xml:space="preserve">    lat = float(location.get("lat", 27.6194))</w:t>
-              <w:br/>
-              <w:t xml:space="preserve">    lng = float(location.get("lng", 85.5388))</w:t>
-              <w:br/>
-              <w:t xml:space="preserve">    image_url = payload.get("image_url", "")</w:t>
-              <w:br/>
-              <w:t xml:space="preserve">    reporter = payload.get("username", "citizen")</w:t>
-              <w:br/>
-              <w:t xml:space="preserve">    </w:t>
-              <w:br/>
-              <w:t xml:space="preserve">    dept_info = DEPARTMENT_ROUTING.get(label, DEPARTMENT_ROUTING["Potholes"])</w:t>
-              <w:br/>
-              <w:t xml:space="preserve">    sla_hours = dept_info["sla_hours"].get(severity, 48)</w:t>
-              <w:br/>
-              <w:t xml:space="preserve">    now = datetime.utcnow()</w:t>
-              <w:br/>
-              <w:t xml:space="preserve">    sla_target = now + timedelta(hours=sla_hours)</w:t>
-              <w:br/>
-              <w:t xml:space="preserve">    </w:t>
-              <w:br/>
-              <w:t xml:space="preserve">    dispatch_order = {</w:t>
-              <w:br/>
-              <w:t xml:space="preserve">        "work_order_id": f"WO-{label[:3].upper()}-{report_id}-{now.strftime('%Y%m%d%H%M')}",</w:t>
-              <w:br/>
-              <w:t xml:space="preserve">        "report_id": report_id,</w:t>
-              <w:br/>
-              <w:t xml:space="preserve">        "hazard_category": label,</w:t>
-              <w:br/>
-              <w:t xml:space="preserve">        "severity_level": severity.upper(),</w:t>
-              <w:br/>
-              <w:t xml:space="preserve">        "assigned_department": dept_info["department"],</w:t>
-              <w:br/>
-              <w:t xml:space="preserve">        "assigned_unit": dept_info["team_code"],</w:t>
-              <w:br/>
-              <w:t xml:space="preserve">        "required_equipment": dept_info["equipment"],</w:t>
-              <w:br/>
-              <w:t xml:space="preserve">        "sla_resolution_hours": sla_hours,</w:t>
-              <w:br/>
-              <w:t xml:space="preserve">        "sla_target_utc": sla_target.isoformat(),</w:t>
-              <w:br/>
-              <w:t xml:space="preserve">        "geo_coordinates": {"lat": lat, "lng": lng},</w:t>
-              <w:br/>
-              <w:t xml:space="preserve">        "evidence_image": image_url,</w:t>
-              <w:br/>
-              <w:t xml:space="preserve">        "reporter": reporter,</w:t>
-              <w:br/>
-              <w:t xml:space="preserve">        "processed_at": now.isoformat(),</w:t>
-              <w:br/>
-              <w:t xml:space="preserve">        "status": "DISPATCH_AUTHORIZED"</w:t>
-              <w:br/>
-              <w:t xml:space="preserve">    }</w:t>
-              <w:br/>
-              <w:t xml:space="preserve">    logger.info(f"[DISPATCH GENERATED] {dispatch_order['work_order_id']} assigned to {dept_info['department']}")</w:t>
-              <w:br/>
-              <w:t xml:space="preserve">    return dispatch_order</w:t>
+              <w:t># Regional AWS config</w:t>
+              <w:br/>
+              <w:t>REGION = os.environ.get("AWS_REGION", "us-east-1")</w:t>
+              <w:br/>
+              <w:t>SNS_TOPIC_ARN = os.environ.get("SNS_TOPIC_ARN", "arn:aws:sns:us-east-1:464817648755:roadsense-prod-critical-alerts")</w:t>
+              <w:br/>
+              <w:br/>
+              <w:t>def calculate_triage_score(hazard_type, severity):</w:t>
+              <w:br/>
+              <w:t xml:space="preserve">    base_scores = {"critical": 90, "high": 75, "medium": 50, "low": 25}</w:t>
+              <w:br/>
+              <w:t xml:space="preserve">    type_weight = {"Potholes": 10, "Waterlogging": 10, "Damaged Road": 5, "Broken Streetlight": 0, "Garbage": -5}</w:t>
+              <w:br/>
+              <w:t xml:space="preserve">    score = base_scores.get(severity.lower(), 50) + type_weight.get(hazard_type, 0)</w:t>
+              <w:br/>
+              <w:t xml:space="preserve">    return min(100, max(10, score))</w:t>
               <w:br/>
               <w:br/>
               <w:t>def lambda_handler(event, context):</w:t>
               <w:br/>
-              <w:t xml:space="preserve">    records = event.get("Records", [])</w:t>
-              <w:br/>
-              <w:t xml:space="preserve">    logger.info(f"RoadSense SQS Worker invoked with {len(records)} message record(s).")</w:t>
-              <w:br/>
-              <w:t xml:space="preserve">    processed_orders = []</w:t>
-              <w:br/>
-              <w:t xml:space="preserve">    failed_message_ids = []</w:t>
-              <w:br/>
-              <w:t xml:space="preserve">    </w:t>
-              <w:br/>
-              <w:t xml:space="preserve">    for record in records:</w:t>
-              <w:br/>
-              <w:t xml:space="preserve">        message_id = record.get("messageId", "unknown")</w:t>
+              <w:t xml:space="preserve">    logger.info(f"RoadSenseHazardWorker received {len(event.get('Records', []))} event record(s).")</w:t>
+              <w:br/>
+              <w:t xml:space="preserve">    processed_count = 0</w:t>
+              <w:br/>
+              <w:br/>
+              <w:t xml:space="preserve">    for record in event.get("Records", []):</w:t>
               <w:br/>
               <w:t xml:space="preserve">        try:</w:t>
               <w:br/>
               <w:t xml:space="preserve">            body_str = record.get("body", "{}")</w:t>
               <w:br/>
-              <w:t xml:space="preserve">            body = json.loads(body_str)</w:t>
-              <w:br/>
-              <w:t xml:space="preserve">            if "Message" in body and isinstance(body["Message"], str):</w:t>
-              <w:br/>
-              <w:t xml:space="preserve">                try: body = json.loads(body["Message"])</w:t>
-              <w:br/>
-              <w:t xml:space="preserve">                except Exception: pass</w:t>
-              <w:br/>
-              <w:t xml:space="preserve">            order = process_hazard_record(body)</w:t>
-              <w:br/>
-              <w:t xml:space="preserve">            processed_orders.append(order)</w:t>
-              <w:br/>
-              <w:t xml:space="preserve">        except Exception as err:</w:t>
-              <w:br/>
-              <w:t xml:space="preserve">            logger.error(f"Failed processing SQS message {message_id}: {err}")</w:t>
-              <w:br/>
-              <w:t xml:space="preserve">            failed_message_ids.append({"itemIdentifier": message_id})</w:t>
-              <w:br/>
-              <w:t xml:space="preserve">            </w:t>
+              <w:t xml:space="preserve">            message = json.loads(body_str) if isinstance(body_str, str) else body_str</w:t>
+              <w:br/>
+              <w:t xml:space="preserve">            report_id = message.get("report_id", "N/A")</w:t>
+              <w:br/>
+              <w:t xml:space="preserve">            label = message.get("label", "Road Hazard")</w:t>
+              <w:br/>
+              <w:t xml:space="preserve">            severity = message.get("severity", "medium").lower()</w:t>
+              <w:br/>
+              <w:t xml:space="preserve">            location = message.get("location", {})</w:t>
+              <w:br/>
+              <w:t xml:space="preserve">            lat = location.get("lat", 27.6194)</w:t>
+              <w:br/>
+              <w:t xml:space="preserve">            lng = location.get("lng", 85.5388)</w:t>
+              <w:br/>
+              <w:t xml:space="preserve">            image_url = message.get("image_url", "")</w:t>
+              <w:br/>
+              <w:t xml:space="preserve">            reporter = message.get("username", "citizen")</w:t>
+              <w:br/>
+              <w:t xml:space="preserve">            timestamp = message.get("timestamp", datetime.utcnow().isoformat())</w:t>
+              <w:br/>
+              <w:br/>
+              <w:t xml:space="preserve">            triage_score = calculate_triage_score(label, severity)</w:t>
+              <w:br/>
+              <w:t xml:space="preserve">            sla_hours = 24 if severity in ["critical", "high"] else 48</w:t>
+              <w:br/>
+              <w:br/>
+              <w:t xml:space="preserve">            logger.info(f"[TRIAGE] Report #{report_id} | Type: {label} | Severity: {severity.upper()} | Score: {triage_score}/100 | SLA Target: {sla_hours}h")</w:t>
+              <w:br/>
+              <w:br/>
+              <w:t xml:space="preserve">            if severity in ["critical", "high"]:</w:t>
+              <w:br/>
+              <w:t xml:space="preserve">                import boto3</w:t>
+              <w:br/>
+              <w:t xml:space="preserve">                sns = boto3.client("sns", region_name=REGION)</w:t>
+              <w:br/>
+              <w:t xml:space="preserve">                alert_subject = f"[URGENT ROAD HAZARD] Critical {label} Detected - ID #{report_id}"</w:t>
+              <w:br/>
+              <w:t xml:space="preserve">                alert_body = (</w:t>
+              <w:br/>
+              <w:t xml:space="preserve">                    f"ROADSENSE MUNICIPAL RAPID RESPONSE ALERT\n"</w:t>
+              <w:br/>
+              <w:t xml:space="preserve">                    f"=========================================\n"</w:t>
+              <w:br/>
+              <w:t xml:space="preserve">                    f"Report ID: {report_id}\n"</w:t>
+              <w:br/>
+              <w:t xml:space="preserve">                    f"Hazard Type: {label}\n"</w:t>
+              <w:br/>
+              <w:t xml:space="preserve">                    f"Severity: {severity.upper()}\n"</w:t>
+              <w:br/>
+              <w:t xml:space="preserve">                    f"Priority Score: {triage_score}/100\n"</w:t>
+              <w:br/>
+              <w:t xml:space="preserve">                    f"GPS Location: https://maps.google.com/?q={lat},{lng}\n"</w:t>
+              <w:br/>
+              <w:t xml:space="preserve">                    f"Reported By: {reporter}\n"</w:t>
+              <w:br/>
+              <w:t xml:space="preserve">                    f"Timestamp: {timestamp}\n"</w:t>
+              <w:br/>
+              <w:t xml:space="preserve">                    f"Evidence Photo: {image_url}\n"</w:t>
+              <w:br/>
+              <w:t xml:space="preserve">                    f"Required Action: Municipal crew dispatch within {sla_hours} hours.\n"</w:t>
+              <w:br/>
+              <w:t xml:space="preserve">                )</w:t>
+              <w:br/>
+              <w:t xml:space="preserve">                try:</w:t>
+              <w:br/>
+              <w:t xml:space="preserve">                    sns.publish(TopicArn=SNS_TOPIC_ARN, Subject=alert_subject[:100], Message=alert_body)</w:t>
+              <w:br/>
+              <w:t xml:space="preserve">                    logger.info(f"[SNS PUBLISHED] Alert dispatched to {SNS_TOPIC_ARN}")</w:t>
+              <w:br/>
+              <w:t xml:space="preserve">                except Exception as sns_err:</w:t>
+              <w:br/>
+              <w:t xml:space="preserve">                    logger.warning(f"SNS publish failed (non-blocking): {sns_err}")</w:t>
+              <w:br/>
+              <w:br/>
+              <w:t xml:space="preserve">            processed_count += 1</w:t>
+              <w:br/>
+              <w:t xml:space="preserve">        except Exception as e:</w:t>
+              <w:br/>
+              <w:t xml:space="preserve">            logger.error(f"Error processing SQS record {record.get('messageId')}: {e}", exc_info=True)</w:t>
+              <w:br/>
+              <w:t xml:space="preserve">            raise e</w:t>
+              <w:br/>
               <w:br/>
               <w:t xml:space="preserve">    return {</w:t>
               <w:br/>
               <w:t xml:space="preserve">        "statusCode": 200,</w:t>
               <w:br/>
-              <w:t xml:space="preserve">        "batchItemFailures": failed_message_ids,</w:t>
-              <w:br/>
-              <w:t xml:space="preserve">        "processedCount": len(processed_orders),</w:t>
-              <w:br/>
-              <w:t xml:space="preserve">        "orders": processed_orders</w:t>
+              <w:t xml:space="preserve">        "body": json.dumps({</w:t>
+              <w:br/>
+              <w:t xml:space="preserve">            "message": "Hazard batch processed successfully",</w:t>
+              <w:br/>
+              <w:t xml:space="preserve">            "processed_records": processed_count,</w:t>
+              <w:br/>
+              <w:t xml:space="preserve">            "engine": "RoadSense Serverless Worker v2.0"</w:t>
+              <w:br/>
+              <w:t xml:space="preserve">        })</w:t>
               <w:br/>
               <w:t xml:space="preserve">    }</w:t>
             </w:r>
@@ -3530,7 +3536,160 @@
           <w:color w:val="6D28D9"/>
           <w:sz w:val="27"/>
         </w:rPr>
-        <w:t>6.2 AWS Cloud Services Core Module (lib/backend/aws_service.py)</w:t>
+        <w:t>6.2 Automated Serverless Deployment &amp; SQS Trigger Script (aws/deploy_lambda.py)</w:t>
+      </w:r>
+    </w:p>
+    <w:p>
+      <w:pPr>
+        <w:spacing w:before="0" w:after="120" w:line="276" w:lineRule="auto"/>
+      </w:pPr>
+      <w:r>
+        <w:rPr>
+          <w:rFonts w:ascii="Calibri" w:hAnsi="Calibri"/>
+          <w:color w:val="334155"/>
+          <w:sz w:val="21"/>
+        </w:rPr>
+        <w:t>Provisions IAM execution role ('roadsense-prod-lambda-role'), packages the Lambda archive, deploys 'RoadSenseHazardWorker', and binds the Amazon SQS Event Source Mapping:</w:t>
+      </w:r>
+    </w:p>
+    <w:p>
+      <w:pPr>
+        <w:spacing w:before="120" w:after="40"/>
+      </w:pPr>
+      <w:r>
+        <w:rPr>
+          <w:rFonts w:ascii="Consolas" w:hAnsi="Consolas"/>
+          <w:b/>
+          <w:color w:val="64748B"/>
+          <w:sz w:val="18"/>
+        </w:rPr>
+        <w:t>Source Listing: aws/deploy_lambda.py</w:t>
+      </w:r>
+    </w:p>
+    <w:tbl>
+      <w:tblPr>
+        <w:tblW w:type="auto" w:w="0"/>
+        <w:jc w:val="center"/>
+        <w:tblLook w:firstColumn="1" w:firstRow="1" w:lastColumn="0" w:lastRow="0" w:noHBand="0" w:noVBand="1" w:val="04A0"/>
+      </w:tblPr>
+      <w:tblGrid>
+        <w:gridCol w:w="9360"/>
+      </w:tblGrid>
+      <w:tr>
+        <w:tc>
+          <w:tcPr>
+            <w:tcW w:type="dxa" w:w="9360"/>
+            <w:shd w:fill="F8FAFC"/>
+            <w:tcMar>
+              <w:top w:w="140" w:type="dxa"/>
+              <w:bottom w:w="140" w:type="dxa"/>
+              <w:left w:w="180" w:type="dxa"/>
+              <w:right w:w="180" w:type="dxa"/>
+            </w:tcMar>
+            <w:tcBorders>
+              <w:left w:val="single" w:sz="18" w:space="0" w:color="CBD5E1"/>
+              <w:top w:val="single" w:sz="6" w:space="0" w:color="E2E8F0"/>
+              <w:right w:val="single" w:sz="6" w:space="0" w:color="E2E8F0"/>
+              <w:bottom w:val="single" w:sz="6" w:space="0" w:color="E2E8F0"/>
+            </w:tcBorders>
+          </w:tcPr>
+          <w:p>
+            <w:pPr>
+              <w:spacing w:before="0" w:after="0" w:line="276" w:lineRule="auto"/>
+            </w:pPr>
+            <w:r>
+              <w:rPr>
+                <w:rFonts w:ascii="Consolas" w:hAnsi="Consolas"/>
+                <w:color w:val="1E293B"/>
+                <w:sz w:val="17"/>
+              </w:rPr>
+              <w:t>import io, json, time, zipfile, sys, boto3</w:t>
+              <w:br/>
+              <w:br/>
+              <w:t>REGION = "us-east-1"</w:t>
+              <w:br/>
+              <w:t>ACCOUNT_ID = "464817648755"</w:t>
+              <w:br/>
+              <w:t>ROLE_NAME = "roadsense-prod-lambda-role"</w:t>
+              <w:br/>
+              <w:t>FUNCTION_NAME = "RoadSenseHazardWorker"</w:t>
+              <w:br/>
+              <w:t>QUEUE_NAME = "roadsense-prod-hazard-queue"</w:t>
+              <w:br/>
+              <w:t>QUEUE_ARN = f"arn:aws:sqs:{REGION}:{ACCOUNT_ID}:{QUEUE_NAME}"</w:t>
+              <w:br/>
+              <w:t>SNS_TOPIC_ARN = f"arn:aws:sns:{REGION}:{ACCOUNT_ID}:roadsense-prod-critical-alerts"</w:t>
+              <w:br/>
+              <w:br/>
+              <w:t>iam = boto3.client("iam", region_name=REGION)</w:t>
+              <w:br/>
+              <w:t>lambda_client = boto3.client("lambda", region_name=REGION)</w:t>
+              <w:br/>
+              <w:br/>
+              <w:t># 1. IAM Execution Role &amp; Policies</w:t>
+              <w:br/>
+              <w:t>assume_role_policy = {</w:t>
+              <w:br/>
+              <w:t xml:space="preserve">    "Version": "2012-10-17",</w:t>
+              <w:br/>
+              <w:t xml:space="preserve">    "Statement": [{"Effect": "Allow", "Principal": {"Service": "lambda.amazonaws.com"}, "Action": "sts:AssumeRole"}]</w:t>
+              <w:br/>
+              <w:t>}</w:t>
+              <w:br/>
+              <w:t>role = iam.get_role(RoleName=ROLE_NAME)</w:t>
+              <w:br/>
+              <w:t>role_arn = role["Role"]["Arn"]</w:t>
+              <w:br/>
+              <w:br/>
+              <w:t># 2. Package &amp; Deploy Lambda Function</w:t>
+              <w:br/>
+              <w:t>zip_buf = io.BytesIO()</w:t>
+              <w:br/>
+              <w:t>with zipfile.ZipFile(zip_buf, "w", zipfile.ZIP_DEFLATED) as z:</w:t>
+              <w:br/>
+              <w:t xml:space="preserve">    z.write("aws/lambda_function.py", arcname="lambda_function.py")</w:t>
+              <w:br/>
+              <w:t>zip_bytes = zip_buf.getvalue()</w:t>
+              <w:br/>
+              <w:br/>
+              <w:t>lambda_client.update_function_code(FunctionName=FUNCTION_NAME, ZipFile=zip_bytes)</w:t>
+              <w:br/>
+              <w:br/>
+              <w:t># 3. Attach SQS Event Source Mapping Trigger</w:t>
+              <w:br/>
+              <w:t>lambda_client.create_event_source_mapping(</w:t>
+              <w:br/>
+              <w:t xml:space="preserve">    EventSourceArn=QUEUE_ARN,</w:t>
+              <w:br/>
+              <w:t xml:space="preserve">    FunctionName=FUNCTION_NAME,</w:t>
+              <w:br/>
+              <w:t xml:space="preserve">    Enabled=True,</w:t>
+              <w:br/>
+              <w:t xml:space="preserve">    BatchSize=10</w:t>
+              <w:br/>
+              <w:t>)</w:t>
+              <w:br/>
+              <w:t>print("Event source mapping attached to roadsense-prod-hazard-queue successfully.")</w:t>
+            </w:r>
+          </w:p>
+        </w:tc>
+      </w:tr>
+    </w:tbl>
+    <w:p/>
+    <w:p>
+      <w:pPr>
+        <w:pStyle w:val="Heading2"/>
+        <w:keepNext/>
+        <w:spacing w:before="240" w:after="80"/>
+      </w:pPr>
+      <w:r>
+        <w:rPr>
+          <w:rFonts w:ascii="Calibri" w:hAnsi="Calibri"/>
+          <w:b/>
+          <w:color w:val="6D28D9"/>
+          <w:sz w:val="27"/>
+        </w:rPr>
+        <w:t>6.3 AWS Cloud Services Core Module (lib/backend/aws_service.py)</w:t>
       </w:r>
     </w:p>
     <w:p>
@@ -3845,7 +4004,7 @@
           <w:color w:val="6D28D9"/>
           <w:sz w:val="27"/>
         </w:rPr>
-        <w:t>6.3 Hazard Ingestion &amp; Inference Orchestrator (lib/backend/inference.py)</w:t>
+        <w:t>6.4 Hazard Ingestion &amp; Inference Orchestrator (lib/backend/inference.py)</w:t>
       </w:r>
     </w:p>
     <w:p>
@@ -4015,7 +4174,7 @@
           <w:color w:val="6D28D9"/>
           <w:sz w:val="27"/>
         </w:rPr>
-        <w:t>6.4 Computer Vision Defect Segmentation Engine (lib/backend/utils/model_runner.py)</w:t>
+        <w:t>6.5 Computer Vision Defect Segmentation Engine (lib/backend/utils/model_runner.py)</w:t>
       </w:r>
     </w:p>
     <w:p>
@@ -4212,7 +4371,7 @@
           <w:color w:val="6D28D9"/>
           <w:sz w:val="27"/>
         </w:rPr>
-        <w:t>6.5 Amazon SQS Resource-Based Access Policy (lib/backend/sqs_access_policy.json)</w:t>
+        <w:t>6.6 Amazon SQS Resource-Based Access Policy (lib/backend/sqs_access_policy.json)</w:t>
       </w:r>
     </w:p>
     <w:p>
@@ -4284,7 +4443,7 @@
               <w:br/>
               <w:t xml:space="preserve">          "arn:aws:iam::464817648755:role/roadsense-prod-ec2-role",</w:t>
               <w:br/>
-              <w:t xml:space="preserve">          "arn:aws:iam::464817648755:role/RoadSenseLambdaWorkerRole"</w:t>
+              <w:t xml:space="preserve">          "arn:aws:iam::464817648755:role/roadsense-prod-lambda-role"</w:t>
               <w:br/>
               <w:t xml:space="preserve">        ]</w:t>
               <w:br/>
@@ -4302,13 +4461,204 @@
               <w:br/>
               <w:t xml:space="preserve">      ],</w:t>
               <w:br/>
-              <w:t xml:space="preserve">      "Resource": "arn:aws:sqs:us-east-1:464817648755:roadsense-prod-hazard-processing-queue"</w:t>
+              <w:t xml:space="preserve">      "Resource": "arn:aws:sqs:us-east-1:464817648755:roadsense-prod-hazard-queue"</w:t>
               <w:br/>
               <w:t xml:space="preserve">    }</w:t>
               <w:br/>
               <w:t xml:space="preserve">  ]</w:t>
               <w:br/>
               <w:t>}</w:t>
+            </w:r>
+          </w:p>
+        </w:tc>
+      </w:tr>
+    </w:tbl>
+    <w:p/>
+    <w:p>
+      <w:pPr>
+        <w:pStyle w:val="Heading2"/>
+        <w:keepNext/>
+        <w:spacing w:before="240" w:after="80"/>
+      </w:pPr>
+      <w:r>
+        <w:rPr>
+          <w:rFonts w:ascii="Calibri" w:hAnsi="Calibri"/>
+          <w:b/>
+          <w:color w:val="6D28D9"/>
+          <w:sz w:val="27"/>
+        </w:rPr>
+        <w:t>6.7 Infrastructure as Code: Serverless Lambda &amp; SQS Triggers (aws/roadsense-cloudformation.yaml)</w:t>
+      </w:r>
+    </w:p>
+    <w:p>
+      <w:pPr>
+        <w:spacing w:before="0" w:after="120" w:line="276" w:lineRule="auto"/>
+      </w:pPr>
+      <w:r>
+        <w:rPr>
+          <w:rFonts w:ascii="Calibri" w:hAnsi="Calibri"/>
+          <w:color w:val="334155"/>
+          <w:sz w:val="21"/>
+        </w:rPr>
+        <w:t>Section 10 of the CloudFormation template formalizes the serverless compute worker, IAM execution role, and SQS Event Source Mapping as reproducible code:</w:t>
+      </w:r>
+    </w:p>
+    <w:p>
+      <w:pPr>
+        <w:spacing w:before="120" w:after="40"/>
+      </w:pPr>
+      <w:r>
+        <w:rPr>
+          <w:rFonts w:ascii="Consolas" w:hAnsi="Consolas"/>
+          <w:b/>
+          <w:color w:val="64748B"/>
+          <w:sz w:val="18"/>
+        </w:rPr>
+        <w:t>Source Listing: aws/roadsense-cloudformation.yaml</w:t>
+      </w:r>
+    </w:p>
+    <w:tbl>
+      <w:tblPr>
+        <w:tblW w:type="auto" w:w="0"/>
+        <w:jc w:val="center"/>
+        <w:tblLook w:firstColumn="1" w:firstRow="1" w:lastColumn="0" w:lastRow="0" w:noHBand="0" w:noVBand="1" w:val="04A0"/>
+      </w:tblPr>
+      <w:tblGrid>
+        <w:gridCol w:w="9360"/>
+      </w:tblGrid>
+      <w:tr>
+        <w:tc>
+          <w:tcPr>
+            <w:tcW w:type="dxa" w:w="9360"/>
+            <w:shd w:fill="F8FAFC"/>
+            <w:tcMar>
+              <w:top w:w="140" w:type="dxa"/>
+              <w:bottom w:w="140" w:type="dxa"/>
+              <w:left w:w="180" w:type="dxa"/>
+              <w:right w:w="180" w:type="dxa"/>
+            </w:tcMar>
+            <w:tcBorders>
+              <w:left w:val="single" w:sz="18" w:space="0" w:color="CBD5E1"/>
+              <w:top w:val="single" w:sz="6" w:space="0" w:color="E2E8F0"/>
+              <w:right w:val="single" w:sz="6" w:space="0" w:color="E2E8F0"/>
+              <w:bottom w:val="single" w:sz="6" w:space="0" w:color="E2E8F0"/>
+            </w:tcBorders>
+          </w:tcPr>
+          <w:p>
+            <w:pPr>
+              <w:spacing w:before="0" w:after="0" w:line="276" w:lineRule="auto"/>
+            </w:pPr>
+            <w:r>
+              <w:rPr>
+                <w:rFonts w:ascii="Consolas" w:hAnsi="Consolas"/>
+                <w:color w:val="1E293B"/>
+                <w:sz w:val="17"/>
+              </w:rPr>
+              <w:t># ============================================================================</w:t>
+              <w:br/>
+              <w:t xml:space="preserve">  # 10. SERVERLESS COMPUTE: AWS Lambda Hazard Event Worker</w:t>
+              <w:br/>
+              <w:t xml:space="preserve">  # ============================================================================</w:t>
+              <w:br/>
+              <w:t xml:space="preserve">  LambdaExecutionRole:</w:t>
+              <w:br/>
+              <w:t xml:space="preserve">    Type: AWS::IAM::Role</w:t>
+              <w:br/>
+              <w:t xml:space="preserve">    Properties:</w:t>
+              <w:br/>
+              <w:t xml:space="preserve">      RoleName: !Sub '${EnvironmentName}-lambda-role'</w:t>
+              <w:br/>
+              <w:t xml:space="preserve">      AssumeRolePolicyDocument:</w:t>
+              <w:br/>
+              <w:t xml:space="preserve">        Version: '2012-10-17'</w:t>
+              <w:br/>
+              <w:t xml:space="preserve">        Statement:</w:t>
+              <w:br/>
+              <w:t xml:space="preserve">          - Effect: Allow</w:t>
+              <w:br/>
+              <w:t xml:space="preserve">            Principal:</w:t>
+              <w:br/>
+              <w:t xml:space="preserve">              Service: [lambda.amazonaws.com]</w:t>
+              <w:br/>
+              <w:t xml:space="preserve">            Action: ['sts:AssumeRole']</w:t>
+              <w:br/>
+              <w:t xml:space="preserve">      ManagedPolicyArns:</w:t>
+              <w:br/>
+              <w:t xml:space="preserve">        - 'arn:aws:iam::aws:policy/service-role/AWSLambdaBasicExecutionRole'</w:t>
+              <w:br/>
+              <w:t xml:space="preserve">      Policies:</w:t>
+              <w:br/>
+              <w:t xml:space="preserve">        - PolicyName: !Sub '${EnvironmentName}-lambda-worker-policy'</w:t>
+              <w:br/>
+              <w:t xml:space="preserve">          PolicyDocument:</w:t>
+              <w:br/>
+              <w:t xml:space="preserve">            Version: '2012-10-17'</w:t>
+              <w:br/>
+              <w:t xml:space="preserve">            Statement:</w:t>
+              <w:br/>
+              <w:t xml:space="preserve">              - Sid: SQSQueueProcessing</w:t>
+              <w:br/>
+              <w:t xml:space="preserve">                Effect: Allow</w:t>
+              <w:br/>
+              <w:t xml:space="preserve">                Action:</w:t>
+              <w:br/>
+              <w:t xml:space="preserve">                  - 'sqs:ReceiveMessage'</w:t>
+              <w:br/>
+              <w:t xml:space="preserve">                  - 'sqs:DeleteMessage'</w:t>
+              <w:br/>
+              <w:t xml:space="preserve">                  - 'sqs:GetQueueAttributes'</w:t>
+              <w:br/>
+              <w:t xml:space="preserve">                Resource: !GetAtt HazardEventQueue.Arn</w:t>
+              <w:br/>
+              <w:t xml:space="preserve">              - Sid: SNSPublishAccess</w:t>
+              <w:br/>
+              <w:t xml:space="preserve">                Effect: Allow</w:t>
+              <w:br/>
+              <w:t xml:space="preserve">                Action: ['sns:Publish']</w:t>
+              <w:br/>
+              <w:t xml:space="preserve">                Resource: !Ref CriticalAlertsTopic</w:t>
+              <w:br/>
+              <w:br/>
+              <w:t xml:space="preserve">  RoadSenseHazardWorker:</w:t>
+              <w:br/>
+              <w:t xml:space="preserve">    Type: AWS::Lambda::Function</w:t>
+              <w:br/>
+              <w:t xml:space="preserve">    Properties:</w:t>
+              <w:br/>
+              <w:t xml:space="preserve">      FunctionName: !Sub '${EnvironmentName}-hazard-worker'</w:t>
+              <w:br/>
+              <w:t xml:space="preserve">      Description: 'Serverless event worker for automated triage scoring and SNS escalation'</w:t>
+              <w:br/>
+              <w:t xml:space="preserve">      Runtime: 'python3.11'</w:t>
+              <w:br/>
+              <w:t xml:space="preserve">      Handler: 'lambda_function.lambda_handler'</w:t>
+              <w:br/>
+              <w:t xml:space="preserve">      Role: !GetAtt LambdaExecutionRole.Arn</w:t>
+              <w:br/>
+              <w:t xml:space="preserve">      Timeout: 30</w:t>
+              <w:br/>
+              <w:t xml:space="preserve">      MemorySize: 256</w:t>
+              <w:br/>
+              <w:t xml:space="preserve">      Environment:</w:t>
+              <w:br/>
+              <w:t xml:space="preserve">        Variables:</w:t>
+              <w:br/>
+              <w:t xml:space="preserve">          SNS_TOPIC_ARN: !Ref CriticalAlertsTopic</w:t>
+              <w:br/>
+              <w:br/>
+              <w:t xml:space="preserve">  SQSEventSourceMapping:</w:t>
+              <w:br/>
+              <w:t xml:space="preserve">    Type: AWS::Lambda::EventSourceMapping</w:t>
+              <w:br/>
+              <w:t xml:space="preserve">    Properties:</w:t>
+              <w:br/>
+              <w:t xml:space="preserve">      EventSourceArn: !GetAtt HazardEventQueue.Arn</w:t>
+              <w:br/>
+              <w:t xml:space="preserve">      FunctionName: !Ref RoadSenseHazardWorker</w:t>
+              <w:br/>
+              <w:t xml:space="preserve">      BatchSize: 10</w:t>
+              <w:br/>
+              <w:t xml:space="preserve">      Enabled: true</w:t>
             </w:r>
           </w:p>
         </w:tc>
@@ -5679,7 +6029,7 @@
                 <w:color w:val="2563EB"/>
                 <w:sz w:val="22"/>
               </w:rPr>
-              <w:t>📷 EVIDENCE SCREENSHOT PLACEHOLDER: AMAZON SQS ASYNCHRONOUS INGESTION QUEUE</w:t>
+              <w:t>📷 EVIDENCE SCREENSHOT PLACEHOLDER: AMAZON SQS ASYNCHRONOUS INGESTION QUEUE (ROADSENSE-PROD-HAZARD-QUEUE)</w:t>
               <w:br/>
             </w:r>
           </w:p>
@@ -5701,7 +6051,7 @@
                 <w:color w:val="475569"/>
                 <w:sz w:val="18"/>
               </w:rPr>
-              <w:t>arn:aws:sqs:us-east-1:464817648755:roadsense-prod-hazard-processing-queue</w:t>
+              <w:t>arn:aws:sqs:us-east-1:464817648755:roadsense-prod-hazard-queue</w:t>
               <w:br/>
             </w:r>
             <w:r>
@@ -5716,7 +6066,7 @@
                 <w:color w:val="475569"/>
                 <w:sz w:val="18"/>
               </w:rPr>
-              <w:t>roadsense-prod-hazard-processing-queue</w:t>
+              <w:t>roadsense-prod-hazard-queue</w:t>
               <w:br/>
             </w:r>
             <w:r>
@@ -5731,7 +6081,7 @@
                 <w:color w:val="475569"/>
                 <w:sz w:val="18"/>
               </w:rPr>
-              <w:t>https://sqs.us-east-1.amazonaws.com/464817648755/roadsense-prod-hazard-processing-queue</w:t>
+              <w:t>https://sqs.us-east-1.amazonaws.com/464817648755/roadsense-prod-hazard-queue</w:t>
               <w:br/>
             </w:r>
             <w:r>
@@ -5825,7 +6175,7 @@
                 <w:color w:val="64748B"/>
                 <w:sz w:val="19"/>
               </w:rPr>
-              <w:t>Take a screenshot of the Amazon SQS Console displaying 'roadsense-prod-hazard-processing-queue' details and paste here.</w:t>
+              <w:t>Take a screenshot of the Amazon SQS Console displaying 'roadsense-prod-hazard-queue' details and paste here.</w:t>
             </w:r>
             <w:r>
               <w:rPr>
@@ -6064,7 +6414,7 @@
                 <w:color w:val="2563EB"/>
                 <w:sz w:val="22"/>
               </w:rPr>
-              <w:t>📷 EVIDENCE SCREENSHOT PLACEHOLDER: AWS LAMBDA SERVERLESS HAZARD TRIAGE WORKER</w:t>
+              <w:t>📷 EVIDENCE SCREENSHOT PLACEHOLDER: AWS LAMBDA SERVERLESS HAZARD TRIAGE WORKER (ROADSENSEHAZARDWORKER)</w:t>
               <w:br/>
             </w:r>
           </w:p>
@@ -6101,7 +6451,7 @@
                 <w:color w:val="475569"/>
                 <w:sz w:val="18"/>
               </w:rPr>
-              <w:t>RoadSenseHazardWorker</w:t>
+              <w:t>RoadSenseHazardWorker (Stack: roadsense-prod-hazard-worker)</w:t>
               <w:br/>
             </w:r>
             <w:r>
@@ -6131,7 +6481,7 @@
                 <w:color w:val="475569"/>
                 <w:sz w:val="18"/>
               </w:rPr>
-              <w:t>aws_lambda_worker.lambda_handler</w:t>
+              <w:t>lambda_function.lambda_handler</w:t>
               <w:br/>
             </w:r>
             <w:r>
@@ -6146,7 +6496,7 @@
                 <w:color w:val="475569"/>
                 <w:sz w:val="18"/>
               </w:rPr>
-              <w:t>Amazon SQS (BatchSize = 10, BatchingWindow = 5s)</w:t>
+              <w:t>Amazon SQS (roadsense-prod-hazard-queue, BatchSize = 10, State = Enabled)</w:t>
               <w:br/>
             </w:r>
             <w:r>
@@ -6154,14 +6504,14 @@
                 <w:b/>
                 <w:sz w:val="18"/>
               </w:rPr>
-              <w:t xml:space="preserve">• Partial Failure Handling: </w:t>
+              <w:t xml:space="preserve">• Trigger Mapping UUID: </w:t>
             </w:r>
             <w:r>
               <w:rPr>
                 <w:color w:val="475569"/>
                 <w:sz w:val="18"/>
               </w:rPr>
-              <w:t>ReportBatchItemFailures protocol enabled</w:t>
+              <w:t>cbaee3f5-95b2-4470-b6c9-65595c0ca02c</w:t>
               <w:br/>
             </w:r>
             <w:r>
@@ -6176,7 +6526,37 @@
                 <w:color w:val="475569"/>
                 <w:sz w:val="18"/>
               </w:rPr>
-              <w:t>arn:aws:iam::464817648755:role/RoadSenseLambdaWorkerRole</w:t>
+              <w:t>arn:aws:iam::464817648755:role/roadsense-prod-lambda-role</w:t>
+              <w:br/>
+            </w:r>
+            <w:r>
+              <w:rPr>
+                <w:b/>
+                <w:sz w:val="18"/>
+              </w:rPr>
+              <w:t xml:space="preserve">• CloudWatch Log Group: </w:t>
+            </w:r>
+            <w:r>
+              <w:rPr>
+                <w:color w:val="475569"/>
+                <w:sz w:val="18"/>
+              </w:rPr>
+              <w:t>/aws/lambda/RoadSenseHazardWorker</w:t>
+              <w:br/>
+            </w:r>
+            <w:r>
+              <w:rPr>
+                <w:b/>
+                <w:sz w:val="18"/>
+              </w:rPr>
+              <w:t xml:space="preserve">• Live Verification Status: </w:t>
+            </w:r>
+            <w:r>
+              <w:rPr>
+                <w:color w:val="475569"/>
+                <w:sz w:val="18"/>
+              </w:rPr>
+              <w:t>Active / Verified Invocations (200 OK, 2.6s duration, 65 MB max memory)</w:t>
               <w:br/>
             </w:r>
           </w:p>
@@ -6210,7 +6590,7 @@
                 <w:color w:val="64748B"/>
                 <w:sz w:val="19"/>
               </w:rPr>
-              <w:t>Take a screenshot of the AWS Lambda Console showing function 'RoadSenseHazardWorker' and its SQS trigger and paste here.</w:t>
+              <w:t>Take a screenshot of the AWS Lambda Console showing function 'RoadSenseHazardWorker' in us-east-1 with the SQS trigger and execution role 'roadsense-prod-lambda-role' and paste here.</w:t>
             </w:r>
             <w:r>
               <w:rPr>
@@ -6751,6 +7131,191 @@
                 <w:sz w:val="19"/>
               </w:rPr>
               <w:t>Take a screenshot of the AWS CloudWatch Dashboard 'RoadSense-Production-Dashboard' showing metric charts and paste here.</w:t>
+            </w:r>
+            <w:r>
+              <w:rPr>
+                <w:rFonts w:ascii="Consolas" w:hAnsi="Consolas"/>
+                <w:color w:val="94A3B8"/>
+                <w:sz w:val="17"/>
+              </w:rPr>
+              <w:t>└────────────────────────────────────────────────────────────────────────────────────────┘</w:t>
+            </w:r>
+          </w:p>
+        </w:tc>
+      </w:tr>
+    </w:tbl>
+    <w:p/>
+    <w:tbl>
+      <w:tblPr>
+        <w:tblW w:type="auto" w:w="0"/>
+        <w:jc w:val="center"/>
+        <w:tblLook w:firstColumn="1" w:firstRow="1" w:lastColumn="0" w:lastRow="0" w:noHBand="0" w:noVBand="1" w:val="04A0"/>
+      </w:tblPr>
+      <w:tblGrid>
+        <w:gridCol w:w="9360"/>
+      </w:tblGrid>
+      <w:tr>
+        <w:tc>
+          <w:tcPr>
+            <w:tcW w:type="dxa" w:w="9360"/>
+            <w:shd w:fill="F8FAFC"/>
+            <w:tcMar>
+              <w:top w:w="180" w:type="dxa"/>
+              <w:bottom w:w="180" w:type="dxa"/>
+              <w:left w:w="240" w:type="dxa"/>
+              <w:right w:w="240" w:type="dxa"/>
+            </w:tcMar>
+            <w:tcBorders>
+              <w:left w:val="single" w:sz="24" w:space="0" w:color="2563EB"/>
+              <w:top w:val="dashed" w:sz="12" w:space="0" w:color="94A3B8"/>
+              <w:right w:val="dashed" w:sz="12" w:space="0" w:color="94A3B8"/>
+              <w:bottom w:val="dashed" w:sz="12" w:space="0" w:color="94A3B8"/>
+            </w:tcBorders>
+          </w:tcPr>
+          <w:p>
+            <w:pPr>
+              <w:spacing w:before="40" w:after="80"/>
+              <w:jc w:val="left"/>
+            </w:pPr>
+            <w:r>
+              <w:rPr>
+                <w:rFonts w:ascii="Calibri" w:hAnsi="Calibri"/>
+                <w:b/>
+                <w:color w:val="2563EB"/>
+                <w:sz w:val="22"/>
+              </w:rPr>
+              <w:t>📷 EVIDENCE SCREENSHOT PLACEHOLDER: AWS CLOUDFORMATION INFRASTRUCTURE AS CODE TEMPLATE (ROADSENSE-CLOUDFORMATION.YAML)</w:t>
+              <w:br/>
+            </w:r>
+          </w:p>
+          <w:p>
+            <w:pPr>
+              <w:spacing w:before="40" w:after="40"/>
+              <w:jc w:val="left"/>
+            </w:pPr>
+            <w:r>
+              <w:rPr>
+                <w:b/>
+                <w:sz w:val="19"/>
+              </w:rPr>
+              <w:t xml:space="preserve">Target Resource Identifier / ARN: </w:t>
+            </w:r>
+            <w:r>
+              <w:rPr>
+                <w:rFonts w:ascii="Consolas" w:hAnsi="Consolas"/>
+                <w:color w:val="475569"/>
+                <w:sz w:val="18"/>
+              </w:rPr>
+              <w:t>aws/roadsense-cloudformation.yaml</w:t>
+              <w:br/>
+            </w:r>
+            <w:r>
+              <w:rPr>
+                <w:b/>
+                <w:sz w:val="18"/>
+              </w:rPr>
+              <w:t xml:space="preserve">• Template Name: </w:t>
+            </w:r>
+            <w:r>
+              <w:rPr>
+                <w:color w:val="475569"/>
+                <w:sz w:val="18"/>
+              </w:rPr>
+              <w:t>RoadSense Production CloudFormation Template</w:t>
+              <w:br/>
+            </w:r>
+            <w:r>
+              <w:rPr>
+                <w:b/>
+                <w:sz w:val="18"/>
+              </w:rPr>
+              <w:t xml:space="preserve">• Stack Scope: </w:t>
+            </w:r>
+            <w:r>
+              <w:rPr>
+                <w:color w:val="475569"/>
+                <w:sz w:val="18"/>
+              </w:rPr>
+              <w:t>10 Production Infrastructure Stacks (VPC, Subnets, EC2, S3, RDS, SQS, SNS, CloudWatch, SSM, Lambda)</w:t>
+              <w:br/>
+            </w:r>
+            <w:r>
+              <w:rPr>
+                <w:b/>
+                <w:sz w:val="18"/>
+              </w:rPr>
+              <w:t xml:space="preserve">• Serverless Resources: </w:t>
+            </w:r>
+            <w:r>
+              <w:rPr>
+                <w:color w:val="475569"/>
+                <w:sz w:val="18"/>
+              </w:rPr>
+              <w:t>LambdaExecutionRole, RoadSenseHazardWorker, SQSEventSourceMapping</w:t>
+              <w:br/>
+            </w:r>
+            <w:r>
+              <w:rPr>
+                <w:b/>
+                <w:sz w:val="18"/>
+              </w:rPr>
+              <w:t xml:space="preserve">• Security Standard: </w:t>
+            </w:r>
+            <w:r>
+              <w:rPr>
+                <w:color w:val="475569"/>
+                <w:sz w:val="18"/>
+              </w:rPr>
+              <w:t>IAM Least Privilege, KMS SSM Encryption, Private Subnet DB Isolation</w:t>
+              <w:br/>
+            </w:r>
+            <w:r>
+              <w:rPr>
+                <w:b/>
+                <w:sz w:val="18"/>
+              </w:rPr>
+              <w:t xml:space="preserve">• Deployment Method: </w:t>
+            </w:r>
+            <w:r>
+              <w:rPr>
+                <w:color w:val="475569"/>
+                <w:sz w:val="18"/>
+              </w:rPr>
+              <w:t>AWS CLI / CloudFormation Console Stacks</w:t>
+              <w:br/>
+            </w:r>
+          </w:p>
+          <w:p>
+            <w:pPr>
+              <w:spacing w:before="280" w:after="200"/>
+              <w:jc w:val="center"/>
+            </w:pPr>
+            <w:r>
+              <w:rPr>
+                <w:rFonts w:ascii="Consolas" w:hAnsi="Consolas"/>
+                <w:color w:val="94A3B8"/>
+                <w:sz w:val="17"/>
+              </w:rPr>
+              <w:t>┌────────────────────────────────────────────────────────────────────────────────────────┐</w:t>
+              <w:br/>
+            </w:r>
+            <w:r>
+              <w:rPr>
+                <w:rFonts w:ascii="Calibri" w:hAnsi="Calibri"/>
+                <w:b/>
+                <w:color w:val="475569"/>
+                <w:sz w:val="22"/>
+              </w:rPr>
+              <w:t>PASTE YOUR AWS CONSOLE SCREENSHOT HERE</w:t>
+              <w:br/>
+            </w:r>
+            <w:r>
+              <w:rPr>
+                <w:i/>
+                <w:color w:val="64748B"/>
+                <w:sz w:val="19"/>
+              </w:rPr>
+              <w:t>Take a screenshot of the AWS CloudFormation Console showing the stack resources or template designer with Section 10 Lambda &amp; SQS Event Source Mapping and paste here.</w:t>
             </w:r>
             <w:r>
               <w:rPr>

</xml_diff>

<commit_message>
fix(aws): relocate SQS access policy to aws/sqs_access_policy.json and update report reference
</commit_message>
<xml_diff>
--- a/RoadSense_Cloud_Architecture_Report.docx
+++ b/RoadSense_Cloud_Architecture_Report.docx
@@ -4371,7 +4371,20 @@
           <w:color w:val="6D28D9"/>
           <w:sz w:val="27"/>
         </w:rPr>
-        <w:t>6.6 Amazon SQS Resource-Based Access Policy (lib/backend/sqs_access_policy.json)</w:t>
+        <w:t>6.6 Amazon SQS Resource-Based Access Policy (aws/sqs_access_policy.json)</w:t>
+      </w:r>
+    </w:p>
+    <w:p>
+      <w:pPr>
+        <w:spacing w:before="0" w:after="120" w:line="276" w:lineRule="auto"/>
+      </w:pPr>
+      <w:r>
+        <w:rPr>
+          <w:rFonts w:ascii="Calibri" w:hAnsi="Calibri"/>
+          <w:color w:val="334155"/>
+          <w:sz w:val="21"/>
+        </w:rPr>
+        <w:t>Configured directly on the Amazon SQS queue in AWS (arn:aws:sqs:us-east-1:464817648755:roadsense-prod-hazard-queue). Grants least-privilege queue access to the EC2 backend role, SNS fan-out service, and serverless Lambda worker:</w:t>
       </w:r>
     </w:p>
     <w:p>
@@ -4385,7 +4398,7 @@
           <w:color w:val="64748B"/>
           <w:sz w:val="18"/>
         </w:rPr>
-        <w:t>Source Listing: lib/backend/sqs_access_policy.json</w:t>
+        <w:t>Source Listing: aws/sqs_access_policy.json</w:t>
       </w:r>
     </w:p>
     <w:tbl>
@@ -4429,11 +4442,13 @@
               <w:br/>
               <w:t xml:space="preserve">  "Version": "2012-10-17",</w:t>
               <w:br/>
+              <w:t xml:space="preserve">  "Id": "RoadSenseProdHazardQueuePolicy",</w:t>
+              <w:br/>
               <w:t xml:space="preserve">  "Statement": [</w:t>
               <w:br/>
               <w:t xml:space="preserve">    {</w:t>
               <w:br/>
-              <w:t xml:space="preserve">      "Sid": "AllowEC2AndLambdaQueueAccess",</w:t>
+              <w:t xml:space="preserve">      "Sid": "AllowEC2AndBackendSendMessages",</w:t>
               <w:br/>
               <w:t xml:space="preserve">      "Effect": "Allow",</w:t>
               <w:br/>
@@ -4443,7 +4458,7 @@
               <w:br/>
               <w:t xml:space="preserve">          "arn:aws:iam::464817648755:role/roadsense-prod-ec2-role",</w:t>
               <w:br/>
-              <w:t xml:space="preserve">          "arn:aws:iam::464817648755:role/roadsense-prod-lambda-role"</w:t>
+              <w:t xml:space="preserve">          "arn:aws:iam::464817648755:root"</w:t>
               <w:br/>
               <w:t xml:space="preserve">        ]</w:t>
               <w:br/>
@@ -4452,6 +4467,58 @@
               <w:t xml:space="preserve">      "Action": [</w:t>
               <w:br/>
               <w:t xml:space="preserve">        "sqs:SendMessage",</w:t>
+              <w:br/>
+              <w:t xml:space="preserve">        "sqs:GetQueueUrl",</w:t>
+              <w:br/>
+              <w:t xml:space="preserve">        "sqs:GetQueueAttributes"</w:t>
+              <w:br/>
+              <w:t xml:space="preserve">      ],</w:t>
+              <w:br/>
+              <w:t xml:space="preserve">      "Resource": "arn:aws:sqs:us-east-1:464817648755:roadsense-prod-hazard-queue"</w:t>
+              <w:br/>
+              <w:t xml:space="preserve">    },</w:t>
+              <w:br/>
+              <w:t xml:space="preserve">    {</w:t>
+              <w:br/>
+              <w:t xml:space="preserve">      "Sid": "AllowSNSTopicFanOut",</w:t>
+              <w:br/>
+              <w:t xml:space="preserve">      "Effect": "Allow",</w:t>
+              <w:br/>
+              <w:t xml:space="preserve">      "Principal": {</w:t>
+              <w:br/>
+              <w:t xml:space="preserve">        "Service": "sns.amazonaws.com"</w:t>
+              <w:br/>
+              <w:t xml:space="preserve">      },</w:t>
+              <w:br/>
+              <w:t xml:space="preserve">      "Action": "sqs:SendMessage",</w:t>
+              <w:br/>
+              <w:t xml:space="preserve">      "Resource": "arn:aws:sqs:us-east-1:464817648755:roadsense-prod-hazard-queue",</w:t>
+              <w:br/>
+              <w:t xml:space="preserve">      "Condition": {</w:t>
+              <w:br/>
+              <w:t xml:space="preserve">        "ArnEquals": {</w:t>
+              <w:br/>
+              <w:t xml:space="preserve">          "aws:SourceArn": "arn:aws:sns:us-east-1:464817648755:roadsense-prod-critical-alerts"</w:t>
+              <w:br/>
+              <w:t xml:space="preserve">        }</w:t>
+              <w:br/>
+              <w:t xml:space="preserve">      }</w:t>
+              <w:br/>
+              <w:t xml:space="preserve">    },</w:t>
+              <w:br/>
+              <w:t xml:space="preserve">    {</w:t>
+              <w:br/>
+              <w:t xml:space="preserve">      "Sid": "AllowLambdaServiceConsumeAndPoll",</w:t>
+              <w:br/>
+              <w:t xml:space="preserve">      "Effect": "Allow",</w:t>
+              <w:br/>
+              <w:t xml:space="preserve">      "Principal": {</w:t>
+              <w:br/>
+              <w:t xml:space="preserve">        "Service": "lambda.amazonaws.com"</w:t>
+              <w:br/>
+              <w:t xml:space="preserve">      },</w:t>
+              <w:br/>
+              <w:t xml:space="preserve">      "Action": [</w:t>
               <w:br/>
               <w:t xml:space="preserve">        "sqs:ReceiveMessage",</w:t>
               <w:br/>

</xml_diff>

<commit_message>
docs: include comprehensive Amazon VPC architecture, subnets, IGW, and security groups in final PDF report
</commit_message>
<xml_diff>
--- a/RoadSense_Cloud_Architecture_Report.docx
+++ b/RoadSense_Cloud_Architecture_Report.docx
@@ -618,6 +618,222 @@
                 <w:sz w:val="18"/>
               </w:rPr>
               <w:t>464817648755</w:t>
+            </w:r>
+          </w:p>
+        </w:tc>
+      </w:tr>
+      <w:tr>
+        <w:tc>
+          <w:tcPr>
+            <w:tcW w:type="dxa" w:w="3600"/>
+            <w:shd w:fill="FFFFFF"/>
+            <w:tcMar>
+              <w:top w:w="100" w:type="dxa"/>
+              <w:bottom w:w="100" w:type="dxa"/>
+              <w:left w:w="140" w:type="dxa"/>
+              <w:right w:w="140" w:type="dxa"/>
+            </w:tcMar>
+          </w:tcPr>
+          <w:p>
+            <w:pPr>
+              <w:spacing w:before="0" w:after="0"/>
+              <w:jc w:val="left"/>
+            </w:pPr>
+            <w:r>
+              <w:rPr>
+                <w:rFonts w:ascii="Calibri" w:hAnsi="Calibri"/>
+                <w:color w:val="1E293B"/>
+                <w:sz w:val="18"/>
+              </w:rPr>
+              <w:t>Amazon Virtual Private Cloud (VPC)</w:t>
+            </w:r>
+          </w:p>
+        </w:tc>
+        <w:tc>
+          <w:tcPr>
+            <w:tcW w:type="dxa" w:w="5760"/>
+            <w:shd w:fill="FFFFFF"/>
+            <w:tcMar>
+              <w:top w:w="100" w:type="dxa"/>
+              <w:bottom w:w="100" w:type="dxa"/>
+              <w:left w:w="140" w:type="dxa"/>
+              <w:right w:w="140" w:type="dxa"/>
+            </w:tcMar>
+          </w:tcPr>
+          <w:p>
+            <w:pPr>
+              <w:spacing w:before="0" w:after="0"/>
+              <w:jc w:val="left"/>
+            </w:pPr>
+            <w:r>
+              <w:rPr>
+                <w:rFonts w:ascii="Calibri" w:hAnsi="Calibri"/>
+                <w:color w:val="1E293B"/>
+                <w:sz w:val="18"/>
+              </w:rPr>
+              <w:t>roadsense-prod-vpc (vpc-07f6005772fe7740a, CIDR: 10.0.0.0/16)</w:t>
+            </w:r>
+          </w:p>
+        </w:tc>
+      </w:tr>
+      <w:tr>
+        <w:tc>
+          <w:tcPr>
+            <w:tcW w:type="dxa" w:w="3600"/>
+            <w:shd w:fill="F8FAFC"/>
+            <w:tcMar>
+              <w:top w:w="100" w:type="dxa"/>
+              <w:bottom w:w="100" w:type="dxa"/>
+              <w:left w:w="140" w:type="dxa"/>
+              <w:right w:w="140" w:type="dxa"/>
+            </w:tcMar>
+          </w:tcPr>
+          <w:p>
+            <w:pPr>
+              <w:spacing w:before="0" w:after="0"/>
+              <w:jc w:val="left"/>
+            </w:pPr>
+            <w:r>
+              <w:rPr>
+                <w:rFonts w:ascii="Calibri" w:hAnsi="Calibri"/>
+                <w:color w:val="1E293B"/>
+                <w:sz w:val="18"/>
+              </w:rPr>
+              <w:t>VPC Subnet Topology</w:t>
+            </w:r>
+          </w:p>
+        </w:tc>
+        <w:tc>
+          <w:tcPr>
+            <w:tcW w:type="dxa" w:w="5760"/>
+            <w:shd w:fill="F8FAFC"/>
+            <w:tcMar>
+              <w:top w:w="100" w:type="dxa"/>
+              <w:bottom w:w="100" w:type="dxa"/>
+              <w:left w:w="140" w:type="dxa"/>
+              <w:right w:w="140" w:type="dxa"/>
+            </w:tcMar>
+          </w:tcPr>
+          <w:p>
+            <w:pPr>
+              <w:spacing w:before="0" w:after="0"/>
+              <w:jc w:val="left"/>
+            </w:pPr>
+            <w:r>
+              <w:rPr>
+                <w:rFonts w:ascii="Calibri" w:hAnsi="Calibri"/>
+                <w:color w:val="1E293B"/>
+                <w:sz w:val="18"/>
+              </w:rPr>
+              <w:t>4 Subnets (Public: 10.0.1.0/24 &amp; 10.0.2.0/24; Private: 10.0.10.0/24 &amp; 10.0.11.0/24)</w:t>
+            </w:r>
+          </w:p>
+        </w:tc>
+      </w:tr>
+      <w:tr>
+        <w:tc>
+          <w:tcPr>
+            <w:tcW w:type="dxa" w:w="3600"/>
+            <w:shd w:fill="FFFFFF"/>
+            <w:tcMar>
+              <w:top w:w="100" w:type="dxa"/>
+              <w:bottom w:w="100" w:type="dxa"/>
+              <w:left w:w="140" w:type="dxa"/>
+              <w:right w:w="140" w:type="dxa"/>
+            </w:tcMar>
+          </w:tcPr>
+          <w:p>
+            <w:pPr>
+              <w:spacing w:before="0" w:after="0"/>
+              <w:jc w:val="left"/>
+            </w:pPr>
+            <w:r>
+              <w:rPr>
+                <w:rFonts w:ascii="Calibri" w:hAnsi="Calibri"/>
+                <w:color w:val="1E293B"/>
+                <w:sz w:val="18"/>
+              </w:rPr>
+              <w:t>VPC Internet Gateway &amp; Routing</w:t>
+            </w:r>
+          </w:p>
+        </w:tc>
+        <w:tc>
+          <w:tcPr>
+            <w:tcW w:type="dxa" w:w="5760"/>
+            <w:shd w:fill="FFFFFF"/>
+            <w:tcMar>
+              <w:top w:w="100" w:type="dxa"/>
+              <w:bottom w:w="100" w:type="dxa"/>
+              <w:left w:w="140" w:type="dxa"/>
+              <w:right w:w="140" w:type="dxa"/>
+            </w:tcMar>
+          </w:tcPr>
+          <w:p>
+            <w:pPr>
+              <w:spacing w:before="0" w:after="0"/>
+              <w:jc w:val="left"/>
+            </w:pPr>
+            <w:r>
+              <w:rPr>
+                <w:rFonts w:ascii="Calibri" w:hAnsi="Calibri"/>
+                <w:color w:val="1E293B"/>
+                <w:sz w:val="18"/>
+              </w:rPr>
+              <w:t>roadsense-prod-igw (igw-062944e539e92cbab), Public RT (0.0.0.0/0 -&gt; IGW), Private RT (Local)</w:t>
+            </w:r>
+          </w:p>
+        </w:tc>
+      </w:tr>
+      <w:tr>
+        <w:tc>
+          <w:tcPr>
+            <w:tcW w:type="dxa" w:w="3600"/>
+            <w:shd w:fill="F8FAFC"/>
+            <w:tcMar>
+              <w:top w:w="100" w:type="dxa"/>
+              <w:bottom w:w="100" w:type="dxa"/>
+              <w:left w:w="140" w:type="dxa"/>
+              <w:right w:w="140" w:type="dxa"/>
+            </w:tcMar>
+          </w:tcPr>
+          <w:p>
+            <w:pPr>
+              <w:spacing w:before="0" w:after="0"/>
+              <w:jc w:val="left"/>
+            </w:pPr>
+            <w:r>
+              <w:rPr>
+                <w:rFonts w:ascii="Calibri" w:hAnsi="Calibri"/>
+                <w:color w:val="1E293B"/>
+                <w:sz w:val="18"/>
+              </w:rPr>
+              <w:t>Network Security Groups</w:t>
+            </w:r>
+          </w:p>
+        </w:tc>
+        <w:tc>
+          <w:tcPr>
+            <w:tcW w:type="dxa" w:w="5760"/>
+            <w:shd w:fill="F8FAFC"/>
+            <w:tcMar>
+              <w:top w:w="100" w:type="dxa"/>
+              <w:bottom w:w="100" w:type="dxa"/>
+              <w:left w:w="140" w:type="dxa"/>
+              <w:right w:w="140" w:type="dxa"/>
+            </w:tcMar>
+          </w:tcPr>
+          <w:p>
+            <w:pPr>
+              <w:spacing w:before="0" w:after="0"/>
+              <w:jc w:val="left"/>
+            </w:pPr>
+            <w:r>
+              <w:rPr>
+                <w:rFonts w:ascii="Calibri" w:hAnsi="Calibri"/>
+                <w:color w:val="1E293B"/>
+                <w:sz w:val="18"/>
+              </w:rPr>
+              <w:t>roadsense-prod-ec2-sg (80, 6969, 22), roadsense-prod-rds-sg (5432 restricted to EC2 SG)</w:t>
             </w:r>
           </w:p>
         </w:tc>
@@ -1652,7 +1868,128 @@
           <w:color w:val="6D28D9"/>
           <w:sz w:val="27"/>
         </w:rPr>
-        <w:t>3.1 Amazon EC2 Compute &amp; Ingestion Layer</w:t>
+        <w:t>3.1 Amazon VPC Custom Networking, Subnet Topology &amp; Security Groups</w:t>
+      </w:r>
+    </w:p>
+    <w:p>
+      <w:pPr>
+        <w:spacing w:before="0" w:after="120" w:line="276" w:lineRule="auto"/>
+      </w:pPr>
+      <w:r>
+        <w:rPr>
+          <w:rFonts w:ascii="Calibri" w:hAnsi="Calibri"/>
+          <w:color w:val="334155"/>
+          <w:sz w:val="21"/>
+        </w:rPr>
+        <w:t>RoadSense rejects default public cloud networking in favor of a customized, isolated Amazon Virtual Private Cloud (VPC) provisioned via CloudFormation in AWS us-east-1:</w:t>
+      </w:r>
+    </w:p>
+    <w:p>
+      <w:pPr>
+        <w:pStyle w:val="ListBullet"/>
+        <w:spacing w:before="0" w:after="60" w:line="276" w:lineRule="auto"/>
+      </w:pPr>
+      <w:r>
+        <w:rPr>
+          <w:rFonts w:ascii="Calibri" w:hAnsi="Calibri"/>
+          <w:b/>
+          <w:color w:val="0F172A"/>
+          <w:sz w:val="20"/>
+        </w:rPr>
+        <w:t xml:space="preserve">VPC Architecture &amp; CIDR: </w:t>
+      </w:r>
+      <w:r>
+        <w:rPr>
+          <w:rFonts w:ascii="Calibri" w:hAnsi="Calibri"/>
+          <w:color w:val="334155"/>
+          <w:sz w:val="20"/>
+        </w:rPr>
+        <w:t>VPC Name: roadsense-prod-vpc (ID: vpc-07f6005772fe7740a), IPv4 CIDR Block: 10.0.0.0/16. Configured with EnableDnsSupport=true and EnableDnsHostnames=true to guarantee seamless internal microservice name resolution.</w:t>
+      </w:r>
+    </w:p>
+    <w:p>
+      <w:pPr>
+        <w:pStyle w:val="ListBullet"/>
+        <w:spacing w:before="0" w:after="60" w:line="276" w:lineRule="auto"/>
+      </w:pPr>
+      <w:r>
+        <w:rPr>
+          <w:rFonts w:ascii="Calibri" w:hAnsi="Calibri"/>
+          <w:b/>
+          <w:color w:val="0F172A"/>
+          <w:sz w:val="20"/>
+        </w:rPr>
+        <w:t xml:space="preserve">Multi-AZ Subnet Partitioning: </w:t>
+      </w:r>
+      <w:r>
+        <w:rPr>
+          <w:rFonts w:ascii="Calibri" w:hAnsi="Calibri"/>
+          <w:color w:val="334155"/>
+          <w:sz w:val="20"/>
+        </w:rPr>
+        <w:t>The network is partitioned into four distinct subnets across two Availability Zones (us-east-1a and us-east-1b) for fault tolerance: Two Public Subnets (roadsense-prod-public-1 [10.0.1.0/24] and roadsense-prod-public-2 [10.0.2.0/24]) with auto-assign public IPv4 for compute ingress; and Two Private Subnets (roadsense-prod-private-1 [10.0.10.0/24] and roadsense-prod-private-2 [10.0.11.0/24]) for complete database isolation.</w:t>
+      </w:r>
+    </w:p>
+    <w:p>
+      <w:pPr>
+        <w:pStyle w:val="ListBullet"/>
+        <w:spacing w:before="0" w:after="60" w:line="276" w:lineRule="auto"/>
+      </w:pPr>
+      <w:r>
+        <w:rPr>
+          <w:rFonts w:ascii="Calibri" w:hAnsi="Calibri"/>
+          <w:b/>
+          <w:color w:val="0F172A"/>
+          <w:sz w:val="20"/>
+        </w:rPr>
+        <w:t xml:space="preserve">Internet Gateway &amp; Route Segregation: </w:t>
+      </w:r>
+      <w:r>
+        <w:rPr>
+          <w:rFonts w:ascii="Calibri" w:hAnsi="Calibri"/>
+          <w:color w:val="334155"/>
+          <w:sz w:val="20"/>
+        </w:rPr>
+        <w:t>An Internet Gateway (roadsense-prod-igw [igw-062944e539e92cbab]) is attached to the VPC. The Public Route Table (roadsense-prod-public-rt) routes 0.0.0.0/0 traffic to the IGW. The Private Route Table (roadsense-prod-private-rt) maintains local-only (10.0.0.0/16) routing with zero direct internet access, guaranteeing that the database tier remains completely air-gapped from external threats.</w:t>
+      </w:r>
+    </w:p>
+    <w:p>
+      <w:pPr>
+        <w:pStyle w:val="ListBullet"/>
+        <w:spacing w:before="0" w:after="60" w:line="276" w:lineRule="auto"/>
+      </w:pPr>
+      <w:r>
+        <w:rPr>
+          <w:rFonts w:ascii="Calibri" w:hAnsi="Calibri"/>
+          <w:b/>
+          <w:color w:val="0F172A"/>
+          <w:sz w:val="20"/>
+        </w:rPr>
+        <w:t xml:space="preserve">Tiered Security Groups: </w:t>
+      </w:r>
+      <w:r>
+        <w:rPr>
+          <w:rFonts w:ascii="Calibri" w:hAnsi="Calibri"/>
+          <w:color w:val="334155"/>
+          <w:sz w:val="20"/>
+        </w:rPr>
+        <w:t>roadsense-prod-ec2-sg (sg-0ef26a47fbf2ec5d4) allows inbound TCP 80 (Nginx), TCP 6969 (Flask REST API), and TCP 22 (SSH with keypair). roadsense-prod-rds-sg (sg-0d8064e195ad8cb83) permits inbound PostgreSQL TCP 5432 strictly from the EC2 security group ID—blocking all public and unauthorized traffic.</w:t>
+      </w:r>
+    </w:p>
+    <w:p>
+      <w:pPr>
+        <w:pStyle w:val="Heading2"/>
+        <w:keepNext/>
+        <w:spacing w:before="240" w:after="80"/>
+      </w:pPr>
+      <w:r>
+        <w:rPr>
+          <w:rFonts w:ascii="Calibri" w:hAnsi="Calibri"/>
+          <w:b/>
+          <w:color w:val="6D28D9"/>
+          <w:sz w:val="27"/>
+        </w:rPr>
+        <w:t>3.2 Amazon EC2 Compute &amp; Ingestion Layer</w:t>
       </w:r>
     </w:p>
     <w:p>
@@ -1688,7 +2025,7 @@
           <w:color w:val="334155"/>
           <w:sz w:val="20"/>
         </w:rPr>
-        <w:t>Ubuntu 24.04 LTS (x86_64), Elastic IP 44.215.69.114.</w:t>
+        <w:t>Ubuntu 24.04 LTS (x86_64), Elastic IP 44.215.69.114, hosted in public subnet roadsense-prod-public-1 (10.0.1.195).</w:t>
       </w:r>
     </w:p>
     <w:p>
@@ -1773,7 +2110,7 @@
           <w:color w:val="6D28D9"/>
           <w:sz w:val="27"/>
         </w:rPr>
-        <w:t>3.2 Amazon S3 Scalable Asset Store &amp; CDN Invalidation</w:t>
+        <w:t>3.3 Amazon S3 Scalable Asset Store &amp; CDN Invalidation</w:t>
       </w:r>
     </w:p>
     <w:p>
@@ -1894,7 +2231,7 @@
           <w:color w:val="6D28D9"/>
           <w:sz w:val="27"/>
         </w:rPr>
-        <w:t>3.3 Amazon SQS Decoupled Ingestion &amp; Resilient Queuing</w:t>
+        <w:t>3.4 Amazon SQS Decoupled Ingestion &amp; Resilient Queuing</w:t>
       </w:r>
     </w:p>
     <w:p>
@@ -2015,7 +2352,7 @@
           <w:color w:val="6D28D9"/>
           <w:sz w:val="27"/>
         </w:rPr>
-        <w:t>3.4 AWS Lambda Serverless Event Worker &amp; Triage Engine</w:t>
+        <w:t>3.5 AWS Lambda Serverless Event Worker &amp; Triage Engine</w:t>
       </w:r>
     </w:p>
     <w:p>
@@ -2159,7 +2496,7 @@
           <w:color w:val="6D28D9"/>
           <w:sz w:val="27"/>
         </w:rPr>
-        <w:t>3.5 Amazon SNS Multi-Protocol Emergency Fan-Out</w:t>
+        <w:t>3.6 Amazon SNS Multi-Protocol Emergency Fan-Out</w:t>
       </w:r>
     </w:p>
     <w:p>
@@ -2221,7 +2558,7 @@
           <w:color w:val="6D28D9"/>
           <w:sz w:val="27"/>
         </w:rPr>
-        <w:t>3.6 Amazon RDS PostgreSQL Spatial Database</w:t>
+        <w:t>3.7 Amazon RDS PostgreSQL Spatial Database</w:t>
       </w:r>
     </w:p>
     <w:p>
@@ -2244,7 +2581,7 @@
           <w:color w:val="334155"/>
           <w:sz w:val="20"/>
         </w:rPr>
-        <w:t>Managed PostgreSQL 16 engine configured with PostGIS spatial extensions. Handles transactional ACID operations, spatial geospatial indexing (ST_DWithin), and automated daily snapshots with point-in-time recovery.</w:t>
+        <w:t>Managed PostgreSQL 18.3 engine (db.t3.micro) provisioned in private subnets (roadsense-prod-private-1 and roadsense-prod-private-2) within DB Subnet Group 'roadsense-cloud-production-dbsubnetgroup-7rnhfbsodqef'. PubliclyAccessible=false, accepting TCP 5432 strictly from the EC2 security group.</w:t>
       </w:r>
     </w:p>
     <w:p>
@@ -2260,7 +2597,7 @@
           <w:color w:val="6D28D9"/>
           <w:sz w:val="27"/>
         </w:rPr>
-        <w:t>3.7 AWS Systems Manager (SSM) Parameter Store &amp; Zero-Hardcoding Security</w:t>
+        <w:t>3.8 AWS Systems Manager (SSM) Parameter Store &amp; Zero-Hardcoding Security</w:t>
       </w:r>
     </w:p>
     <w:p>
@@ -2460,7 +2797,7 @@
                 <w:color w:val="1E293B"/>
                 <w:sz w:val="18"/>
               </w:rPr>
-              <w:t>Amazon SQS (Decoupled Queue)</w:t>
+              <w:t>Amazon VPC &amp; Multi-AZ Network Isolation</w:t>
             </w:r>
           </w:p>
         </w:tc>
@@ -2486,7 +2823,7 @@
                 <w:color w:val="1E293B"/>
                 <w:sz w:val="18"/>
               </w:rPr>
-              <w:t>Synchronous HTTP REST API Processing</w:t>
+              <w:t>Default AWS VPC / Single Flat Network</w:t>
             </w:r>
           </w:p>
         </w:tc>
@@ -2512,6 +2849,112 @@
                 <w:color w:val="1E293B"/>
                 <w:sz w:val="18"/>
               </w:rPr>
+              <w:t>Default VPCs place all resources in public subnets with direct internet-routable IPs, exposing relational databases and microservices to public port scanning and brute-force vulnerabilities.</w:t>
+            </w:r>
+          </w:p>
+        </w:tc>
+        <w:tc>
+          <w:tcPr>
+            <w:tcW w:type="dxa" w:w="2736"/>
+            <w:shd w:fill="FFFFFF"/>
+            <w:tcMar>
+              <w:top w:w="100" w:type="dxa"/>
+              <w:bottom w:w="100" w:type="dxa"/>
+              <w:left w:w="140" w:type="dxa"/>
+              <w:right w:w="140" w:type="dxa"/>
+            </w:tcMar>
+          </w:tcPr>
+          <w:p>
+            <w:pPr>
+              <w:spacing w:before="0" w:after="0"/>
+              <w:jc w:val="left"/>
+            </w:pPr>
+            <w:r>
+              <w:rPr>
+                <w:rFonts w:ascii="Calibri" w:hAnsi="Calibri"/>
+                <w:color w:val="1E293B"/>
+                <w:sz w:val="18"/>
+              </w:rPr>
+              <w:t>Enforces defense-in-depth isolation: places PostgreSQL RDS in air-gapped private subnets (no public IPs), routes compute ingress via custom IGW, and eliminates expensive NAT Gateways ($32.40/mo) for 100% Free Tier compliance.</w:t>
+            </w:r>
+          </w:p>
+        </w:tc>
+      </w:tr>
+      <w:tr>
+        <w:tc>
+          <w:tcPr>
+            <w:tcW w:type="dxa" w:w="2016"/>
+            <w:shd w:fill="F8FAFC"/>
+            <w:tcMar>
+              <w:top w:w="100" w:type="dxa"/>
+              <w:bottom w:w="100" w:type="dxa"/>
+              <w:left w:w="140" w:type="dxa"/>
+              <w:right w:w="140" w:type="dxa"/>
+            </w:tcMar>
+          </w:tcPr>
+          <w:p>
+            <w:pPr>
+              <w:spacing w:before="0" w:after="0"/>
+              <w:jc w:val="left"/>
+            </w:pPr>
+            <w:r>
+              <w:rPr>
+                <w:rFonts w:ascii="Calibri" w:hAnsi="Calibri"/>
+                <w:color w:val="1E293B"/>
+                <w:sz w:val="18"/>
+              </w:rPr>
+              <w:t>Amazon SQS (Decoupled Queue)</w:t>
+            </w:r>
+          </w:p>
+        </w:tc>
+        <w:tc>
+          <w:tcPr>
+            <w:tcW w:type="dxa" w:w="2016"/>
+            <w:shd w:fill="F8FAFC"/>
+            <w:tcMar>
+              <w:top w:w="100" w:type="dxa"/>
+              <w:bottom w:w="100" w:type="dxa"/>
+              <w:left w:w="140" w:type="dxa"/>
+              <w:right w:w="140" w:type="dxa"/>
+            </w:tcMar>
+          </w:tcPr>
+          <w:p>
+            <w:pPr>
+              <w:spacing w:before="0" w:after="0"/>
+              <w:jc w:val="left"/>
+            </w:pPr>
+            <w:r>
+              <w:rPr>
+                <w:rFonts w:ascii="Calibri" w:hAnsi="Calibri"/>
+                <w:color w:val="1E293B"/>
+                <w:sz w:val="18"/>
+              </w:rPr>
+              <w:t>Synchronous HTTP REST API Processing</w:t>
+            </w:r>
+          </w:p>
+        </w:tc>
+        <w:tc>
+          <w:tcPr>
+            <w:tcW w:type="dxa" w:w="2592"/>
+            <w:shd w:fill="F8FAFC"/>
+            <w:tcMar>
+              <w:top w:w="100" w:type="dxa"/>
+              <w:bottom w:w="100" w:type="dxa"/>
+              <w:left w:w="140" w:type="dxa"/>
+              <w:right w:w="140" w:type="dxa"/>
+            </w:tcMar>
+          </w:tcPr>
+          <w:p>
+            <w:pPr>
+              <w:spacing w:before="0" w:after="0"/>
+              <w:jc w:val="left"/>
+            </w:pPr>
+            <w:r>
+              <w:rPr>
+                <w:rFonts w:ascii="Calibri" w:hAnsi="Calibri"/>
+                <w:color w:val="1E293B"/>
+                <w:sz w:val="18"/>
+              </w:rPr>
               <w:t>High concurrency causes database connection starvation, 504 Gateway Timeouts, and catastrophic message loss during weather crises.</w:t>
             </w:r>
           </w:p>
@@ -2519,7 +2962,7 @@
         <w:tc>
           <w:tcPr>
             <w:tcW w:type="dxa" w:w="2736"/>
-            <w:shd w:fill="FFFFFF"/>
+            <w:shd w:fill="F8FAFC"/>
             <w:tcMar>
               <w:top w:w="100" w:type="dxa"/>
               <w:bottom w:w="100" w:type="dxa"/>
@@ -2547,7 +2990,7 @@
         <w:tc>
           <w:tcPr>
             <w:tcW w:type="dxa" w:w="2016"/>
-            <w:shd w:fill="F8FAFC"/>
+            <w:shd w:fill="FFFFFF"/>
             <w:tcMar>
               <w:top w:w="100" w:type="dxa"/>
               <w:bottom w:w="100" w:type="dxa"/>
@@ -2573,7 +3016,7 @@
         <w:tc>
           <w:tcPr>
             <w:tcW w:type="dxa" w:w="2016"/>
-            <w:shd w:fill="F8FAFC"/>
+            <w:shd w:fill="FFFFFF"/>
             <w:tcMar>
               <w:top w:w="100" w:type="dxa"/>
               <w:bottom w:w="100" w:type="dxa"/>
@@ -2599,7 +3042,7 @@
         <w:tc>
           <w:tcPr>
             <w:tcW w:type="dxa" w:w="2592"/>
-            <w:shd w:fill="F8FAFC"/>
+            <w:shd w:fill="FFFFFF"/>
             <w:tcMar>
               <w:top w:w="100" w:type="dxa"/>
               <w:bottom w:w="100" w:type="dxa"/>
@@ -2625,7 +3068,7 @@
         <w:tc>
           <w:tcPr>
             <w:tcW w:type="dxa" w:w="2736"/>
-            <w:shd w:fill="F8FAFC"/>
+            <w:shd w:fill="FFFFFF"/>
             <w:tcMar>
               <w:top w:w="100" w:type="dxa"/>
               <w:bottom w:w="100" w:type="dxa"/>
@@ -2653,7 +3096,7 @@
         <w:tc>
           <w:tcPr>
             <w:tcW w:type="dxa" w:w="2016"/>
-            <w:shd w:fill="FFFFFF"/>
+            <w:shd w:fill="F8FAFC"/>
             <w:tcMar>
               <w:top w:w="100" w:type="dxa"/>
               <w:bottom w:w="100" w:type="dxa"/>
@@ -2679,7 +3122,7 @@
         <w:tc>
           <w:tcPr>
             <w:tcW w:type="dxa" w:w="2016"/>
-            <w:shd w:fill="FFFFFF"/>
+            <w:shd w:fill="F8FAFC"/>
             <w:tcMar>
               <w:top w:w="100" w:type="dxa"/>
               <w:bottom w:w="100" w:type="dxa"/>
@@ -2705,7 +3148,7 @@
         <w:tc>
           <w:tcPr>
             <w:tcW w:type="dxa" w:w="2592"/>
-            <w:shd w:fill="FFFFFF"/>
+            <w:shd w:fill="F8FAFC"/>
             <w:tcMar>
               <w:top w:w="100" w:type="dxa"/>
               <w:bottom w:w="100" w:type="dxa"/>
@@ -2731,7 +3174,7 @@
         <w:tc>
           <w:tcPr>
             <w:tcW w:type="dxa" w:w="2736"/>
-            <w:shd w:fill="FFFFFF"/>
+            <w:shd w:fill="F8FAFC"/>
             <w:tcMar>
               <w:top w:w="100" w:type="dxa"/>
               <w:bottom w:w="100" w:type="dxa"/>
@@ -2759,7 +3202,7 @@
         <w:tc>
           <w:tcPr>
             <w:tcW w:type="dxa" w:w="2016"/>
-            <w:shd w:fill="F8FAFC"/>
+            <w:shd w:fill="FFFFFF"/>
             <w:tcMar>
               <w:top w:w="100" w:type="dxa"/>
               <w:bottom w:w="100" w:type="dxa"/>
@@ -2785,7 +3228,7 @@
         <w:tc>
           <w:tcPr>
             <w:tcW w:type="dxa" w:w="2016"/>
-            <w:shd w:fill="F8FAFC"/>
+            <w:shd w:fill="FFFFFF"/>
             <w:tcMar>
               <w:top w:w="100" w:type="dxa"/>
               <w:bottom w:w="100" w:type="dxa"/>
@@ -2811,7 +3254,7 @@
         <w:tc>
           <w:tcPr>
             <w:tcW w:type="dxa" w:w="2592"/>
-            <w:shd w:fill="F8FAFC"/>
+            <w:shd w:fill="FFFFFF"/>
             <w:tcMar>
               <w:top w:w="100" w:type="dxa"/>
               <w:bottom w:w="100" w:type="dxa"/>
@@ -2837,7 +3280,7 @@
         <w:tc>
           <w:tcPr>
             <w:tcW w:type="dxa" w:w="2736"/>
-            <w:shd w:fill="F8FAFC"/>
+            <w:shd w:fill="FFFFFF"/>
             <w:tcMar>
               <w:top w:w="100" w:type="dxa"/>
               <w:bottom w:w="100" w:type="dxa"/>
@@ -2865,7 +3308,7 @@
         <w:tc>
           <w:tcPr>
             <w:tcW w:type="dxa" w:w="2016"/>
-            <w:shd w:fill="FFFFFF"/>
+            <w:shd w:fill="F8FAFC"/>
             <w:tcMar>
               <w:top w:w="100" w:type="dxa"/>
               <w:bottom w:w="100" w:type="dxa"/>
@@ -2891,7 +3334,7 @@
         <w:tc>
           <w:tcPr>
             <w:tcW w:type="dxa" w:w="2016"/>
-            <w:shd w:fill="FFFFFF"/>
+            <w:shd w:fill="F8FAFC"/>
             <w:tcMar>
               <w:top w:w="100" w:type="dxa"/>
               <w:bottom w:w="100" w:type="dxa"/>
@@ -2917,7 +3360,7 @@
         <w:tc>
           <w:tcPr>
             <w:tcW w:type="dxa" w:w="2592"/>
-            <w:shd w:fill="FFFFFF"/>
+            <w:shd w:fill="F8FAFC"/>
             <w:tcMar>
               <w:top w:w="100" w:type="dxa"/>
               <w:bottom w:w="100" w:type="dxa"/>
@@ -2943,7 +3386,7 @@
         <w:tc>
           <w:tcPr>
             <w:tcW w:type="dxa" w:w="2736"/>
-            <w:shd w:fill="FFFFFF"/>
+            <w:shd w:fill="F8FAFC"/>
             <w:tcMar>
               <w:top w:w="100" w:type="dxa"/>
               <w:bottom w:w="100" w:type="dxa"/>
@@ -5696,6 +6139,206 @@
                 <w:color w:val="2563EB"/>
                 <w:sz w:val="22"/>
               </w:rPr>
+              <w:t>📷 EVIDENCE SCREENSHOT PLACEHOLDER: AMAZON VIRTUAL PRIVATE CLOUD (VPC) &amp; MULTI-AZ SUBNET TOPOLOGY</w:t>
+              <w:br/>
+            </w:r>
+          </w:p>
+          <w:p>
+            <w:pPr>
+              <w:spacing w:before="40" w:after="40"/>
+              <w:jc w:val="left"/>
+            </w:pPr>
+            <w:r>
+              <w:rPr>
+                <w:b/>
+                <w:sz w:val="19"/>
+              </w:rPr>
+              <w:t xml:space="preserve">Target Resource Identifier / ARN: </w:t>
+            </w:r>
+            <w:r>
+              <w:rPr>
+                <w:rFonts w:ascii="Consolas" w:hAnsi="Consolas"/>
+                <w:color w:val="475569"/>
+                <w:sz w:val="18"/>
+              </w:rPr>
+              <w:t>arn:aws:ec2:us-east-1:464817648755:vpc/vpc-07f6005772fe7740a</w:t>
+              <w:br/>
+            </w:r>
+            <w:r>
+              <w:rPr>
+                <w:b/>
+                <w:sz w:val="18"/>
+              </w:rPr>
+              <w:t xml:space="preserve">• VPC Identifier: </w:t>
+            </w:r>
+            <w:r>
+              <w:rPr>
+                <w:color w:val="475569"/>
+                <w:sz w:val="18"/>
+              </w:rPr>
+              <w:t>roadsense-prod-vpc (vpc-07f6005772fe7740a)</w:t>
+              <w:br/>
+            </w:r>
+            <w:r>
+              <w:rPr>
+                <w:b/>
+                <w:sz w:val="18"/>
+              </w:rPr>
+              <w:t xml:space="preserve">• IPv4 CIDR Block: </w:t>
+            </w:r>
+            <w:r>
+              <w:rPr>
+                <w:color w:val="475569"/>
+                <w:sz w:val="18"/>
+              </w:rPr>
+              <w:t>10.0.0.0/16 (EnableDnsSupport=true, EnableDnsHostnames=true)</w:t>
+              <w:br/>
+            </w:r>
+            <w:r>
+              <w:rPr>
+                <w:b/>
+                <w:sz w:val="18"/>
+              </w:rPr>
+              <w:t xml:space="preserve">• Subnet Allocation: </w:t>
+            </w:r>
+            <w:r>
+              <w:rPr>
+                <w:color w:val="475569"/>
+                <w:sz w:val="18"/>
+              </w:rPr>
+              <w:t>4 Subnets (Public: 10.0.1.0/24 &amp; 10.0.2.0/24; Private: 10.0.10.0/24 &amp; 10.0.11.0/24)</w:t>
+              <w:br/>
+            </w:r>
+            <w:r>
+              <w:rPr>
+                <w:b/>
+                <w:sz w:val="18"/>
+              </w:rPr>
+              <w:t xml:space="preserve">• Internet Gateway: </w:t>
+            </w:r>
+            <w:r>
+              <w:rPr>
+                <w:color w:val="475569"/>
+                <w:sz w:val="18"/>
+              </w:rPr>
+              <w:t>roadsense-prod-igw (igw-062944e539e92cbab attached to VPC)</w:t>
+              <w:br/>
+            </w:r>
+            <w:r>
+              <w:rPr>
+                <w:b/>
+                <w:sz w:val="18"/>
+              </w:rPr>
+              <w:t xml:space="preserve">• Route Tables: </w:t>
+            </w:r>
+            <w:r>
+              <w:rPr>
+                <w:color w:val="475569"/>
+                <w:sz w:val="18"/>
+              </w:rPr>
+              <w:t>Public RT (0.0.0.0/0 -&gt; IGW), Private RT (10.0.0.0/16 Local Only)</w:t>
+              <w:br/>
+            </w:r>
+            <w:r>
+              <w:rPr>
+                <w:b/>
+                <w:sz w:val="18"/>
+              </w:rPr>
+              <w:t xml:space="preserve">• Security Groups: </w:t>
+            </w:r>
+            <w:r>
+              <w:rPr>
+                <w:color w:val="475569"/>
+                <w:sz w:val="18"/>
+              </w:rPr>
+              <w:t>EC2 SG (80, 6969, 22), RDS SG (5432 restricted to EC2 SG)</w:t>
+              <w:br/>
+            </w:r>
+          </w:p>
+          <w:p>
+            <w:pPr>
+              <w:spacing w:before="280" w:after="200"/>
+              <w:jc w:val="center"/>
+            </w:pPr>
+            <w:r>
+              <w:rPr>
+                <w:rFonts w:ascii="Consolas" w:hAnsi="Consolas"/>
+                <w:color w:val="94A3B8"/>
+                <w:sz w:val="17"/>
+              </w:rPr>
+              <w:t>┌────────────────────────────────────────────────────────────────────────────────────────┐</w:t>
+              <w:br/>
+            </w:r>
+            <w:r>
+              <w:rPr>
+                <w:rFonts w:ascii="Calibri" w:hAnsi="Calibri"/>
+                <w:b/>
+                <w:color w:val="475569"/>
+                <w:sz w:val="22"/>
+              </w:rPr>
+              <w:t>PASTE YOUR AWS CONSOLE SCREENSHOT HERE</w:t>
+              <w:br/>
+            </w:r>
+            <w:r>
+              <w:rPr>
+                <w:i/>
+                <w:color w:val="64748B"/>
+                <w:sz w:val="19"/>
+              </w:rPr>
+              <w:t>Take a screenshot of the Amazon VPC Management Console showing 'roadsense-prod-vpc', Resource Map showing Subnets, Route Tables, and IGW and paste here.</w:t>
+            </w:r>
+            <w:r>
+              <w:rPr>
+                <w:rFonts w:ascii="Consolas" w:hAnsi="Consolas"/>
+                <w:color w:val="94A3B8"/>
+                <w:sz w:val="17"/>
+              </w:rPr>
+              <w:t>└────────────────────────────────────────────────────────────────────────────────────────┘</w:t>
+            </w:r>
+          </w:p>
+        </w:tc>
+      </w:tr>
+    </w:tbl>
+    <w:p/>
+    <w:tbl>
+      <w:tblPr>
+        <w:tblW w:type="auto" w:w="0"/>
+        <w:jc w:val="center"/>
+        <w:tblLook w:firstColumn="1" w:firstRow="1" w:lastColumn="0" w:lastRow="0" w:noHBand="0" w:noVBand="1" w:val="04A0"/>
+      </w:tblPr>
+      <w:tblGrid>
+        <w:gridCol w:w="9360"/>
+      </w:tblGrid>
+      <w:tr>
+        <w:tc>
+          <w:tcPr>
+            <w:tcW w:type="dxa" w:w="9360"/>
+            <w:shd w:fill="F8FAFC"/>
+            <w:tcMar>
+              <w:top w:w="180" w:type="dxa"/>
+              <w:bottom w:w="180" w:type="dxa"/>
+              <w:left w:w="240" w:type="dxa"/>
+              <w:right w:w="240" w:type="dxa"/>
+            </w:tcMar>
+            <w:tcBorders>
+              <w:left w:val="single" w:sz="24" w:space="0" w:color="2563EB"/>
+              <w:top w:val="dashed" w:sz="12" w:space="0" w:color="94A3B8"/>
+              <w:right w:val="dashed" w:sz="12" w:space="0" w:color="94A3B8"/>
+              <w:bottom w:val="dashed" w:sz="12" w:space="0" w:color="94A3B8"/>
+            </w:tcBorders>
+          </w:tcPr>
+          <w:p>
+            <w:pPr>
+              <w:spacing w:before="40" w:after="80"/>
+              <w:jc w:val="left"/>
+            </w:pPr>
+            <w:r>
+              <w:rPr>
+                <w:rFonts w:ascii="Calibri" w:hAnsi="Calibri"/>
+                <w:b/>
+                <w:color w:val="2563EB"/>
+                <w:sz w:val="22"/>
+              </w:rPr>
               <w:t>📷 EVIDENCE SCREENSHOT PLACEHOLDER: AMAZON EC2 COMPUTE INSTANCE (API INGRESS &amp; ADMIN PORTAL)</w:t>
               <w:br/>
             </w:r>
@@ -7592,7 +8235,7 @@
                 <w:color w:val="1E293B"/>
                 <w:sz w:val="18"/>
               </w:rPr>
-              <w:t>Amazon EC2 (Ingress &amp; Web)</w:t>
+              <w:t>Amazon VPC (Subnets, IGW, SGs)</w:t>
             </w:r>
           </w:p>
         </w:tc>
@@ -7618,7 +8261,7 @@
                 <w:color w:val="1E293B"/>
                 <w:sz w:val="18"/>
               </w:rPr>
-              <w:t>$0.00 (t2.micro Free Tier)</w:t>
+              <w:t>$0.00 (Native components free)</w:t>
             </w:r>
           </w:p>
         </w:tc>
@@ -7644,6 +8287,112 @@
                 <w:color w:val="1E293B"/>
                 <w:sz w:val="18"/>
               </w:rPr>
+              <w:t>$0.00 (Zero NAT Gateways used)</w:t>
+            </w:r>
+          </w:p>
+        </w:tc>
+        <w:tc>
+          <w:tcPr>
+            <w:tcW w:type="dxa" w:w="2304"/>
+            <w:shd w:fill="FFFFFF"/>
+            <w:tcMar>
+              <w:top w:w="100" w:type="dxa"/>
+              <w:bottom w:w="100" w:type="dxa"/>
+              <w:left w:w="140" w:type="dxa"/>
+              <w:right w:w="140" w:type="dxa"/>
+            </w:tcMar>
+          </w:tcPr>
+          <w:p>
+            <w:pPr>
+              <w:spacing w:before="0" w:after="0"/>
+              <w:jc w:val="left"/>
+            </w:pPr>
+            <w:r>
+              <w:rPr>
+                <w:rFonts w:ascii="Calibri" w:hAnsi="Calibri"/>
+                <w:color w:val="1E293B"/>
+                <w:sz w:val="18"/>
+              </w:rPr>
+              <w:t>$0.00 (Free Tier routing)</w:t>
+            </w:r>
+          </w:p>
+        </w:tc>
+      </w:tr>
+      <w:tr>
+        <w:tc>
+          <w:tcPr>
+            <w:tcW w:type="dxa" w:w="2592"/>
+            <w:shd w:fill="F8FAFC"/>
+            <w:tcMar>
+              <w:top w:w="100" w:type="dxa"/>
+              <w:bottom w:w="100" w:type="dxa"/>
+              <w:left w:w="140" w:type="dxa"/>
+              <w:right w:w="140" w:type="dxa"/>
+            </w:tcMar>
+          </w:tcPr>
+          <w:p>
+            <w:pPr>
+              <w:spacing w:before="0" w:after="0"/>
+              <w:jc w:val="left"/>
+            </w:pPr>
+            <w:r>
+              <w:rPr>
+                <w:rFonts w:ascii="Calibri" w:hAnsi="Calibri"/>
+                <w:color w:val="1E293B"/>
+                <w:sz w:val="18"/>
+              </w:rPr>
+              <w:t>Amazon EC2 (Ingress &amp; Web)</w:t>
+            </w:r>
+          </w:p>
+        </w:tc>
+        <w:tc>
+          <w:tcPr>
+            <w:tcW w:type="dxa" w:w="2160"/>
+            <w:shd w:fill="F8FAFC"/>
+            <w:tcMar>
+              <w:top w:w="100" w:type="dxa"/>
+              <w:bottom w:w="100" w:type="dxa"/>
+              <w:left w:w="140" w:type="dxa"/>
+              <w:right w:w="140" w:type="dxa"/>
+            </w:tcMar>
+          </w:tcPr>
+          <w:p>
+            <w:pPr>
+              <w:spacing w:before="0" w:after="0"/>
+              <w:jc w:val="left"/>
+            </w:pPr>
+            <w:r>
+              <w:rPr>
+                <w:rFonts w:ascii="Calibri" w:hAnsi="Calibri"/>
+                <w:color w:val="1E293B"/>
+                <w:sz w:val="18"/>
+              </w:rPr>
+              <w:t>$0.00 (t2.micro Free Tier)</w:t>
+            </w:r>
+          </w:p>
+        </w:tc>
+        <w:tc>
+          <w:tcPr>
+            <w:tcW w:type="dxa" w:w="2304"/>
+            <w:shd w:fill="F8FAFC"/>
+            <w:tcMar>
+              <w:top w:w="100" w:type="dxa"/>
+              <w:bottom w:w="100" w:type="dxa"/>
+              <w:left w:w="140" w:type="dxa"/>
+              <w:right w:w="140" w:type="dxa"/>
+            </w:tcMar>
+          </w:tcPr>
+          <w:p>
+            <w:pPr>
+              <w:spacing w:before="0" w:after="0"/>
+              <w:jc w:val="left"/>
+            </w:pPr>
+            <w:r>
+              <w:rPr>
+                <w:rFonts w:ascii="Calibri" w:hAnsi="Calibri"/>
+                <w:color w:val="1E293B"/>
+                <w:sz w:val="18"/>
+              </w:rPr>
               <w:t>$14.72 (t3.small Reserved)</w:t>
             </w:r>
           </w:p>
@@ -7651,7 +8400,7 @@
         <w:tc>
           <w:tcPr>
             <w:tcW w:type="dxa" w:w="2304"/>
-            <w:shd w:fill="FFFFFF"/>
+            <w:shd w:fill="F8FAFC"/>
             <w:tcMar>
               <w:top w:w="100" w:type="dxa"/>
               <w:bottom w:w="100" w:type="dxa"/>
@@ -7679,7 +8428,7 @@
         <w:tc>
           <w:tcPr>
             <w:tcW w:type="dxa" w:w="2592"/>
-            <w:shd w:fill="F8FAFC"/>
+            <w:shd w:fill="FFFFFF"/>
             <w:tcMar>
               <w:top w:w="100" w:type="dxa"/>
               <w:bottom w:w="100" w:type="dxa"/>
@@ -7705,7 +8454,7 @@
         <w:tc>
           <w:tcPr>
             <w:tcW w:type="dxa" w:w="2160"/>
-            <w:shd w:fill="F8FAFC"/>
+            <w:shd w:fill="FFFFFF"/>
             <w:tcMar>
               <w:top w:w="100" w:type="dxa"/>
               <w:bottom w:w="100" w:type="dxa"/>
@@ -7731,7 +8480,7 @@
         <w:tc>
           <w:tcPr>
             <w:tcW w:type="dxa" w:w="2304"/>
-            <w:shd w:fill="F8FAFC"/>
+            <w:shd w:fill="FFFFFF"/>
             <w:tcMar>
               <w:top w:w="100" w:type="dxa"/>
               <w:bottom w:w="100" w:type="dxa"/>
@@ -7757,7 +8506,7 @@
         <w:tc>
           <w:tcPr>
             <w:tcW w:type="dxa" w:w="2304"/>
-            <w:shd w:fill="F8FAFC"/>
+            <w:shd w:fill="FFFFFF"/>
             <w:tcMar>
               <w:top w:w="100" w:type="dxa"/>
               <w:bottom w:w="100" w:type="dxa"/>
@@ -7785,7 +8534,7 @@
         <w:tc>
           <w:tcPr>
             <w:tcW w:type="dxa" w:w="2592"/>
-            <w:shd w:fill="FFFFFF"/>
+            <w:shd w:fill="F8FAFC"/>
             <w:tcMar>
               <w:top w:w="100" w:type="dxa"/>
               <w:bottom w:w="100" w:type="dxa"/>
@@ -7811,7 +8560,7 @@
         <w:tc>
           <w:tcPr>
             <w:tcW w:type="dxa" w:w="2160"/>
-            <w:shd w:fill="FFFFFF"/>
+            <w:shd w:fill="F8FAFC"/>
             <w:tcMar>
               <w:top w:w="100" w:type="dxa"/>
               <w:bottom w:w="100" w:type="dxa"/>
@@ -7837,7 +8586,7 @@
         <w:tc>
           <w:tcPr>
             <w:tcW w:type="dxa" w:w="2304"/>
-            <w:shd w:fill="FFFFFF"/>
+            <w:shd w:fill="F8FAFC"/>
             <w:tcMar>
               <w:top w:w="100" w:type="dxa"/>
               <w:bottom w:w="100" w:type="dxa"/>
@@ -7863,7 +8612,7 @@
         <w:tc>
           <w:tcPr>
             <w:tcW w:type="dxa" w:w="2304"/>
-            <w:shd w:fill="FFFFFF"/>
+            <w:shd w:fill="F8FAFC"/>
             <w:tcMar>
               <w:top w:w="100" w:type="dxa"/>
               <w:bottom w:w="100" w:type="dxa"/>
@@ -7891,7 +8640,7 @@
         <w:tc>
           <w:tcPr>
             <w:tcW w:type="dxa" w:w="2592"/>
-            <w:shd w:fill="F8FAFC"/>
+            <w:shd w:fill="FFFFFF"/>
             <w:tcMar>
               <w:top w:w="100" w:type="dxa"/>
               <w:bottom w:w="100" w:type="dxa"/>
@@ -7917,7 +8666,7 @@
         <w:tc>
           <w:tcPr>
             <w:tcW w:type="dxa" w:w="2160"/>
-            <w:shd w:fill="F8FAFC"/>
+            <w:shd w:fill="FFFFFF"/>
             <w:tcMar>
               <w:top w:w="100" w:type="dxa"/>
               <w:bottom w:w="100" w:type="dxa"/>
@@ -7943,7 +8692,7 @@
         <w:tc>
           <w:tcPr>
             <w:tcW w:type="dxa" w:w="2304"/>
-            <w:shd w:fill="F8FAFC"/>
+            <w:shd w:fill="FFFFFF"/>
             <w:tcMar>
               <w:top w:w="100" w:type="dxa"/>
               <w:bottom w:w="100" w:type="dxa"/>
@@ -7969,7 +8718,7 @@
         <w:tc>
           <w:tcPr>
             <w:tcW w:type="dxa" w:w="2304"/>
-            <w:shd w:fill="F8FAFC"/>
+            <w:shd w:fill="FFFFFF"/>
             <w:tcMar>
               <w:top w:w="100" w:type="dxa"/>
               <w:bottom w:w="100" w:type="dxa"/>
@@ -7997,7 +8746,7 @@
         <w:tc>
           <w:tcPr>
             <w:tcW w:type="dxa" w:w="2592"/>
-            <w:shd w:fill="FFFFFF"/>
+            <w:shd w:fill="F8FAFC"/>
             <w:tcMar>
               <w:top w:w="100" w:type="dxa"/>
               <w:bottom w:w="100" w:type="dxa"/>
@@ -8016,14 +8765,14 @@
                 <w:color w:val="1E293B"/>
                 <w:sz w:val="18"/>
               </w:rPr>
-              <w:t>Amazon RDS PostgreSQL 16</w:t>
+              <w:t>Amazon RDS PostgreSQL 18</w:t>
             </w:r>
           </w:p>
         </w:tc>
         <w:tc>
           <w:tcPr>
             <w:tcW w:type="dxa" w:w="2160"/>
-            <w:shd w:fill="FFFFFF"/>
+            <w:shd w:fill="F8FAFC"/>
             <w:tcMar>
               <w:top w:w="100" w:type="dxa"/>
               <w:bottom w:w="100" w:type="dxa"/>
@@ -8049,7 +8798,7 @@
         <w:tc>
           <w:tcPr>
             <w:tcW w:type="dxa" w:w="2304"/>
-            <w:shd w:fill="FFFFFF"/>
+            <w:shd w:fill="F8FAFC"/>
             <w:tcMar>
               <w:top w:w="100" w:type="dxa"/>
               <w:bottom w:w="100" w:type="dxa"/>
@@ -8075,7 +8824,7 @@
         <w:tc>
           <w:tcPr>
             <w:tcW w:type="dxa" w:w="2304"/>
-            <w:shd w:fill="FFFFFF"/>
+            <w:shd w:fill="F8FAFC"/>
             <w:tcMar>
               <w:top w:w="100" w:type="dxa"/>
               <w:bottom w:w="100" w:type="dxa"/>
@@ -8103,7 +8852,7 @@
         <w:tc>
           <w:tcPr>
             <w:tcW w:type="dxa" w:w="2592"/>
-            <w:shd w:fill="F8FAFC"/>
+            <w:shd w:fill="FFFFFF"/>
             <w:tcMar>
               <w:top w:w="100" w:type="dxa"/>
               <w:bottom w:w="100" w:type="dxa"/>
@@ -8129,7 +8878,7 @@
         <w:tc>
           <w:tcPr>
             <w:tcW w:type="dxa" w:w="2160"/>
-            <w:shd w:fill="F8FAFC"/>
+            <w:shd w:fill="FFFFFF"/>
             <w:tcMar>
               <w:top w:w="100" w:type="dxa"/>
               <w:bottom w:w="100" w:type="dxa"/>
@@ -8155,7 +8904,7 @@
         <w:tc>
           <w:tcPr>
             <w:tcW w:type="dxa" w:w="2304"/>
-            <w:shd w:fill="F8FAFC"/>
+            <w:shd w:fill="FFFFFF"/>
             <w:tcMar>
               <w:top w:w="100" w:type="dxa"/>
               <w:bottom w:w="100" w:type="dxa"/>
@@ -8181,7 +8930,7 @@
         <w:tc>
           <w:tcPr>
             <w:tcW w:type="dxa" w:w="2304"/>
-            <w:shd w:fill="F8FAFC"/>
+            <w:shd w:fill="FFFFFF"/>
             <w:tcMar>
               <w:top w:w="100" w:type="dxa"/>
               <w:bottom w:w="100" w:type="dxa"/>
@@ -8209,7 +8958,7 @@
         <w:tc>
           <w:tcPr>
             <w:tcW w:type="dxa" w:w="2592"/>
-            <w:shd w:fill="FFFFFF"/>
+            <w:shd w:fill="F8FAFC"/>
             <w:tcMar>
               <w:top w:w="100" w:type="dxa"/>
               <w:bottom w:w="100" w:type="dxa"/>
@@ -8235,7 +8984,7 @@
         <w:tc>
           <w:tcPr>
             <w:tcW w:type="dxa" w:w="2160"/>
-            <w:shd w:fill="FFFFFF"/>
+            <w:shd w:fill="F8FAFC"/>
             <w:tcMar>
               <w:top w:w="100" w:type="dxa"/>
               <w:bottom w:w="100" w:type="dxa"/>
@@ -8261,7 +9010,7 @@
         <w:tc>
           <w:tcPr>
             <w:tcW w:type="dxa" w:w="2304"/>
-            <w:shd w:fill="FFFFFF"/>
+            <w:shd w:fill="F8FAFC"/>
             <w:tcMar>
               <w:top w:w="100" w:type="dxa"/>
               <w:bottom w:w="100" w:type="dxa"/>
@@ -8287,7 +9036,7 @@
         <w:tc>
           <w:tcPr>
             <w:tcW w:type="dxa" w:w="2304"/>
-            <w:shd w:fill="FFFFFF"/>
+            <w:shd w:fill="F8FAFC"/>
             <w:tcMar>
               <w:top w:w="100" w:type="dxa"/>
               <w:bottom w:w="100" w:type="dxa"/>
@@ -8315,7 +9064,7 @@
         <w:tc>
           <w:tcPr>
             <w:tcW w:type="dxa" w:w="2592"/>
-            <w:shd w:fill="F8FAFC"/>
+            <w:shd w:fill="FFFFFF"/>
             <w:tcMar>
               <w:top w:w="100" w:type="dxa"/>
               <w:bottom w:w="100" w:type="dxa"/>
@@ -8341,7 +9090,7 @@
         <w:tc>
           <w:tcPr>
             <w:tcW w:type="dxa" w:w="2160"/>
-            <w:shd w:fill="F8FAFC"/>
+            <w:shd w:fill="FFFFFF"/>
             <w:tcMar>
               <w:top w:w="100" w:type="dxa"/>
               <w:bottom w:w="100" w:type="dxa"/>
@@ -8367,7 +9116,7 @@
         <w:tc>
           <w:tcPr>
             <w:tcW w:type="dxa" w:w="2304"/>
-            <w:shd w:fill="F8FAFC"/>
+            <w:shd w:fill="FFFFFF"/>
             <w:tcMar>
               <w:top w:w="100" w:type="dxa"/>
               <w:bottom w:w="100" w:type="dxa"/>
@@ -8393,7 +9142,7 @@
         <w:tc>
           <w:tcPr>
             <w:tcW w:type="dxa" w:w="2304"/>
-            <w:shd w:fill="F8FAFC"/>
+            <w:shd w:fill="FFFFFF"/>
             <w:tcMar>
               <w:top w:w="100" w:type="dxa"/>
               <w:bottom w:w="100" w:type="dxa"/>
@@ -8421,7 +9170,7 @@
         <w:tc>
           <w:tcPr>
             <w:tcW w:type="dxa" w:w="2592"/>
-            <w:shd w:fill="FFFFFF"/>
+            <w:shd w:fill="F8FAFC"/>
             <w:tcMar>
               <w:top w:w="100" w:type="dxa"/>
               <w:bottom w:w="100" w:type="dxa"/>
@@ -8447,7 +9196,7 @@
         <w:tc>
           <w:tcPr>
             <w:tcW w:type="dxa" w:w="2160"/>
-            <w:shd w:fill="FFFFFF"/>
+            <w:shd w:fill="F8FAFC"/>
             <w:tcMar>
               <w:top w:w="100" w:type="dxa"/>
               <w:bottom w:w="100" w:type="dxa"/>
@@ -8473,7 +9222,7 @@
         <w:tc>
           <w:tcPr>
             <w:tcW w:type="dxa" w:w="2304"/>
-            <w:shd w:fill="FFFFFF"/>
+            <w:shd w:fill="F8FAFC"/>
             <w:tcMar>
               <w:top w:w="100" w:type="dxa"/>
               <w:bottom w:w="100" w:type="dxa"/>
@@ -8499,7 +9248,7 @@
         <w:tc>
           <w:tcPr>
             <w:tcW w:type="dxa" w:w="2304"/>
-            <w:shd w:fill="FFFFFF"/>
+            <w:shd w:fill="F8FAFC"/>
             <w:tcMar>
               <w:top w:w="100" w:type="dxa"/>
               <w:bottom w:w="100" w:type="dxa"/>

</xml_diff>